<commit_message>
Add Windage Zero Offset alongside existing Elevation Zero Offset
</commit_message>
<xml_diff>
--- a/Cervid Ballistics - Mathematical Models and Design Methodology.docx
+++ b/Cervid Ballistics - Mathematical Models and Design Methodology.docx
@@ -1876,7 +1876,7 @@
       </w:pPr>
       <w:bookmarkStart w:id="14" w:name="zero-offset-manual-holdover-correction"/>
       <w:r>
-        <w:t>13. Zero Offset (Manual Holdover Correction)</w:t>
+        <w:t>13. Zero Offset (Manual Holdover Correction) — Elevation and Windage</w:t>
       </w:r>
       <w:bookmarkEnd w:id="14"/>
     </w:p>
@@ -1887,7 +1887,7 @@
       <w:r>
         <w:t xml:space="preserve">A shooter who has zeroed a rifle for one load, then switches to a different projectile without re-zeroing, often already knows from field experience how much that new load holds over or under point of aim at the zero range. Zero Offset lets that known figure be </w:t>
         <w:lastRenderedPageBreak/>
-        <w:t>entered directly — in mils or MOA — and applied to the whole table, without touching the drag model at all.</w:t>
+        <w:t>entered directly — in mils or MOA — and applied to the whole table, without touching the drag model at all. This correction was originally elevation-only; a second, independent field applies the identical idea to windage, covered later in this section.</w:t>
       </w:r>
     </w:p>
     <w:p>
@@ -1895,7 +1895,7 @@
         <w:pStyle w:val="BodyText"/>
       </w:pPr>
       <w:r>
-        <w:t>It is a deliberately distinct correction from Trajectory Truing above, not a variant of it. Truing solves for a BC multiplier so the drag model matches one observed data point, which implicitly assumes the zero itself is a true, zero-drop reference. Zero Offset does the opposite: it takes the zero as a starting point that is deliberately not a true zero, and shifts the entire table by a constant angular amount to match a directly known holdover.</w:t>
+        <w:t>Both the elevation and windage forms of Zero Offset are deliberately distinct corrections from Trajectory Truing above, not variants of it. Truing solves for a BC multiplier so the drag model matches one observed data point, which implicitly assumes the zero itself is a true, zero-drop reference. Zero Offset does the opposite: it takes the zero as a starting point that is deliberately not a true zero, and shifts the relevant table column by a constant angular amount to match a directly known holdover.</w:t>
       </w:r>
     </w:p>
     <w:p>
@@ -1903,7 +1903,7 @@
         <w:pStyle w:val="BodyText"/>
       </w:pPr>
       <w:r>
-        <w:t>The offset is converted once, on entry, to a single canonical mils-equivalent value, then applied as a term added to the drop calculation at every range:</w:t>
+        <w:t>The elevation offset is converted once, on entry, to a single canonical mils-equivalent value, then applied as a term added to the drop calculation at every range:</w:t>
       </w:r>
     </w:p>
     <w:p>
@@ -1930,7 +1930,34 @@
         <w:pStyle w:val="BodyText"/>
       </w:pPr>
       <w:r>
-        <w:t xml:space="preserve">Which unit the Zero Offset field defaults to was originally tied to calibre — the same convention the results table itself has always used, where .177 loads default to MOA and everything else defaults to mils. A user report showed that heuristic to be the wrong signal for Zero Offset specifically: calibre says nothing about which turret is actually mounted on a given rifle, and a .308 with an MOA-turret scope or a .177 with a mil-dot scope are both real, common configurations. The fix replaces the calibre guess with a per-preset stored preference — a new angularUnit field, captured automatically the first time a preset is saved with the results table showing mils or MOA, and preferred over the calibre guess on every later load of that same preset. Saving while viewing a non-angular display mode (clicks, inches, or centimetres) neither sets nor overwrites this preference, so briefly checking click values before saving can never silently erase a preference set earlier; a preset that has never been saved on mils or MOA at all simply falls back to the original calibre-based guess, exactly as before this field existed, which keeps every preset saved prior to this change behaving identically. The Zero Offset toggle then defaults to whichever unit that resolution settles on, rather than always mils.</w:t>
+        <w:t>A second, independent field — Windage Zero Offset — applies the identical idea to the windage column instead of drop, for a known left/right correction at the zero range (for example a scope that is not perfectly boresighted, or a previous zero taken in a crosswind). It has its own mils/MOA unit toggle, entirely separate from the elevation field’s, and is converted to a canonical mils-equivalent the same way before being applied:</w:t>
+      </w:r>
+    </w:p>
+    <w:p>
+      <w:pPr>
+        <w:pStyle w:val="SourceCode"/>
+      </w:pPr>
+      <w:r>
+        <w:rPr>
+          <w:rStyle w:val="VerbatimChar"/>
+        </w:rPr>
+        <w:t>windage(in) += offsetMils × range(yd) × 0.036 / cos²(angle)</w:t>
+      </w:r>
+    </w:p>
+    <w:p>
+      <w:pPr>
+        <w:pStyle w:val="BodyText"/>
+      </w:pPr>
+      <w:r>
+        <w:t>Two details distinguish this from the elevation term above, both a direct consequence of what the drop and windage values represent structurally. First, the sign: the drop formula above subtracts, because the downstream elevation formulas (moa, mils) already carry a leading negative sign relative to drop, so subtracting there is what makes a positive entered value read as a positive hold-up figure. The windage formulas carry no such leading negative sign, so the windage term above adds rather than subtracts — a positive entered value comes out as a positive, right-hand correction, matching the sign convention used throughout the rest of the app for Wind Deflection, Spin Drift, and Coriolis (positive = right). Second, unlike drop, windage is not already exactly zero at the zero range by construction — real crosswind deflection at a typical zero distance is normally small but not zero — so this term is simply “shift the whole windage figure by a known constant amount,” not “make the zero row read a real value instead of always zero” the way the elevation version is. The offset is applied to the same shared windage value that Wind Deflection, Spin Drift, and the horizontal Coriolis component are summed into (Section 9), before that sum is rounded — so it appears in the main results table’s Wind column, and in the combined windage figure Reticle View, HUD, and the Turret Dial’s Windage control use (see the combined-windage design note at the end of Section 9). Elevation and windage offsets are read from independent fields and applied to independent variables, so setting one has no effect on the other.</w:t>
+      </w:r>
+    </w:p>
+    <w:p>
+      <w:pPr>
+        <w:pStyle w:val="BodyText"/>
+      </w:pPr>
+      <w:r>
+        <w:t xml:space="preserve">Which unit the Zero Offset field defaults to was originally tied to calibre — the same convention the results table itself has always used, where .177 loads default to MOA and everything else defaults to mils. A user report showed that heuristic to be the wrong signal for Zero Offset specifically: calibre says nothing about which turret is actually mounted on a given rifle, and a .308 with an MOA-turret scope or a .177 with a mil-dot scope are both real, common configurations. The fix replaces the calibre guess with a per-preset stored preference — a new angularUnit field, captured automatically the first time a preset is saved with the results table showing mils or MOA, and preferred over the calibre guess on every later load of that same preset. Saving while viewing a non-angular display mode (clicks, inches, or centimetres) neither sets nor overwrites this preference, so briefly checking click values before saving can never silently erase a preference set earlier; a preset that has never been saved on mils or MOA at all simply falls back to the original calibre-based guess, exactly as before this field existed, which keeps every preset saved prior to this change behaving identically. Both Zero Offset toggles then default to whichever unit that resolution settles on, rather than always mils.</w:t>
       </w:r>
     </w:p>
     <w:p>

</xml_diff>

<commit_message>
Add clicks as a third Zero Offset entry unit (elevation + windage)
</commit_message>
<xml_diff>
--- a/Cervid Ballistics - Mathematical Models and Design Methodology.docx
+++ b/Cervid Ballistics - Mathematical Models and Design Methodology.docx
@@ -1887,7 +1887,7 @@
       <w:r>
         <w:t xml:space="preserve">A shooter who has zeroed a rifle for one load, then switches to a different projectile without re-zeroing, often already knows from field experience how much that new load holds over or under point of aim at the zero range. Zero Offset lets that known figure be </w:t>
         <w:lastRenderedPageBreak/>
-        <w:t>entered directly — in mils or MOA — and applied to the whole table, without touching the drag model at all. This correction was originally elevation-only; a second, independent field applies the identical idea to windage, covered later in this section.</w:t>
+        <w:t>entered directly — in mils, MOA, or clicks — and applied to the whole table, without touching the drag model at all. This correction was originally elevation-only; a second, independent field applies the identical idea to windage, covered later in this section.</w:t>
       </w:r>
     </w:p>
     <w:p>
@@ -1930,7 +1930,7 @@
         <w:pStyle w:val="BodyText"/>
       </w:pPr>
       <w:r>
-        <w:t>A second, independent field — Windage Zero Offset — applies the identical idea to the windage column instead of drop, for a known left/right correction at the zero range (for example a scope that is not perfectly boresighted, or a previous zero taken in a crosswind). It has its own mils/MOA unit toggle, entirely separate from the elevation field’s, and is converted to a canonical mils-equivalent the same way before being applied:</w:t>
+        <w:t>A second, independent field — Windage Zero Offset — applies the identical idea to the windage column instead of drop, for a known left/right correction at the zero range (for example a scope that is not perfectly boresighted, or a previous zero taken in a crosswind). It has its own mils/MOA/clicks unit toggle, entirely separate from the elevation field’s, and is converted to a canonical mils-equivalent the same way before being applied:</w:t>
       </w:r>
     </w:p>
     <w:p>
@@ -1950,6 +1950,14 @@
       </w:pPr>
       <w:r>
         <w:t>Two details distinguish this from the elevation term above, both a direct consequence of what the drop and windage values represent structurally. First, the sign: the drop formula above subtracts, because the downstream elevation formulas (moa, mils) already carry a leading negative sign relative to drop, so subtracting there is what makes a positive entered value read as a positive hold-up figure. The windage formulas carry no such leading negative sign, so the windage term above adds rather than subtracts — a positive entered value comes out as a positive, right-hand correction, matching the sign convention used throughout the rest of the app for Wind Deflection, Spin Drift, and Coriolis (positive = right). Second, unlike drop, windage is not already exactly zero at the zero range by construction — real crosswind deflection at a typical zero distance is normally small but not zero — so this term is simply “shift the whole windage figure by a known constant amount,” not “make the zero row read a real value instead of always zero” the way the elevation version is. The offset is applied to the same shared windage value that Wind Deflection, Spin Drift, and the horizontal Coriolis component are summed into (Section 9), before that sum is rounded — so it appears in the main results table’s Wind column, and in the combined windage figure Reticle View, HUD, and the Turret Dial’s Windage control use (see the combined-windage design note at the end of Section 9). Elevation and windage offsets are read from independent fields and applied to independent variables, so setting one has no effect on the other.</w:t>
+      </w:r>
+    </w:p>
+    <w:p>
+      <w:pPr>
+        <w:pStyle w:val="BodyText"/>
+      </w:pPr>
+      <w:r>
+        <w:t>Both fields also accept a third entry unit, clicks, alongside mils and MOA. Unlike mils and MOA — fixed ratios to each other that never change — a click’s angular size depends on the turret it represents, so clicks resolves through the same clickSizeMoa global already shared by the results table’s own clicks column and the Turret Dial (Part 3, Section 3), rather than being a third independently fixed constant: raw = clicks × clickSizeMoa (a MOA-equivalent, so this feeds directly into the same ×1.0472/3.6 conversion used for a direct MOA entry). Selecting clicks on either field reveals the same click-size selector used everywhere else in the app; choosing a size there updates clickSizeMoa globally, so the other Zero Offset field’s selector (if also showing) and the results table’s own selector all stay in agreement, since there is only ever one current click size for the whole app. This is a deliberate extension of the existing “clicks are always live, never baked” principle into an editable field rather than a read-only one: what is actually saved to a preset is the raw click count and the unit string “clicks,” not a frozen angle, so if the click-size selector is changed after saving, the same typed click count resolves to a different angle the next time Calculate runs — consistent with how the results table’s own clicks column already behaves, not a new class of behaviour introduced here.</w:t>
       </w:r>
     </w:p>
     <w:p>

</xml_diff>

<commit_message>
Add Wind at Target: optional second wind reading blended across the flight
- New fWindTarget/fWindTargetDir fields, optional, blank by default
- computeTrajectory() blends crosswind/headwind Cartesian components by
  downrange fraction; crosswind drift generalized from closed-form lag
  formula to an equivalent incremental accumulator (collapses to the
  original formula when unset)
- Standing/session field like Wind Speed/Wind Clock, not preset-scoped
- Results header shows both readings when active
- New test_wind_at_target.js; full existing suite re-run clean
- Guide + Math Models docx updated
</commit_message>
<xml_diff>
--- a/Cervid Ballistics - Mathematical Models and Design Methodology.docx
+++ b/Cervid Ballistics - Mathematical Models and Design Methodology.docx
@@ -987,6 +987,93 @@
       </w:r>
       <w:r>
         <w:t xml:space="preserve">quantified against the live engine before implementation, using representative loads at their typical distances. For centrefire and rimfire the effect stays small even at 15–20mph — a few hundredths of a mil at long range, well inside the uncertainty already present from BC tolerance and chronograph error. It is proportionally larger for air rifle pellets specifically, since a given wind speed is a much larger fraction of a pellet’s much lower muzzle velocity: a light, low-BC pellet (JSB Exact .177 8.44gr, BC 0.019) at a typical 50yd Field Target distance shows roughly 0.07–0.09mil of additional drop from a 15–20mph headwind — comparable to half a scope click, and larger in angular terms than the same wind speed’s effect on the .243 Win 100gr built-in preset at 500yd. A heavier, higher-BC pellet (JSB Exact Monster .22 25.4gr, BC 0.084) shows an effect roughly ten times smaller under the same conditions, consistent with why competitive air rifle shooters favour denser, higher-BC pellets partly for reduced wind sensitivity.</w:t>
+      </w:r>
+    </w:p>
+    <w:p>
+      <w:pPr>
+        <w:pStyle w:val="BodyText"/>
+      </w:pPr>
+      <w:r>
+        <w:rPr>
+          <w:b/>
+        </w:rPr>
+        <w:t xml:space="preserve">Wind at Target (2026-08-31): </w:t>
+      </w:r>
+      <w:r>
+        <w:t>the model above assumes a single, uniform wind for the entire flight. An optional second speed+clock reading, Wind at Target, lets the shooter describe a wind that genuinely differs at the target from the wind at the muzzle. When the field is left blank, windTargetMph is undefined and every formula below collapses back to the uniform-wind model exactly as described above.</w:t>
+      </w:r>
+    </w:p>
+    <w:p>
+      <w:pPr>
+        <w:pStyle w:val="BodyText"/>
+      </w:pPr>
+      <w:r>
+        <w:t xml:space="preserve">When set, the shooter's own crosswind component W (defined above) and head/tailwind component rangeWindFps each get a matching value computed from the target reading, and the two pairs are blended by straight-line downrange fraction rather than by interpolating the raw speed-and-clock values directly:</w:t>
+      </w:r>
+    </w:p>
+    <w:p>
+      <w:pPr>
+        <w:pStyle w:val="SourceCode"/>
+      </w:pPr>
+      <w:r>
+        <w:rPr>
+          <w:rStyle w:val="VerbatimChar"/>
+        </w:rPr>
+        <w:t>frac(x) = clamp(x(yd) / maxYd, 0, 1)</w:t>
+      </w:r>
+    </w:p>
+    <w:p>
+      <w:pPr>
+        <w:pStyle w:val="SourceCode"/>
+      </w:pPr>
+      <w:r>
+        <w:rPr>
+          <w:rStyle w:val="VerbatimChar"/>
+        </w:rPr>
+        <w:t>W(x) = W + (W_target − W) × frac(x)      rangeWindFps(x) = rangeWindFps + (rangeWindFps_target − rangeWindFps) × frac(x)</w:t>
+      </w:r>
+    </w:p>
+    <w:p>
+      <w:pPr>
+        <w:pStyle w:val="BodyText"/>
+      </w:pPr>
+      <w:r>
+        <w:t xml:space="preserve">Blending the crosswind and head/tailwind components separately, rather than the shooter's raw clock positions, avoids a meaningless average when the two readings come from different directions (a 3 o'clock wind and a 9 o'clock wind do not average to "no wind" by any sensible physical reasoning; averaging their already-resolved sideways components does). rangeWindFps(x) is re-evaluated at the bullet's own current downrange position on every integration step — including inside the iterative angle-refinement solver described in Section 4, so a zero solved at a shorter range than maxYd correctly sees only a partial blend toward the target reading, not the full one.</w:t>
+      </w:r>
+    </w:p>
+    <w:p>
+      <w:pPr>
+        <w:pStyle w:val="BodyText"/>
+      </w:pPr>
+      <w:r>
+        <w:t xml:space="preserve">The lag-rule crosswind formula above, drift(in) = W × (t_actual − x/MV) × 12, only works as a single closed-form multiplication because W is constant — it factors straight out of the subtraction. Once W can vary with position that factoring is no longer valid, so the same relationship is instead accumulated incrementally, one integration step at a time:</w:t>
+      </w:r>
+    </w:p>
+    <w:p>
+      <w:pPr>
+        <w:pStyle w:val="SourceCode"/>
+      </w:pPr>
+      <w:r>
+        <w:rPr>
+          <w:rStyle w:val="VerbatimChar"/>
+        </w:rPr>
+        <w:t>dLag = Δt_step − stepFt/MV      driftAccum += W(x) × dLag × 12</w:t>
+      </w:r>
+    </w:p>
+    <w:p>
+      <w:pPr>
+        <w:pStyle w:val="BodyText"/>
+      </w:pPr>
+      <w:r>
+        <w:t xml:space="preserve">Summed over the whole flight this telescopes back to exactly the original closed-form result whenever W(x) is constant (Wind at Target unset or equal to the shooter's own reading), since ΣΔt_step and ΣstepFt/MV reduce to t_actual and x/MV respectively. When W(x) varies, this is the physically correct generalization rather than an approximation: dLag itself grows over the course of the flight as the bullet decelerates and spends more time covering each successive yard, so a given amount of crosswind exposure contributes more to total drift when it occurs during the slower, back half of the trajectory than during the fast, early part. Confirmed against the live engine: a crosswind confined to the first half of a 1000yd .308 Win flight (full value at the muzzle, tapering to calm at the target) produces materially less drift at the target than the same crosswind confined to the second half (calm at the muzzle, ramping up to full value at the target) — consistent with the long-range-shooting principle that a wind read near the target carries more weight than the same wind read near the firing line.</w:t>
+      </w:r>
+    </w:p>
+    <w:p>
+      <w:pPr>
+        <w:pStyle w:val="BodyText"/>
+      </w:pPr>
+      <w:r>
+        <w:t xml:space="preserve">Wind at Target is a standing, session-level field like Wind Speed/Wind Clock themselves, not a property of a saved load — it is therefore excluded from preset save/load and from the load-clearing routine, exactly matching the existing treatment of the primary wind fields.</w:t>
       </w:r>
     </w:p>
     <w:p>

</xml_diff>

<commit_message>
Fix Wind at Target/maxYd mismatch in HUD + Compare; add Reticle View cue
- Add windTargetRefYd to computeTrajectory() so the wind blend fraction
  can be pinned independently of a caller's own maxYd override
- HUD (renderHud) and Compare Loads (runCompare live slot) both
  overrode maxYd while inheriting windTargetMph, silently reinterpreting
  the blend against the wrong reference range - fixed both
- Reticle View needed no correctness fix (never overrides maxYd) but
  had no visible indication Wind at Target was active - added a note
- New test_wind_target_maxyd_fix.js; full existing suite re-run clean
- Guide + Math Models docx updated
</commit_message>
<xml_diff>
--- a/Cervid Ballistics - Mathematical Models and Design Methodology.docx
+++ b/Cervid Ballistics - Mathematical Models and Design Methodology.docx
@@ -1074,6 +1074,20 @@
       </w:pPr>
       <w:r>
         <w:t xml:space="preserve">Wind at Target is a standing, session-level field like Wind Speed/Wind Clock themselves, not a property of a saved load — it is therefore excluded from preset save/load and from the load-clearing routine, exactly matching the existing treatment of the primary wind fields.</w:t>
+      </w:r>
+    </w:p>
+    <w:p>
+      <w:pPr>
+        <w:pStyle w:val="BodyText"/>
+      </w:pPr>
+      <w:r>
+        <w:rPr>
+          <w:b/>
+        </w:rPr>
+        <w:t xml:space="preserve">windTargetRefYd (2026-08-31 fix): </w:t>
+      </w:r>
+      <w:r>
+        <w:t xml:space="preserve">frac(x) above is defined against maxYd, which several views legitimately override for their own display purposes — HUD overrides it to whatever specific distance is currently ranged, and Compare Loads' live-matched slot overrides it to the shared comparison distance. Both views clone the live params object wholesale (Object.assign against lastResults.params), so windTargetMph/windTargetClock rode along unchanged even after that fix — but frac(x) would then silently divide by the overridden maxYd instead of the range the shooter actually meant by "the target" when they entered the second reading, applying most of it far too early (or too late). windTargetRefYd is a separate field precisely to prevent that: computeTrajectory() prefers it over maxYd for frac(x)'s denominator when present, and both HUD's and Compare's live-slot params now set it explicitly to lastResults.params.maxYd — the original table's own max range — before overriding maxYd itself for their own purposes. Callers that never override maxYd in the first place (the primary calculate() path, Reticle View, non-live Compare slots) never set windTargetRefYd either, so it falls back to maxYd and nothing changes for them.</w:t>
       </w:r>
     </w:p>
     <w:p>

</xml_diff>

<commit_message>
Fix Wind Clock convention to consistently mean wind FROM (Kestrel-style)
The crosswind term (windFps, sin component) used a bare +sin() with no
negation, implementing 'destination' convention (clock = direction wind
blows toward) while the head/tailwind term (rangeWindFps, cos component)
was already self-consistent with 'origin' convention (clock = direction
wind blows FROM). These disagreed with each other, and both the guide's
existing text and the live-weather auto-fill's use of Open-Meteo's
wind_direction_10m already assumed origin convention, so the crosswind
term was the one that was wrong.

Fixed by negating windFps/windFpsTarget only. This is a real behaviour
change: a previously-entered clock value now pushes the bullet to the
opposite side than before.

Updated on-field hints, Reticle View wind arrow PUSH/R-L derivation,
4 tests that hardcoded the old sign, guide, and Math Models docx +
companion PDF.
</commit_message>
<xml_diff>
--- a/Cervid Ballistics - Mathematical Models and Design Methodology.docx
+++ b/Cervid Ballistics - Mathematical Models and Design Methodology.docx
@@ -897,7 +897,7 @@
         <w:pStyle w:val="FirstParagraph"/>
       </w:pPr>
       <w:r>
-        <w:t>Wind input uses a clock-face convention: 3 o’clock is a full-value crosswind from the shooter’s right, 9 o’clock a full-value crosswind from the left, and 12/6 o’clock represent a pure head/tailwind with no crosswind component. The crosswind speed actually used by the model is:</w:t>
+        <w:t>Wind input uses a clock-face convention, matching how a Kestrel or any other wind meter is read with the vane-into-the-wind technique: point it at the target (12 o’clock), turn it until the impeller stalls, and read whichever hour the back of the meter faces. 3 o’clock means a full-value crosswind FROM the shooter’s right, 9 o’clock a full-value crosswind FROM the left, and 12/6 o’clock represent a pure head/tailwind with no crosswind component (a wind FROM 12 is a headwind, FROM 6 a tailwind). The crosswind speed actually used by the model is:</w:t>
       </w:r>
     </w:p>
     <w:p>
@@ -908,7 +908,7 @@
         <w:rPr>
           <w:rStyle w:val="VerbatimChar"/>
         </w:rPr>
-        <w:t>W(ft/s) = windSpeed(mph) × 1.46667 × sin(clockPosition/6 × π)</w:t>
+        <w:t>W(ft/s) = −windSpeed(mph) × 1.46667 × sin(clockPosition/6 × π)</w:t>
       </w:r>
     </w:p>
     <w:p>
@@ -973,6 +973,20 @@
       </w:pPr>
       <w:r>
         <w:t xml:space="preserve">This uses cos() where the crosswind term above uses sin(), so it is zero at the pure-crosswind positions (3/9 o’clock) and maximal at 12 o’clock (headwind, positive, opposing the shot) and 6 o’clock (tailwind, negative, aiding it). Inside the integrator, the relative airspeed (vx + rangeWindFps, vy) replaces ground-frame (vx, vy) only for the magnitude and direction the deceleration force is drawn from — the Mach number fed into the drag-table lookup, getCd(v/sos, tbl), uses this same relative speed. Ground-frame position and the reported velocity, energy, and Mach figures are left untouched, since those are what a chronograph or the target itself actually measures, not the bullet’s airspeed.</w:t>
+      </w:r>
+    </w:p>
+    <w:p>
+      <w:pPr>
+        <w:pStyle w:val="BodyText"/>
+      </w:pPr>
+      <w:r>
+        <w:rPr>
+          <w:b/>
+        </w:rPr>
+        <w:t xml:space="preserve">Wind Clock convention fix (2026-08-31): </w:t>
+      </w:r>
+      <w:r>
+        <w:t xml:space="preserve">the crosswind term’s sign above (the leading minus on the sin() formula) was added to correct a real inconsistency. Before this fix, the crosswind term used a bare +sin() with no negation, which implemented the opposite “destination” convention — clock = the direction the wind blows TOWARD, so entering “3” pushed the bullet right. The head/tailwind (cos) term above was already self-consistent with the “origin”/“FROM” convention (a positive value there was already documented and behaving as a headwind at 12 o’clock, i.e. wind FROM the target’s direction), so the two terms actually disagreed with each other about which convention they used. The fix only touches the crosswind (sin) term, bringing both into agreement on “clock = direction the wind is FROM,” matching how a Kestrel or any other wind meter is read, and matching the live-weather auto-fill feature elsewhere in the app, which was always deriving the Wind Clock field from Open-Meteo’s wind_direction_10m — an explicitly “degrees true, where wind comes FROM” meteorological bearing — so that feature’s crosswind output was quietly backwards until now too. The practical effect: a previously-entered clock value now produces a crosswind push on the opposite side of the clock face from before.</w:t>
       </w:r>
     </w:p>
     <w:p>
@@ -2943,7 +2957,7 @@
         <w:pStyle w:val="BodyText"/>
       </w:pPr>
       <w:r>
-        <w:t xml:space="preserve">Direction is set with a 72px drag-anywhere clock face rather than twelve discrete numbered buttons. At any size that fits inline with the rest of the comparison controls, twelve separate tap targets around a small ring would each cover only a few pixels of circumference — well under a reliable touch target on a phone — so accuracy would depend on hitting a specific small spot rather than a general area. Instead the whole ring is one continuous drag/tap surface: clockHourFromAngle() takes a pointer offset from the dial’s center and returns the nearest hour via atan2, using the same 12-up/3-right/6-down/9-left mapping already established by the Wind Clock field, so the same “3=full R, 9=full L” convention holds everywhere in the app. Pointer Events (rather than separate mouse and touch listeners) drive the interaction, with setPointerCapture keeping a drag tracked even once a finger slides off the small circle, which a fast or wide drag on a touchscreen would otherwise lose the moment the finger crossed the dial’s edge.</w:t>
+        <w:t xml:space="preserve">Direction is set with a 72px drag-anywhere clock face rather than twelve discrete numbered buttons. At any size that fits inline with the rest of the comparison controls, twelve separate tap targets around a small ring would each cover only a few pixels of circumference — well under a reliable touch target on a phone — so accuracy would depend on hitting a specific small spot rather than a general area. Instead the whole ring is one continuous drag/tap surface: clockHourFromAngle() takes a pointer offset from the dial’s center and returns the nearest hour via atan2, using the same 12-up/3-right/6-down/9-left mapping already established by the Wind Clock field, so the same “clock = direction the wind is FROM” convention holds everywhere in the app. Pointer Events (rather than separate mouse and touch listeners) drive the interaction, with setPointerCapture keeping a drag tracked even once a finger slides off the small circle, which a fast or wide drag on a touchscreen would otherwise lose the moment the finger crossed the dial’s edge.</w:t>
       </w:r>
     </w:p>
     <w:p>

</xml_diff>

<commit_message>
Add FX True Ballistics Chronograph shot-log import (avg velocity + avg BC)
- parseFxChronoLog(): parses any-length shot log, per-shot velocity + T-BC(model)
  reading, cross-checks declared vs parsed shot count
- New 'Import Chronograph Shot Log' UI in Trajectory Truing, below Doppler fit
- Apply Avg Velocity -> Muzzle Velocity; Apply Avg BC -> bcMultiplier, gated on
  drag-model match to avoid silently mixing G1/G7/GA readings
- clearTruingState()/resetTruing() extended to cover new fields
- test_fx_chrono_import.js (41 checks), full regression suite clean (44/45,
  known unrelated exclusion), propagated to all 4 canonical files
- Guide: new topic in Section 7 (Calibrating to Your Rifle)
- Math Models docx: new Section 17 (after Doppler fit), PDF regenerated
- Changelog entry added
</commit_message>
<xml_diff>
--- a/Cervid Ballistics - Mathematical Models and Design Methodology.docx
+++ b/Cervid Ballistics - Mathematical Models and Design Methodology.docx
@@ -2238,6 +2238,56 @@
       </w:pPr>
       <w:r>
         <w:t xml:space="preserve">The result is reported alongside a per-point residual table (observed velocity, predicted velocity, and the difference, at every entered distance) rather than only the fitted BC value, so a shooter can judge fit quality directly and identify a misread or outlier point — the regression itself is a least-squares average and will not flag a bad point on its own, but a point sitting well outside the others’ residuals is visible immediately in the table. This method sets the same BC multiplier Section 12’s single-point Truing does; only one method’s result is ever in effect at a time, and every downstream consumer (the Results page’s Trued badge, Save-to-preset, Reset) operates on that shared multiplier with no awareness of which method produced it.</w:t>
+      </w:r>
+    </w:p>
+    <w:p>
+      <w:pPr>
+        <w:pStyle w:val="Heading2"/>
+      </w:pPr>
+      <w:bookmarkStart w:id="202" w:name="fx-chrono-import"/>
+      <w:r>
+        <w:t>17. Importing Chronograph Shot-Log Averages</w:t>
+      </w:r>
+      <w:bookmarkEnd w:id="202"/>
+    </w:p>
+    <w:p>
+      <w:pPr>
+        <w:pStyle w:val="FirstParagraph"/>
+      </w:pPr>
+      <w:r>
+        <w:t xml:space="preserve">Section 16’s Doppler fit assumes a device that samples velocity at many points down one shot’s flight path. Some chronographs offer a different kind of richness instead: the FX True Ballistics Chronograph (the format currently recognised) reports no downrange distance at all, but fires a string of independent shots and prints, for each one, both its velocity and the device’s own already-computed BC estimate (labelled “T-BC(model): value” in the exported log). This section covers importing that shot-log format — a fundamentally simpler operation than Section 16’s regression, since there is nothing to fit.</w:t>
+      </w:r>
+    </w:p>
+    <w:p>
+      <w:pPr>
+        <w:pStyle w:val="BodyText"/>
+      </w:pPr>
+      <w:r>
+        <w:t xml:space="preserve">Averaging, not fitting. Because every shot in the string already carries its own complete velocity and BC reading, the correct combination of several shots is a plain average of each quantity — exactly the reasoning already used, informally, whenever a shooter trusts the mean of several ordinary chronograph readings over any single shot. No regression, search, or residual minimisation is involved: MV̅ = (1/n)Σvᵢ and BC̅ = (1/n)ΣBCᵢ, taken over every shot the parser can read from the pasted log, whatever n happens to be.</w:t>
+      </w:r>
+    </w:p>
+    <w:p>
+      <w:pPr>
+        <w:pStyle w:val="BodyText"/>
+      </w:pPr>
+      <w:r>
+        <w:t xml:space="preserve">Parsing is tolerant by design: the full exported log — header line, weather line, declared shot count, summary statistics — can be pasted in as-is, since only lines shaped like an actual shot row (containing a numeric velocity paired with the literal “FPS” unit, and a “T-BC(model):” field followed by a numeric value) are read; everything else is ignored rather than needing to be trimmed out first. Nothing in the parser assumes a fixed number of shots — a 3-shot string and a 30-shot string are both read and averaged the same way, one row at a time. When the log’s own declared “Shot count: N” header is present, it is cross-checked against how many rows were actually parsed and readable, and a mismatch is surfaced as a warning — the most common cause being a truncated paste.</w:t>
+      </w:r>
+    </w:p>
+    <w:p>
+      <w:pPr>
+        <w:pStyle w:val="BodyText"/>
+      </w:pPr>
+      <w:r>
+        <w:t xml:space="preserve">The averaged velocity can be applied directly to Muzzle Velocity, the same as manually typing in a new value — it has no relationship to BC multiplier, Trued badge, or Save-to-preset, and needs none of that machinery. The averaged BC, by contrast, sets the same BC multiplier that Section 12’s single-point Truing and Section 16’s Doppler fit both use, and is deliberately gated: it can only be applied when every shot in the log reports the same drag model, and that model matches the Drag Model currently selected in the application. A T-BC(G1) reading is specific to the G1 reference projectile; applying it while G7 is selected would silently mix two different drag models with no obvious symptom until the resulting trajectory looked implausible, so the control is disabled rather than assumed correct.</w:t>
+      </w:r>
+    </w:p>
+    <w:p>
+      <w:pPr>
+        <w:pStyle w:val="BodyText"/>
+      </w:pPr>
+      <w:r>
+        <w:t xml:space="preserve">Per-shot detail is retained and displayed alongside the average — velocity and BC for every individual shot, with any shot whose BC estimate sits more than 15% from the average flagged for a second look — for the same reason Section 16’s residual table exists: an average alone hides whether it was built from a tight, consistent string or one contaminated by a misread or a flier.</w:t>
       </w:r>
     </w:p>
     <w:p>

</xml_diff>

<commit_message>
Add Probability of Hit feature: sensitivity, RSS error budget, elliptical hit probability
</commit_message>
<xml_diff>
--- a/Cervid Ballistics - Mathematical Models and Design Methodology.docx
+++ b/Cervid Ballistics - Mathematical Models and Design Methodology.docx
@@ -2288,6 +2288,72 @@
       </w:pPr>
       <w:r>
         <w:t xml:space="preserve">Per-shot detail is retained and displayed alongside the average — velocity and BC for every individual shot, with any shot whose BC estimate sits more than 15% from the average flagged for a second look — for the same reason Section 16’s residual table exists: an average alone hides whether it was built from a tight, consistent string or one contaminated by a misread or a flier.</w:t>
+      </w:r>
+    </w:p>
+    <w:p>
+      <w:pPr>
+        <w:pStyle w:val="Heading2"/>
+      </w:pPr>
+      <w:bookmarkStart w:id="300" w:name="probability-of-hit"/>
+      <w:r>
+        <w:t>18. Probability of Hit: Sensitivity, Root-Sum-Square Error Budgets, and Elliptical Hit Probability</w:t>
+      </w:r>
+      <w:bookmarkEnd w:id="300"/>
+    </w:p>
+    <w:p>
+      <w:pPr>
+        <w:pStyle w:val="FirstParagraph"/>
+      </w:pPr>
+      <w:r>
+        <w:t xml:space="preserve">Every figure this application reports elsewhere — drop, windage, energy — is a single point estimate: the trajectory a load would follow if every input were known exactly. In practice a shooter never has that. The wind call is a guess, however good; the load’s muzzle velocity varies shot to shot; the rifle itself groups to some finite size; and the shooter’s own hold and trigger control add a further, genuinely random, dispersion. Probability of Hit turns those four separate uncertainties into one number: given a target of a stated size at a stated range, how likely is a hit? This section covers how each source is quantified, how they are combined, and how the resulting figure is turned into an actual probability against a circular target.</w:t>
+      </w:r>
+    </w:p>
+    <w:p>
+      <w:pPr>
+        <w:pStyle w:val="BodyText"/>
+      </w:pPr>
+      <w:r>
+        <w:t xml:space="preserve">Two of the four sources — wind-call uncertainty and muzzle-velocity spread (“velocity SD”) — are quantified by finite-difference sensitivity against the same computeTrajectory() engine every other page in the application calls, rather than by any closed-form formula. For each source, the relevant input (wind speed or muzzle velocity) is nudged by plus and minus its own one-sigma figure around whatever baseline the page is currently showing, the trajectory is recomputed at the selected range for each nudge, and the resulting shift in Drop and in total windage (crosswind drift + spin drift + Coriolis, the same combined figure Section 11 and the HUD/Reticle views already use) is measured against the unperturbed baseline. The two one-sided shifts are averaged (a central difference) into a single one-sigma linear dispersion, in inches, for that source — separately for elevation and for windage, since a given source generally does not affect both axes equally. Recomputing the full trajectory for each nudge, rather than approximating from the baseline table's own numbers, keeps this consistent with every other override in the application: wind and velocity both have second-order effects (via time of flight and airspeed-dependent drag) that a naive linear scaling would miss.</w:t>
+      </w:r>
+    </w:p>
+    <w:p>
+      <w:pPr>
+        <w:pStyle w:val="BodyText"/>
+      </w:pPr>
+      <w:r>
+        <w:t xml:space="preserve">Velocity SD — this load’s own round-to-round muzzle-velocity spread — cannot be derived from anything else already in the application: there is no formula connecting ballistic coefficient, weight, velocity, or drag model to an empirical shot-to-shot spread, since it depends on things (powder charge consistency, primer, case volume, or airgun valve/hammer-spring behaviour) the physics engine has no visibility into. It therefore starts as a rough manual placeholder (10fps) and is only ever replaced by a measured figure once a chronograph log of two or more shots is read on the Trajectory Truing tab (Section 17) and explicitly applied — at which point it is both relabelled “from log” and computed as the ordinary sample standard deviation, σ = √(Σ(vi − v̄)² / (n−1)), over the parsed shot velocities. Editing the figure by hand afterwards reverts the label back to “manual,” so a stale, no-longer-current log reading can never keep being presented as measured. Wind-call uncertainty has no equivalent measured path — it is inherently a statement about the shooter’s own confidence in a single wind reading, not a property of the rifle or ammunition — and is always a manual entry.</w:t>
+      </w:r>
+    </w:p>
+    <w:p>
+      <w:pPr>
+        <w:pStyle w:val="BodyText"/>
+      </w:pPr>
+      <w:r>
+        <w:t xml:space="preserve">The remaining two sources — rifle mechanical precision (group size) and shooter proficiency — are entered directly as angular dispersion figures rather than run through computeTrajectory() at all, since both already describe an angular spread rather than a response to some other physical input. Shooter proficiency is a single global setting, in MOA, shared across every rifle and load — by explicit design decision it describes the shooter, not any one firearm, so it is never tied to a preset and can be adjusted at any time. Rifle group size, in contrast, is a property of a specific rifle-and-ammunition combination and is saved per-preset, alongside BC and weight. It can be entered directly in mils or MOA, or as a linear group — inches or centimetres — measured at a stated distance, converted to MOA by MOA = inches ÷ (yards × 0.010472), the same inches-per-100-yards-per-MOA relationship computeTrajectory()’s own moa/mils row fields are built from (Section 11), just solved for a standalone measurement rather than a trajectory row. Whichever unit is used, the resulting MOA figure is converted to a linear one-sigma dispersion at the selected range by inches = MOA × (range⁄100) × 1.0472, and applied identically to both the elevation and the windage axis — a deliberate simplifying assumption that a rifle’s mechanical group and a shooter’s own hold are each roughly isotropic (equally dispersed in every direction), rather than preferentially wider on one axis. Both figures are treated as one-sigma (standard-deviation) dispersion radii, not as extreme spread (the diameter of an observed group) — a shooter working from a group measured as extreme spread should convert before entering it here, and this distinction is called out in the in-app help text rather than silently assumed.</w:t>
+      </w:r>
+    </w:p>
+    <w:p>
+      <w:pPr>
+        <w:pStyle w:val="BodyText"/>
+      </w:pPr>
+      <w:r>
+        <w:t xml:space="preserve">All four one-sigma figures — velocity-SD sensitivity, wind-uncertainty sensitivity, rifle group size, and shooter proficiency — are combined separately for the elevation axis and the windage axis by root-sum-square: σ = √(σ₁² + σ₂² + σ₃² + σ₄²). This is the standard treatment for combining independent sources of uncertainty — the same reasoning used to combine independent measurement uncertainties in any physical error budget — and is correct precisely to the extent the four sources are actually independent of one another, which is treated here as a reasonable working assumption rather than something separately verified. The result is one elevation sigma and one windage sigma, generally unequal, describing an elliptical (not circular) impact-point dispersion pattern at the selected range.</w:t>
+      </w:r>
+    </w:p>
+    <w:p>
+      <w:pPr>
+        <w:pStyle w:val="BodyText"/>
+      </w:pPr>
+      <w:r>
+        <w:t xml:space="preserve">Turning that elliptical dispersion into an actual hit probability against a circular target has no simple closed form. The one case that does — an isotropic (circular) dispersion, σelevation = σwindage = σ — reduces to the Rayleigh cumulative distribution function, P = 1 − exp(−R² ⁄ (2σ²)), where R is the target radius; this is the formula the simpler circular-dispersion-only case (and many published field-target probability tools) use. Because wind and velocity sensitivity generally differ between the elevation and windage axes, the general case here is elliptical rather than circular, and is instead evaluated by direct numerical integration of the (uncorrelated) bivariate-normal impact-point density over the target disk: the disk is gridded into a fine Cartesian mesh (220 divisions across the diameter, clipped to the circle on each row), the density at each cell’s centre is evaluated as the product of two independent one-dimensional normal densities (one per axis, using each axis’s own sigma), and the weighted sum over every cell inside the disk gives the probability. This numerical approach was cross-checked against the closed-form Rayleigh result for the isotropic special case (σelevation = σwindage) across several sigma/radius combinations, agreeing to within 0.5%, before being relied on for the general elliptical case that has no closed form to check against.</w:t>
+      </w:r>
+    </w:p>
+    <w:p>
+      <w:pPr>
+        <w:pStyle w:val="BodyText"/>
+      </w:pPr>
+      <w:r>
+        <w:t xml:space="preserve">Three simplifications are deliberate, documented scope limits for this first version rather than oversights. First, the target is always treated as a single circular-equivalent diameter, even for a target that is not actually circular — the same convention the reference field-target tools this feature was modelled on use, and the more mathematically tractable case besides (an axis-aligned rectangular target would in fact reduce to two independent one-dimensional normal CDF lookups, a simpler case than the circular one implemented here). Second, range-estimation error and atmospheric uncertainty are not modelled at all: nothing already in the application can honestly source either figure yet (there is no rangefinder integration, and atmospheric readings are taken as entered, not as uncertain), and published breakdowns of comparable tools show both contributing a small fraction of the total error budget under typical conditions — so their omission is judged an acceptable, honestly-disclosed gap rather than a silently wrong number dressed up as complete. Third, this is a single static probability for the conditions entered, not a live, continuously-updated figure tracking a shooter’s hold in real time, and there is no Monte-Carlo scatter-plot visualisation of the underlying dispersion — both reasonable directions for a future version, but neither essential to a first, honestly-scoped release.</w:t>
       </w:r>
     </w:p>
     <w:p>

</xml_diff>

<commit_message>
Add illustrative shot-scatter graphic to Probability of Hit page
</commit_message>
<xml_diff>
--- a/Cervid Ballistics - Mathematical Models and Design Methodology.docx
+++ b/Cervid Ballistics - Mathematical Models and Design Methodology.docx
@@ -2354,6 +2354,14 @@
       </w:pPr>
       <w:r>
         <w:t xml:space="preserve">Three simplifications are deliberate, documented scope limits for this first version rather than oversights. First, the target is always treated as a single circular-equivalent diameter, even for a target that is not actually circular — the same convention the reference field-target tools this feature was modelled on use, and the more mathematically tractable case besides (an axis-aligned rectangular target would in fact reduce to two independent one-dimensional normal CDF lookups, a simpler case than the circular one implemented here). Second, range-estimation error and atmospheric uncertainty are not modelled at all: nothing already in the application can honestly source either figure yet (there is no rangefinder integration, and atmospheric readings are taken as entered, not as uncertain), and published breakdowns of comparable tools show both contributing a small fraction of the total error budget under typical conditions — so their omission is judged an acceptable, honestly-disclosed gap rather than a silently wrong number dressed up as complete. Third, this is a single static probability for the conditions entered, not a live, continuously-updated figure tracking a shooter’s hold in real time, and there is no Monte-Carlo scatter-plot visualisation of the underlying dispersion — both reasonable directions for a future version, but neither essential to a first, honestly-scoped release.</w:t>
+      </w:r>
+    </w:p>
+    <w:p>
+      <w:pPr>
+        <w:pStyle w:val="BodyText"/>
+      </w:pPr>
+      <w:r>
+        <w:t xml:space="preserve">A small circular graphic accompanies the headline percentage, plotting a random sample of simulated impact points against the selected target — drawn from the same elevation and windage sigmas by the standard Box-Muller transform, purely as a visual aid rather than as a second, independently-computed figure. This is a deliberate, documented distinction: the headline percentage comes from phHitProbability()'s exact numerical integration, while a small random sample (24 points) will not always land inside the target ring in precisely the same proportion the analytic figure states, simply from ordinary sampling variance at that sample size. Rather than compute and display a second, sample-based percentage that could occasionally disagree with the analytically correct one — a source of confusion this project's own transparency-about-approximations principle (Part 2) argues against — the graphic is captioned as illustrative only, and carries no percentage readout of its own.</w:t>
       </w:r>
     </w:p>
     <w:p>

</xml_diff>

<commit_message>
Correct Math Models docx/pdf title-page date to September 2026
The title page's Date-styled paragraph still read "August 2026" despite
every substantive edit made to the document this month (Shooter
Proficiency unit toggle, Probability of Hit target-size CRUD, Live
Weather recalculation fix). Corrected the two <w:t> runs making up the
date field to read "September 2026"; left the four inline historical
fix-annotation dates (2026-08-14, three at 2026-08-31) untouched since
those record when specific past fixes actually landed, not the
document's overall revision date.

Verified: zip integrity intact, exact entry-set match against the prior
committed version, regenerated PDF text matches the docx exactly with
no other unintended differences.

Updated CervidBallistics_ProjectBrief.md changelog.
</commit_message>
<xml_diff>
--- a/Cervid Ballistics - Mathematical Models and Design Methodology.docx
+++ b/Cervid Ballistics - Mathematical Models and Design Methodology.docx
@@ -1,6 +1,6 @@
 
 <file path=word/document.xml><?xml version="1.0" encoding="utf-8"?>
-<w:document xmlns:wpc="http://schemas.microsoft.com/office/word/2010/wordprocessingCanvas" xmlns:cx="http://schemas.microsoft.com/office/drawing/2014/chartex" xmlns:cx1="http://schemas.microsoft.com/office/drawing/2015/9/8/chartex" xmlns:cx2="http://schemas.microsoft.com/office/drawing/2015/10/21/chartex" xmlns:cx3="http://schemas.microsoft.com/office/drawing/2016/5/9/chartex" xmlns:cx4="http://schemas.microsoft.com/office/drawing/2016/5/10/chartex" xmlns:cx5="http://schemas.microsoft.com/office/drawing/2016/5/11/chartex" xmlns:cx6="http://schemas.microsoft.com/office/drawing/2016/5/12/chartex" xmlns:cx7="http://schemas.microsoft.com/office/drawing/2016/5/13/chartex" xmlns:cx8="http://schemas.microsoft.com/office/drawing/2016/5/14/chartex" xmlns:mc="http://schemas.openxmlformats.org/markup-compatibility/2006" xmlns:m="http://schemas.openxmlformats.org/officeDocument/2006/math" xmlns:aink="http://schemas.microsoft.com/office/drawing/2016/ink" xmlns:am3d="http://schemas.microsoft.com/office/drawing/2017/model3d" xmlns:oel="http://schemas.microsoft.com/office/2019/extlst" xmlns:r="http://schemas.openxmlformats.org/officeDocument/2006/relationships" xmlns:wp14="http://schemas.microsoft.com/office/word/2010/wordprocessingDrawing" xmlns:wp="http://schemas.openxmlformats.org/drawingml/2006/wordprocessingDrawing" xmlns:wpg="http://schemas.microsoft.com/office/word/2010/wordprocessingGroup" xmlns:wpi="http://schemas.microsoft.com/office/word/2010/wordprocessingInk" xmlns:wps="http://schemas.microsoft.com/office/word/2010/wordprocessingShape" xmlns:o="urn:schemas-microsoft-com:office:office" xmlns:v="urn:schemas-microsoft-com:vml" xmlns:w10="urn:schemas-microsoft-com:office:word" xmlns:w="http://schemas.openxmlformats.org/wordprocessingml/2006/main" xmlns:w14="http://schemas.microsoft.com/office/word/2010/wordml" xmlns:w15="http://schemas.microsoft.com/office/word/2012/wordml" xmlns:w16cei="http://schemas.microsoft.com/office/word/2026/wordml/cei" xmlns:w16cex="http://schemas.microsoft.com/office/word/2018/wordml/cex" xmlns:w16cid="http://schemas.microsoft.com/office/word/2016/wordml/cid" xmlns:w16="http://schemas.microsoft.com/office/word/2018/wordml" xmlns:w16sdtdh="http://schemas.microsoft.com/office/word/2020/wordml/sdtdatahash" xmlns:w16sdtfl="http://schemas.microsoft.com/office/word/2024/wordml/sdtformatlock" xmlns:w16se="http://schemas.microsoft.com/office/word/2015/wordml/symex" xmlns:w16du="http://schemas.microsoft.com/office/word/2023/wordml/word16du" xmlns:wne="http://schemas.microsoft.com/office/word/2006/wordml" mc:Ignorable="w14 w15 w16se w16cid w16 w16cex w16sdtdh w16sdtfl w16du wp14">
+<w:document xmlns:wpc="http://schemas.microsoft.com/office/word/2010/wordprocessingCanvas" xmlns:cx="http://schemas.microsoft.com/office/drawing/2014/chartex" xmlns:cx1="http://schemas.microsoft.com/office/drawing/2015/9/8/chartex" xmlns:cx2="http://schemas.microsoft.com/office/drawing/2015/10/21/chartex" xmlns:cx3="http://schemas.microsoft.com/office/drawing/2016/5/9/chartex" xmlns:cx4="http://schemas.microsoft.com/office/drawing/2016/5/10/chartex" xmlns:cx5="http://schemas.microsoft.com/office/drawing/2016/5/11/chartex" xmlns:cx6="http://schemas.microsoft.com/office/drawing/2016/5/12/chartex" xmlns:cx7="http://schemas.microsoft.com/office/drawing/2016/5/13/chartex" xmlns:cx8="http://schemas.microsoft.com/office/drawing/2016/5/14/chartex" xmlns:mc="http://schemas.openxmlformats.org/markup-compatibility/2006" xmlns:m="http://schemas.openxmlformats.org/officeDocument/2006/math" xmlns:aink="http://schemas.microsoft.com/office/drawing/2016/ink" xmlns:am3d="http://schemas.microsoft.com/office/drawing/2017/model3d" xmlns:oel="http://schemas.microsoft.com/office/2019/extlst" xmlns:r="http://schemas.openxmlformats.org/officeDocument/2006/relationships" xmlns:wp14="http://schemas.microsoft.com/office/word/2010/wordprocessingDrawing" xmlns:wp="http://schemas.openxmlformats.org/drawingml/2006/wordprocessingDrawing" xmlns:wpg="http://schemas.microsoft.com/office/word/2010/wordprocessingGroup" xmlns:wpi="http://schemas.microsoft.com/office/word/2010/wordprocessingInk" xmlns:wps="http://schemas.microsoft.com/office/word/2010/wordprocessingShape" xmlns:o="urn:schemas-microsoft-com:office:office" xmlns:v="urn:schemas-microsoft-com:vml" xmlns:w10="urn:schemas-microsoft-com:office:word" xmlns:w="http://schemas.openxmlformats.org/wordprocessingml/2006/main" xmlns:w14="http://schemas.microsoft.com/office/word/2010/wordml" xmlns:w15="http://schemas.microsoft.com/office/word/2012/wordml" xmlns:w16cex="http://schemas.microsoft.com/office/word/2018/wordml/cex" xmlns:w16cid="http://schemas.microsoft.com/office/word/2016/wordml/cid" xmlns:w16="http://schemas.microsoft.com/office/word/2018/wordml" xmlns:w16sdtdh="http://schemas.microsoft.com/office/word/2020/wordml/sdtdatahash" xmlns:w16sdtfl="http://schemas.microsoft.com/office/word/2024/wordml/sdtformatlock" xmlns:w16se="http://schemas.microsoft.com/office/word/2015/wordml/symex" xmlns:w16du="http://schemas.microsoft.com/office/word/2023/wordml/word16du" xmlns:wne="http://schemas.microsoft.com/office/word/2006/wordml" mc:Ignorable="w14 w15 w16se w16cid w16 w16cex w16sdtdh w16sdtfl w16du wp14">
   <w:body>
     <w:p>
       <w:pPr>
@@ -68,7 +68,10 @@
         <w:pStyle w:val="Date"/>
       </w:pPr>
       <w:r>
-        <w:t xml:space="preserve">August 2026</w:t>
+        <w:t>September</w:t>
+      </w:r>
+      <w:r>
+        <w:t xml:space="preserve"> 2026</w:t>
       </w:r>
     </w:p>
     <w:p>
@@ -163,7 +166,7 @@
               </wp:inline>
             </w:drawing>
           </mc:Choice>
-          <mc:Fallback>
+          <mc:Fallback xmlns:w16cei="http://schemas.microsoft.com/office/word/2026/wordml/cei">
             <w:pict>
               <v:rect w14:anchorId="7093B369" id="Horizontal Line 1" o:spid="_x0000_s1026" style="width:468pt;height:1.1pt;visibility:visible;mso-wrap-style:square;mso-left-percent:-10001;mso-top-percent:-10001;mso-position-horizontal:absolute;mso-position-horizontal-relative:char;mso-position-vertical:absolute;mso-position-vertical-relative:line;mso-left-percent:-10001;mso-top-percent:-10001;v-text-anchor:top" o:gfxdata="UEsDBBQABgAIAAAAIQC2gziS/gAAAOEBAAATAAAAW0NvbnRlbnRfVHlwZXNdLnhtbJSRQU7DMBBF 90jcwfIWJU67QAgl6YK0S0CoHGBkTxKLZGx5TGhvj5O2G0SRWNoz/78nu9wcxkFMGNg6quQqL6RA 0s5Y6ir5vt9lD1JwBDIwOMJKHpHlpr69KfdHjyxSmriSfYz+USnWPY7AufNIadK6MEJMx9ApD/oD OlTrorhX2lFEilmcO2RdNtjC5xDF9pCuTyYBB5bi6bQ4syoJ3g9WQ0ymaiLzg5KdCXlKLjvcW893 SUOqXwnz5DrgnHtJTxOsQfEKIT7DmDSUCaxw7Rqn8787ZsmRM9e2VmPeBN4uqYvTtW7jvijg9N/y JsXecLq0q+WD6m8AAAD//wMAUEsDBBQABgAIAAAAIQA4/SH/1gAAAJQBAAALAAAAX3JlbHMvLnJl bHOkkMFqwzAMhu+DvYPRfXGawxijTi+j0GvpHsDYimMaW0Yy2fr2M4PBMnrbUb/Q94l/f/hMi1qR JVI2sOt6UJgd+ZiDgffL8ekFlFSbvV0oo4EbChzGx4f9GRdb25HMsYhqlCwG5lrLq9biZkxWOiqY 22YiTra2kYMu1l1tQD30/bPm3wwYN0x18gb45AdQl1tp5j/sFB2T0FQ7R0nTNEV3j6o9feQzro1i OWA14Fm+Q8a1a8+Bvu/d/dMb2JY5uiPbhG/ktn4cqGU/er3pcvwCAAD//wMAUEsDBBQABgAIAAAA IQB2Bga0KQIAAD8EAAAOAAAAZHJzL2Uyb0RvYy54bWysU8Fu2zAMvQ/YPwi6L07SpG2MOEWRtsOA bivW7AMUWbaFSaJGKXGyry+lpGm23Yb5YJAi9fT4SM5vdtawrcKgwVV8NBhyppyEWru24t9XDx+u OQtRuFoYcKriexX4zeL9u3nvSzWGDkytkBGIC2XvK97F6MuiCLJTVoQBeOUo2ABaEcnFtqhR9IRu TTEeDi+LHrD2CFKFQKd3hyBfZPymUTJ+bZqgIjMVJ24x/zH/1+lfLOaibFH4TssjDfEPLKzQjh49 Qd2JKNgG9V9QVkuEAE0cSLAFNI2WKtdA1YyGf1Tz3Amvci0kTvAnmcL/g5Vfts/+CRP14B9B/gjM wTcgnUacrGUnXKtugychj0f3tY5PoF0kFuc5iNB3StS/H+cSVntPrc/JK7WLCSG5pH3R+1CeOCQn EBu27j9DTVfEJkKWddegTRxJMLbL3dufukeITNLhdDa5uBxSkyXFRhezq9zdQpSvlz2G+FGBZcmo OFJNGVxsH0NMZET5mpLecvCgjckDYhzrKz6bjqf5QgCj6xTMsmG7XhpkW5FGLH+5MhL0PM3qSINu tK349SlJlEmxe1fnV6LQ5mATE+OO6iRB0jiHcg31nsTB1B0qk7aOjA7wF2c9TXDFw8+NQMWZ+eSo C7PRZJJGPjuT6dWYHDyPrM8jwkmCqnjk7GAu42FNNh512+WGHVS5paY0Ogv2xupIlqY063jcqLQG 537Oetv7xQsAAAD//wMAUEsDBBQABgAIAAAAIQAvqYUv3AAAAAgBAAAPAAAAZHJzL2Rvd25yZXYu eG1sTI/NTsMwEITvSLyDtUjcqEMQFU3jVOGn10oUJMrNjRc7aryOYrcJb8/CpVxGGo12dr5yNflO nHCIbSAFt7MMBFITTEtWwfvb+uYBREyajO4CoYJvjLCqLi9KXZgw0iuetskKLqFYaAUupb6QMjYO vY6z0CNx9hUGrxPbwUoz6JHLfSfzLJtLr1viD073+OSwOWyPXsFL/7mp722U9Udyu0N4HNduY5W6 vpqelyz1EkTCKZ0v4JeB90PFw/bhSCaKTgHTpD/lbHE3Z7tXkOcgq1L+B6h+AAAA//8DAFBLAQIt ABQABgAIAAAAIQC2gziS/gAAAOEBAAATAAAAAAAAAAAAAAAAAAAAAABbQ29udGVudF9UeXBlc10u eG1sUEsBAi0AFAAGAAgAAAAhADj9If/WAAAAlAEAAAsAAAAAAAAAAAAAAAAALwEAAF9yZWxzLy5y ZWxzUEsBAi0AFAAGAAgAAAAhAHYGBrQpAgAAPwQAAA4AAAAAAAAAAAAAAAAALgIAAGRycy9lMm9E b2MueG1sUEsBAi0AFAAGAAgAAAAhAC+phS/cAAAACAEAAA8AAAAAAAAAAAAAAAAAgwQAAGRycy9k b3ducmV2LnhtbFBLBQYAAAAABAAEAPMAAACMBQAAAAA= " filled="f">
                 <o:lock v:ext="edit" rotation="t" aspectratio="t" verticies="t" text="t" shapetype="t"/>
@@ -206,6 +209,11 @@
           <w:b/>
         </w:rPr>
         <w:t xml:space="preserve">horizontal distance travelled (x, in feet) as the </w:t>
+      </w:r>
+      <w:r>
+        <w:rPr>
+          <w:b/>
+        </w:rPr>
         <w:lastRenderedPageBreak/>
         <w:t>independent variable</w:t>
       </w:r>
@@ -522,6 +530,8 @@
       </w:r>
       <w:r>
         <w:t xml:space="preserve"> table being used). Because BC already normalises for the reference projectile’s own geometry under whichever </w:t>
+      </w:r>
+      <w:r>
         <w:lastRenderedPageBreak/>
         <w:t>standard is selected, the equation needs no separate diameter, mass, or cross-sectional-area terms.</w:t>
       </w:r>
@@ -953,7 +963,7 @@
         <w:pStyle w:val="BodyText"/>
       </w:pPr>
       <w:r>
-        <w:t xml:space="preserve">A head or tailwind component of the same wind is also modelled, as of 2026-08-14. Drag is physically a function of the bullet’s velocity relative to the air, not relative to the ground, so an along-shot wind component is added to the airspeed the deceleration calculation sees:</w:t>
+        <w:t>A head or tailwind component of the same wind is also modelled, as of 2026-08-14. Drag is physically a function of the bullet’s velocity relative to the air, not relative to the ground, so an along-shot wind component is added to the airspeed the deceleration calculation sees:</w:t>
       </w:r>
     </w:p>
     <w:p>
@@ -972,7 +982,7 @@
         <w:pStyle w:val="BodyText"/>
       </w:pPr>
       <w:r>
-        <w:t xml:space="preserve">This uses cos() where the crosswind term above uses sin(), so it is zero at the pure-crosswind positions (3/9 o’clock) and maximal at 12 o’clock (headwind, positive, opposing the shot) and 6 o’clock (tailwind, negative, aiding it). Inside the integrator, the relative airspeed (vx + rangeWindFps, vy) replaces ground-frame (vx, vy) only for the magnitude and direction the deceleration force is drawn from — the Mach number fed into the drag-table lookup, getCd(v/sos, tbl), uses this same relative speed. Ground-frame position and the reported velocity, energy, and Mach figures are left untouched, since those are what a chronograph or the target itself actually measures, not the bullet’s airspeed.</w:t>
+        <w:t>This uses cos() where the crosswind term above uses sin(), so it is zero at the pure-crosswind positions (3/9 o’clock) and maximal at 12 o’clock (headwind, positive, opposing the shot) and 6 o’clock (tailwind, negative, aiding it). Inside the integrator, the relative airspeed (vx + rangeWindFps, vy) replaces ground-frame (vx, vy) only for the magnitude and direction the deceleration force is drawn from — the Mach number fed into the drag-table lookup, getCd(v/sos, tbl), uses this same relative speed. Ground-frame position and the reported velocity, energy, and Mach figures are left untouched, since those are what a chronograph or the target itself actually measures, not the bullet’s airspeed.</w:t>
       </w:r>
     </w:p>
     <w:p>
@@ -986,7 +996,11 @@
         <w:t xml:space="preserve">Wind Clock convention fix (2026-08-31): </w:t>
       </w:r>
       <w:r>
-        <w:t xml:space="preserve">the crosswind term’s sign above (the leading minus on the sin() formula) was added to correct a real inconsistency. Before this fix, the crosswind term used a bare +sin() with no negation, which implemented the opposite “destination” convention — clock = the direction the wind blows TOWARD, so entering “3” pushed the bullet right. The head/tailwind (cos) term above was already self-consistent with the “origin”/“FROM” convention (a positive value there was already documented and behaving as a headwind at 12 o’clock, i.e. wind FROM the target’s direction), so the two terms actually disagreed with each other about which convention they used. The fix only touches the crosswind (sin) term, bringing both into agreement on “clock = direction the wind is FROM,” matching how a Kestrel or any other wind meter is read, and matching the live-weather auto-fill feature elsewhere in the app, which was always deriving the Wind Clock field from Open-Meteo’s wind_direction_10m — an explicitly “degrees true, where wind comes FROM” meteorological bearing — so that feature’s crosswind output was quietly backwards until now too. The practical effect: a previously-entered clock value now produces a crosswind push on the opposite side of the clock face from before.</w:t>
+        <w:t xml:space="preserve">the crosswind term’s sign above (the leading minus on the sin() formula) was added to correct a real inconsistency. Before </w:t>
+      </w:r>
+      <w:r>
+        <w:lastRenderedPageBreak/>
+        <w:t>this fix, the crosswind term used a bare +sin() with no negation, which implemented the opposite “destination” convention — clock = the direction the wind blows TOWARD, so entering “3” pushed the bullet right. The head/tailwind (cos) term above was already self-consistent with the “origin”/“FROM” convention (a positive value there was already documented and behaving as a headwind at 12 o’clock, i.e. wind FROM the target’s direction), so the two terms actually disagreed with each other about which convention they used. The fix only touches the crosswind (sin) term, bringing both into agreement on “clock = direction the wind is FROM,” matching how a Kestrel or any other wind meter is read, and matching the live-weather auto-fill feature elsewhere in the app, which was always deriving the Wind Clock field from Open-Meteo’s wind_direction_10m — an explicitly “degrees true, where wind comes FROM” meteorological bearing — so that feature’s crosswind output was quietly backwards until now too. The practical effect: a previously-entered clock value now produces a crosswind push on the opposite side of the clock face from before.</w:t>
       </w:r>
     </w:p>
     <w:p>
@@ -1000,7 +1014,7 @@
         <w:t xml:space="preserve">Magnitude: </w:t>
       </w:r>
       <w:r>
-        <w:t xml:space="preserve">quantified against the live engine before implementation, using representative loads at their typical distances. For centrefire and rimfire the effect stays small even at 15–20mph — a few hundredths of a mil at long range, well inside the uncertainty already present from BC tolerance and chronograph error. It is proportionally larger for air rifle pellets specifically, since a given wind speed is a much larger fraction of a pellet’s much lower muzzle velocity: a light, low-BC pellet (JSB Exact .177 8.44gr, BC 0.019) at a typical 50yd Field Target distance shows roughly 0.07–0.09mil of additional drop from a 15–20mph headwind — comparable to half a scope click, and larger in angular terms than the same wind speed’s effect on the .243 Win 100gr built-in preset at 500yd. A heavier, higher-BC pellet (JSB Exact Monster .22 25.4gr, BC 0.084) shows an effect roughly ten times smaller under the same conditions, consistent with why competitive air rifle shooters favour denser, higher-BC pellets partly for reduced wind sensitivity.</w:t>
+        <w:t>quantified against the live engine before implementation, using representative loads at their typical distances. For centrefire and rimfire the effect stays small even at 15–20mph — a few hundredths of a mil at long range, well inside the uncertainty already present from BC tolerance and chronograph error. It is proportionally larger for air rifle pellets specifically, since a given wind speed is a much larger fraction of a pellet’s much lower muzzle velocity: a light, low-BC pellet (JSB Exact .177 8.44gr, BC 0.019) at a typical 50yd Field Target distance shows roughly 0.07–0.09mil of additional drop from a 15–20mph headwind — comparable to half a scope click, and larger in angular terms than the same wind speed’s effect on the .243 Win 100gr built-in preset at 500yd. A heavier, higher-BC pellet (JSB Exact Monster .22 25.4gr, BC 0.084) shows an effect roughly ten times smaller under the same conditions, consistent with why competitive air rifle shooters favour denser, higher-BC pellets partly for reduced wind sensitivity.</w:t>
       </w:r>
     </w:p>
     <w:p>
@@ -1022,7 +1036,7 @@
         <w:pStyle w:val="BodyText"/>
       </w:pPr>
       <w:r>
-        <w:t xml:space="preserve">When set, the shooter's own crosswind component W (defined above) and head/tailwind component rangeWindFps each get a matching value computed from the target reading, and the two pairs are blended by straight-line downrange fraction rather than by interpolating the raw speed-and-clock values directly:</w:t>
+        <w:t>When set, the shooter's own crosswind component W (defined above) and head/tailwind component rangeWindFps each get a matching value computed from the target reading, and the two pairs are blended by straight-line downrange fraction rather than by interpolating the raw speed-and-clock values directly:</w:t>
       </w:r>
     </w:p>
     <w:p>
@@ -1052,15 +1066,19 @@
         <w:pStyle w:val="BodyText"/>
       </w:pPr>
       <w:r>
-        <w:t xml:space="preserve">Blending the crosswind and head/tailwind components separately, rather than the shooter's raw clock positions, avoids a meaningless average when the two readings come from different directions (a 3 o'clock wind and a 9 o'clock wind do not average to "no wind" by any sensible physical reasoning; averaging their already-resolved sideways components does). rangeWindFps(x) is re-evaluated at the bullet's own current downrange position on every integration step — including inside the iterative angle-refinement solver described in Section 4, so a zero solved at a shorter range than maxYd correctly sees only a partial blend toward the target reading, not the full one.</w:t>
-      </w:r>
-    </w:p>
-    <w:p>
-      <w:pPr>
-        <w:pStyle w:val="BodyText"/>
-      </w:pPr>
-      <w:r>
-        <w:t xml:space="preserve">The lag-rule crosswind formula above, drift(in) = W × (t_actual − x/MV) × 12, only works as a single closed-form multiplication because W is constant — it factors straight out of the subtraction. Once W can vary with position that factoring is no longer valid, so the same relationship is instead accumulated incrementally, one integration step at a time:</w:t>
+        <w:t xml:space="preserve">Blending the crosswind and head/tailwind components separately, rather than the shooter's raw clock positions, avoids a meaningless average when the two readings come from different directions (a 3 o'clock wind and a 9 o'clock wind do not average to "no wind" by any sensible physical reasoning; averaging their already-resolved sideways components does). rangeWindFps(x) is re-evaluated at the bullet's own current downrange position on every integration step — including inside the iterative </w:t>
+      </w:r>
+      <w:r>
+        <w:lastRenderedPageBreak/>
+        <w:t>angle-refinement solver described in Section 4, so a zero solved at a shorter range than maxYd correctly sees only a partial blend toward the target reading, not the full one.</w:t>
+      </w:r>
+    </w:p>
+    <w:p>
+      <w:pPr>
+        <w:pStyle w:val="BodyText"/>
+      </w:pPr>
+      <w:r>
+        <w:t>The lag-rule crosswind formula above, drift(in) = W × (t_actual − x/MV) × 12, only works as a single closed-form multiplication because W is constant — it factors straight out of the subtraction. Once W can vary with position that factoring is no longer valid, so the same relationship is instead accumulated incrementally, one integration step at a time:</w:t>
       </w:r>
     </w:p>
     <w:p>
@@ -1079,15 +1097,15 @@
         <w:pStyle w:val="BodyText"/>
       </w:pPr>
       <w:r>
-        <w:t xml:space="preserve">Summed over the whole flight this telescopes back to exactly the original closed-form result whenever W(x) is constant (Wind at Target unset or equal to the shooter's own reading), since ΣΔt_step and ΣstepFt/MV reduce to t_actual and x/MV respectively. When W(x) varies, this is the physically correct generalization rather than an approximation: dLag itself grows over the course of the flight as the bullet decelerates and spends more time covering each successive yard, so a given amount of crosswind exposure contributes more to total drift when it occurs during the slower, back half of the trajectory than during the fast, early part. Confirmed against the live engine: a crosswind confined to the first half of a 1000yd .308 Win flight (full value at the muzzle, tapering to calm at the target) produces materially less drift at the target than the same crosswind confined to the second half (calm at the muzzle, ramping up to full value at the target) — consistent with the long-range-shooting principle that a wind read near the target carries more weight than the same wind read near the firing line.</w:t>
-      </w:r>
-    </w:p>
-    <w:p>
-      <w:pPr>
-        <w:pStyle w:val="BodyText"/>
-      </w:pPr>
-      <w:r>
-        <w:t xml:space="preserve">Wind at Target is a standing, session-level field like Wind Speed/Wind Clock themselves, not a property of a saved load — it is therefore excluded from preset save/load and from the load-clearing routine, exactly matching the existing treatment of the primary wind fields.</w:t>
+        <w:t>Summed over the whole flight this telescopes back to exactly the original closed-form result whenever W(x) is constant (Wind at Target unset or equal to the shooter's own reading), since ΣΔt_step and ΣstepFt/MV reduce to t_actual and x/MV respectively. When W(x) varies, this is the physically correct generalization rather than an approximation: dLag itself grows over the course of the flight as the bullet decelerates and spends more time covering each successive yard, so a given amount of crosswind exposure contributes more to total drift when it occurs during the slower, back half of the trajectory than during the fast, early part. Confirmed against the live engine: a crosswind confined to the first half of a 1000yd .308 Win flight (full value at the muzzle, tapering to calm at the target) produces materially less drift at the target than the same crosswind confined to the second half (calm at the muzzle, ramping up to full value at the target) — consistent with the long-range-shooting principle that a wind read near the target carries more weight than the same wind read near the firing line.</w:t>
+      </w:r>
+    </w:p>
+    <w:p>
+      <w:pPr>
+        <w:pStyle w:val="BodyText"/>
+      </w:pPr>
+      <w:r>
+        <w:t>Wind at Target is a standing, session-level field like Wind Speed/Wind Clock themselves, not a property of a saved load — it is therefore excluded from preset save/load and from the load-clearing routine, exactly matching the existing treatment of the primary wind fields.</w:t>
       </w:r>
     </w:p>
     <w:p>
@@ -1101,7 +1119,7 @@
         <w:t xml:space="preserve">windTargetRefYd (2026-08-31 fix): </w:t>
       </w:r>
       <w:r>
-        <w:t xml:space="preserve">frac(x) above is defined against maxYd, which several views legitimately override for their own display purposes — HUD overrides it to whatever specific distance is currently ranged, and Compare Loads' live-matched slot overrides it to the shared comparison distance. Both views clone the live params object wholesale (Object.assign against lastResults.params), so windTargetMph/windTargetClock rode along unchanged even after that fix — but frac(x) would then silently divide by the overridden maxYd instead of the range the shooter actually meant by "the target" when they entered the second reading, applying most of it far too early (or too late). windTargetRefYd is a separate field precisely to prevent that: computeTrajectory() prefers it over maxYd for frac(x)'s denominator when present, and both HUD's and Compare's live-slot params now set it explicitly to lastResults.params.maxYd — the original table's own max range — before overriding maxYd itself for their own purposes. Callers that never override maxYd in the first place (the primary calculate() path, Reticle View, non-live Compare slots) never set windTargetRefYd either, so it falls back to maxYd and nothing changes for them.</w:t>
+        <w:t>frac(x) above is defined against maxYd, which several views legitimately override for their own display purposes — HUD overrides it to whatever specific distance is currently ranged, and Compare Loads' live-matched slot overrides it to the shared comparison distance. Both views clone the live params object wholesale (Object.assign against lastResults.params), so windTargetMph/windTargetClock rode along unchanged even after that fix — but frac(x) would then silently divide by the overridden maxYd instead of the range the shooter actually meant by "the target" when they entered the second reading, applying most of it far too early (or too late). windTargetRefYd is a separate field precisely to prevent that: computeTrajectory() prefers it over maxYd for frac(x)'s denominator when present, and both HUD's and Compare's live-slot params now set it explicitly to lastResults.params.maxYd — the original table's own max range — before overriding maxYd itself for their own purposes. Callers that never override maxYd in the first place (the primary calculate() path, Reticle View, non-live Compare slots) never set windTargetRefYd either, so it falls back to maxYd and nothing changes for them.</w:t>
       </w:r>
     </w:p>
     <w:p>
@@ -1130,6 +1148,7 @@
         <w:rPr>
           <w:rStyle w:val="VerbatimChar"/>
         </w:rPr>
+        <w:lastRenderedPageBreak/>
         <w:t>Psat = 611.21 × exp[(18.678 − T/234.5) × (T/(257.14+T))]      (Arden Buck equation, T in °C)</w:t>
       </w:r>
       <w:r>
@@ -1183,10 +1202,177 @@
       </w:pPr>
       <w:bookmarkStart w:id="8" w:name="speed-of-sound-and-mach-number"/>
       <w:r>
+        <w:t>7. Speed of Sound and Mach Number</w:t>
+      </w:r>
+      <w:bookmarkEnd w:id="8"/>
+    </w:p>
+    <w:p>
+      <w:pPr>
+        <w:pStyle w:val="SourceCode"/>
+      </w:pPr>
+      <w:r>
+        <w:rPr>
+          <w:rStyle w:val="VerbatimChar"/>
+        </w:rPr>
+        <w:t>a(ft/s) = 1116.45 × √((T°C + 273.15) / 288.15)</w:t>
+      </w:r>
+    </w:p>
+    <w:p>
+      <w:pPr>
+        <w:pStyle w:val="FirstParagraph"/>
+      </w:pPr>
+      <w:r>
+        <w:t>an ideal-gas approximation referenced to standard sea-level temperature, used to convert true airspeed to Mach number for the drag-table lookup at every integration step.</w:t>
+      </w:r>
+    </w:p>
+    <w:p>
+      <w:pPr>
+        <w:pStyle w:val="Heading2"/>
+      </w:pPr>
+      <w:bookmarkStart w:id="9" w:name="X0272caef27d99d6282fc3bfc47549bd12847df0"/>
+      <w:r>
+        <w:t>8. Coriolis Effect and the Eötvös Correction</w:t>
+      </w:r>
+      <w:bookmarkEnd w:id="9"/>
+    </w:p>
+    <w:p>
+      <w:pPr>
+        <w:pStyle w:val="FirstParagraph"/>
+      </w:pPr>
+      <w:r>
+        <w:t>For long shots, the Earth’s rotation measurably deflects the trajectory. The model uses Earth’s mean angular rotation rate, Ω = 7.292115 × 10⁻⁵ rad/s, combined with the shooter’s latitude (φ) and the azimuth of the shot relative to true north (A), split into its two classically-distinguished components:</w:t>
+      </w:r>
+    </w:p>
+    <w:p>
+      <w:pPr>
+        <w:pStyle w:val="BodyText"/>
+      </w:pPr>
+      <w:r>
+        <w:rPr>
+          <w:b/>
+        </w:rPr>
+        <w:t>Eötvös effect (vertical).</w:t>
+      </w:r>
+      <w:r>
+        <w:t xml:space="preserve"> The bullet’s motion across the rotating Earth modifies its </w:t>
+      </w:r>
+      <w:r>
+        <w:rPr>
+          <w:i/>
+        </w:rPr>
+        <w:t>apparent</w:t>
+      </w:r>
+      <w:r>
+        <w:t xml:space="preserve"> gravity depending on whether it is travelling with or against the direction of Earth’s spin:</w:t>
+      </w:r>
+    </w:p>
+    <w:p>
+      <w:pPr>
+        <w:pStyle w:val="SourceCode"/>
+      </w:pPr>
+      <w:r>
+        <w:rPr>
+          <w:rStyle w:val="VerbatimChar"/>
+        </w:rPr>
+        <w:t>g_eff = g − 2Ω·cos(φ)·sin(A) × v_x</w:t>
+      </w:r>
+    </w:p>
+    <w:p>
+      <w:pPr>
+        <w:pStyle w:val="FirstParagraph"/>
+      </w:pPr>
+      <w:r>
+        <w:t>so an eastward-fired shot experiences very slightly reduced effective gravity (marginally less drop) and a westward shot the opposite, applied continuously through the integration rather than as an end-of-flight correction.</w:t>
+      </w:r>
+    </w:p>
+    <w:p>
+      <w:pPr>
+        <w:pStyle w:val="BodyText"/>
+      </w:pPr>
+      <w:r>
+        <w:rPr>
+          <w:b/>
+        </w:rPr>
+        <w:t>Horizontal Coriolis drift.</w:t>
+      </w:r>
+      <w:r>
+        <w:t xml:space="preserve"> A second, independent deflection is accumulated perpendicular to the line of fire, from the horizontal component of the Coriolis acceleration:</w:t>
+      </w:r>
+    </w:p>
+    <w:p>
+      <w:pPr>
+        <w:pStyle w:val="SourceCode"/>
+      </w:pPr>
+      <w:r>
+        <w:rPr>
+          <w:rStyle w:val="VerbatimChar"/>
+        </w:rPr>
+        <w:t>a_lateral = 2Ω·(sin(φ)·v_x − cos(φ)·cos(A)·v_y)</w:t>
+      </w:r>
+    </w:p>
+    <w:p>
+      <w:pPr>
+        <w:pStyle w:val="FirstParagraph"/>
+      </w:pPr>
+      <w:r>
+        <w:t>integrated twice (acceleration → velocity → displacement) alongside the main trajectory, so it correctly compounds over the whole time of flight rather than being approximated from a single average velocity.</w:t>
+      </w:r>
+    </w:p>
+    <w:p>
+      <w:pPr>
+        <w:pStyle w:val="BodyText"/>
+      </w:pPr>
+      <w:r>
+        <w:t>At typical air-rifle and even most rimfire/centrefire ranges these terms are extremely small; they become practically relevant mainly at longer centrefire distances, which is why latitude and azimuth are exposed as explicit, optional inputs rather than defaulted silently.</w:t>
+      </w:r>
+    </w:p>
+    <w:p>
+      <w:pPr>
+        <w:pStyle w:val="BodyText"/>
+      </w:pPr>
+      <w:r>
+        <w:t xml:space="preserve">The underlying magnitude and formula above are unchanged, but the results table presents this figure, like Wind Deflection and Spin Drift, in whichever unit — inches, cm, </w:t>
+      </w:r>
+      <w:r>
         <w:lastRenderedPageBreak/>
-        <w:t>7. Speed of Sound and Mach Number</w:t>
-      </w:r>
-      <w:bookmarkEnd w:id="8"/>
+        <w:t>MOA, or mils — the table’s own display toggle is set to, converted with the same angular-conversion formulas as Section 11, rather than being fixed to linear inches or cm regardless of the table’s other units.</w:t>
+      </w:r>
+    </w:p>
+    <w:p>
+      <w:pPr>
+        <w:pStyle w:val="Heading2"/>
+      </w:pPr>
+      <w:bookmarkStart w:id="10" w:name="spin-drift"/>
+      <w:r>
+        <w:t>9. Spin Drift</w:t>
+      </w:r>
+      <w:bookmarkEnd w:id="10"/>
+    </w:p>
+    <w:p>
+      <w:pPr>
+        <w:pStyle w:val="FirstParagraph"/>
+      </w:pPr>
+      <w:r>
+        <w:t xml:space="preserve">Spin-stabilised projectiles drift slightly to the side of the twist direction over the course of a flight, independent of any crosswind. The model uses </w:t>
+      </w:r>
+      <w:r>
+        <w:rPr>
+          <w:b/>
+        </w:rPr>
+        <w:t>Litz’s approximate spin-drift formula</w:t>
+      </w:r>
+      <w:r>
+        <w:t xml:space="preserve"> (from </w:t>
+      </w:r>
+      <w:r>
+        <w:rPr>
+          <w:i/>
+        </w:rPr>
+        <w:t>Applied Ballistics for Long Range Shooting</w:t>
+      </w:r>
+      <w:r>
+        <w:t>):</w:t>
+      </w:r>
     </w:p>
     <w:p>
       <w:pPr>
@@ -1196,7 +1382,7 @@
         <w:rPr>
           <w:rStyle w:val="VerbatimChar"/>
         </w:rPr>
-        <w:t>a(ft/s) = 1116.45 × √((T°C + 273.15) / 288.15)</w:t>
+        <w:t>SpinDrift(in) = twistDirection × 1.25 × (Sg + 1.2) × t²</w:t>
       </w:r>
     </w:p>
     <w:p>
@@ -1204,48 +1390,115 @@
         <w:pStyle w:val="FirstParagraph"/>
       </w:pPr>
       <w:r>
-        <w:t>an ideal-gas approximation referenced to standard sea-level temperature, used to convert true airspeed to Mach number for the drag-table lookup at every integration step.</w:t>
+        <w:t xml:space="preserve">where </w:t>
+      </w:r>
+      <w:r>
+        <w:rPr>
+          <w:i/>
+        </w:rPr>
+        <w:t>Sg</w:t>
+      </w:r>
+      <w:r>
+        <w:t xml:space="preserve"> is the gyroscopic stability factor (Section 10) and </w:t>
+      </w:r>
+      <w:r>
+        <w:rPr>
+          <w:i/>
+        </w:rPr>
+        <w:t>t</w:t>
+      </w:r>
+      <w:r>
+        <w:t xml:space="preserve"> is time of flight in seconds. Being a function of t², spin drift grows disproportionately at long range even though it is negligible at short range — consistent with real-world long-range shooting data.</w:t>
+      </w:r>
+    </w:p>
+    <w:p>
+      <w:pPr>
+        <w:pStyle w:val="BodyText"/>
+      </w:pPr>
+      <w:r>
+        <w:t>Total windage. Wherever the application presents a single figure to dial or hold, rather than the results table’s three separate Wind Deflection, Spin Drift, and Coriolis columns, the three lateral corrections above are summed before rounding: TotalWindage = WindDeflection + SpinDrift + Coriolis(horizontal). All three share the same sign convention (positive drifts/pushes right), so a plain sum is correct rather than a special-cased combination — each is computed in the same angular units (MOA/mils) before being added, and the sum is converted to whichever display unit is active the same way the individual figures already are. The vertical Eötvös component is not part of this sum: it is already integrated directly into Drop (Section 8), not a separate lateral figure that would need combining in. The results table’s own Wind Deflection, Spin Drift, and Coriolis columns are deliberately left as three separate figures rather than being replaced by this combined total, so a shooter can still see which of the three is contributing what; the combined total is produced only where the application hands over a single dial/hold figure for windage.</w:t>
       </w:r>
     </w:p>
     <w:p>
       <w:pPr>
         <w:pStyle w:val="Heading2"/>
       </w:pPr>
-      <w:bookmarkStart w:id="9" w:name="X0272caef27d99d6282fc3bfc47549bd12847df0"/>
-      <w:r>
-        <w:t>8. Coriolis Effect and the Eötvös Correction</w:t>
-      </w:r>
-      <w:bookmarkEnd w:id="9"/>
+      <w:bookmarkStart w:id="11" w:name="gyroscopic-stability"/>
+      <w:r>
+        <w:t>10. Gyroscopic Stability</w:t>
+      </w:r>
+      <w:bookmarkEnd w:id="11"/>
     </w:p>
     <w:p>
       <w:pPr>
         <w:pStyle w:val="FirstParagraph"/>
       </w:pPr>
       <w:r>
-        <w:t>For long shots, the Earth’s rotation measurably deflects the trajectory. The model uses Earth’s mean angular rotation rate, Ω = 7.292115 × 10⁻⁵ rad/s, combined with the shooter’s latitude (φ) and the azimuth of the shot relative to true north (A), split into its two classically-distinguished components:</w:t>
-      </w:r>
-    </w:p>
-    <w:p>
-      <w:pPr>
-        <w:pStyle w:val="BodyText"/>
-      </w:pPr>
+        <w:t xml:space="preserve">Whether a spinning projectile is adequately stabilised is estimated with </w:t>
+      </w:r>
       <w:r>
         <w:rPr>
           <w:b/>
         </w:rPr>
-        <w:t>Eötvös effect (vertical).</w:t>
-      </w:r>
-      <w:r>
-        <w:t xml:space="preserve"> The bullet’s motion across the rotating Earth modifies its </w:t>
+        <w:t>Miller’s stability formula</w:t>
+      </w:r>
+      <w:r>
+        <w:t>:</w:t>
+      </w:r>
+    </w:p>
+    <w:p>
+      <w:pPr>
+        <w:pStyle w:val="SourceCode"/>
+      </w:pPr>
+      <w:r>
+        <w:rPr>
+          <w:rStyle w:val="VerbatimChar"/>
+        </w:rPr>
+        <w:t>Sg = 30·W / (n² · d³ · l_c · (1 + l_c²) · ρ_ratio)</w:t>
+      </w:r>
+    </w:p>
+    <w:p>
+      <w:pPr>
+        <w:pStyle w:val="FirstParagraph"/>
+      </w:pPr>
+      <w:r>
+        <w:t xml:space="preserve">where </w:t>
       </w:r>
       <w:r>
         <w:rPr>
           <w:i/>
         </w:rPr>
-        <w:t>apparent</w:t>
-      </w:r>
-      <w:r>
-        <w:t xml:space="preserve"> gravity depending on whether it is travelling with or against the direction of Earth’s spin:</w:t>
+        <w:t>W</w:t>
+      </w:r>
+      <w:r>
+        <w:t xml:space="preserve"> is projectile weight in grains, </w:t>
+      </w:r>
+      <w:r>
+        <w:rPr>
+          <w:i/>
+        </w:rPr>
+        <w:t>d</w:t>
+      </w:r>
+      <w:r>
+        <w:t xml:space="preserve"> is diameter in inches, </w:t>
+      </w:r>
+      <w:r>
+        <w:rPr>
+          <w:i/>
+        </w:rPr>
+        <w:t>n</w:t>
+      </w:r>
+      <w:r>
+        <w:t xml:space="preserve"> is the twist rate expressed in calibers (twist length ÷ diameter), and </w:t>
+      </w:r>
+      <w:r>
+        <w:rPr>
+          <w:i/>
+        </w:rPr>
+        <w:t>l_c</w:t>
+      </w:r>
+      <w:r>
+        <w:t xml:space="preserve"> is the length-to-diameter ratio. The same relationship is solved in reverse to report the minimum twist rate required for a given projectile:</w:t>
       </w:r>
     </w:p>
     <w:p>
@@ -1256,7 +1509,7 @@
         <w:rPr>
           <w:rStyle w:val="VerbatimChar"/>
         </w:rPr>
-        <w:t>g_eff = g − 2Ω·cos(φ)·sin(A) × v_x</w:t>
+        <w:t>T_min = d × √(30·W·ρ_ratio / (1.5·d³·l_c·(1+l_c²)))</w:t>
       </w:r>
     </w:p>
     <w:p>
@@ -1264,21 +1517,13 @@
         <w:pStyle w:val="FirstParagraph"/>
       </w:pPr>
       <w:r>
-        <w:t>so an eastward-fired shot experiences very slightly reduced effective gravity (marginally less drop) and a westward shot the opposite, applied continuously through the integration rather than as an end-of-flight correction.</w:t>
-      </w:r>
-    </w:p>
-    <w:p>
-      <w:pPr>
-        <w:pStyle w:val="BodyText"/>
-      </w:pPr>
-      <w:r>
         <w:rPr>
           <w:b/>
         </w:rPr>
-        <w:t>Horizontal Coriolis drift.</w:t>
-      </w:r>
-      <w:r>
-        <w:t xml:space="preserve"> A second, independent deflection is accumulated perpendicular to the line of fire, from the horizontal component of the Coriolis acceleration:</w:t>
+        <w:t>Greenhill’s rule</w:t>
+      </w:r>
+      <w:r>
+        <w:t xml:space="preserve"> is also available as a simpler, independent cross-check:</w:t>
       </w:r>
     </w:p>
     <w:p>
@@ -1289,7 +1534,7 @@
         <w:rPr>
           <w:rStyle w:val="VerbatimChar"/>
         </w:rPr>
-        <w:t>a_lateral = 2Ω·(sin(φ)·v_x − cos(φ)·cos(A)·v_y)</w:t>
+        <w:t>T = C × d² / l         (C = 150 below 2700 fps muzzle velocity, 180 at or above it)</w:t>
       </w:r>
     </w:p>
     <w:p>
@@ -1297,237 +1542,17 @@
         <w:pStyle w:val="FirstParagraph"/>
       </w:pPr>
       <w:r>
-        <w:t>integrated twice (acceleration → velocity → displacement) alongside the main trajectory, so it correctly compounds over the whole time of flight rather than being approximated from a single average velocity.</w:t>
-      </w:r>
-    </w:p>
-    <w:p>
-      <w:pPr>
-        <w:pStyle w:val="BodyText"/>
-      </w:pPr>
-      <w:r>
-        <w:t>At typical air-rifle and even most rimfire/centrefire ranges these terms are extremely small; they become practically relevant mainly at longer centrefire distances, which is why latitude and azimuth are exposed as explicit, optional inputs rather than defaulted silently.</w:t>
-      </w:r>
-    </w:p>
-    <w:p>
-      <w:pPr>
-        <w:pStyle w:val="BodyText"/>
-      </w:pPr>
-      <w:r>
-        <w:t>The underlying magnitude and formula above are unchanged, but the results table presents this figure, like Wind Deflection and Spin Drift, in whichever unit — inches, cm, MOA, or mils — the table’s own display toggle is set to, converted with the same angular-conversion formulas as Section 11, rather than being fixed to linear inches or cm regardless of the table’s other units.</w:t>
-      </w:r>
-    </w:p>
-    <w:p>
-      <w:pPr>
-        <w:pStyle w:val="Heading2"/>
-      </w:pPr>
-      <w:bookmarkStart w:id="10" w:name="spin-drift"/>
-      <w:r>
-        <w:t>9. Spin Drift</w:t>
-      </w:r>
-      <w:bookmarkEnd w:id="10"/>
-    </w:p>
-    <w:p>
-      <w:pPr>
-        <w:pStyle w:val="FirstParagraph"/>
-      </w:pPr>
-      <w:r>
-        <w:t xml:space="preserve">Spin-stabilised projectiles drift slightly to the side of the twist direction over the course of a flight, independent of any crosswind. The model uses </w:t>
-      </w:r>
-      <w:r>
         <w:rPr>
           <w:b/>
         </w:rPr>
-        <w:t>Litz’s approximate spin-drift formula</w:t>
-      </w:r>
-      <w:r>
-        <w:t xml:space="preserve"> (from </w:t>
-      </w:r>
-      <w:r>
-        <w:rPr>
-          <w:i/>
-        </w:rPr>
-        <w:t>Applied Ballistics for Long Range Shooting</w:t>
-      </w:r>
-      <w:r>
-        <w:t>):</w:t>
-      </w:r>
-    </w:p>
-    <w:p>
-      <w:pPr>
-        <w:pStyle w:val="SourceCode"/>
-      </w:pPr>
-      <w:r>
-        <w:rPr>
-          <w:rStyle w:val="VerbatimChar"/>
-        </w:rPr>
-        <w:t>SpinDrift(in) = twistDirection × 1.25 × (Sg + 1.2) × t²</w:t>
-      </w:r>
-    </w:p>
-    <w:p>
-      <w:pPr>
-        <w:pStyle w:val="FirstParagraph"/>
-      </w:pPr>
+        <w:t>Shape correction factors.</w:t>
+      </w:r>
+      <w:r>
+        <w:t xml:space="preserve"> Miller’s formula implicitly assumes a roughly solid, uniform-density projectile, so it has no way to account for a boat-tail shedding mass toward the rear, or a diabolo pellet’s mostly-hollow skirt — both of which need less spin than the </w:t>
+      </w:r>
       <w:r>
         <w:lastRenderedPageBreak/>
-        <w:t xml:space="preserve">where </w:t>
-      </w:r>
-      <w:r>
-        <w:rPr>
-          <w:i/>
-        </w:rPr>
-        <w:t>Sg</w:t>
-      </w:r>
-      <w:r>
-        <w:t xml:space="preserve"> is the gyroscopic stability factor (Section 10) and </w:t>
-      </w:r>
-      <w:r>
-        <w:rPr>
-          <w:i/>
-        </w:rPr>
-        <w:t>t</w:t>
-      </w:r>
-      <w:r>
-        <w:t xml:space="preserve"> is time of flight in seconds. Being a function of t², spin drift grows disproportionately at long range even though it is negligible at short range — consistent with real-world long-range shooting data.</w:t>
-      </w:r>
-    </w:p>
-    <w:p>
-      <w:pPr>
-        <w:pStyle w:val="BodyText"/>
-      </w:pPr>
-      <w:r>
-        <w:t xml:space="preserve">Total windage. Wherever the application presents a single figure to dial or hold, rather than the results table’s three separate Wind Deflection, Spin Drift, and Coriolis columns, the three lateral corrections above are summed before rounding: TotalWindage = WindDeflection + SpinDrift + Coriolis(horizontal). All three share the same sign convention (positive drifts/pushes right), so a plain sum is correct rather than a special-cased combination — each is computed in the same angular units (MOA/mils) before being added, and the sum is converted to whichever display unit is active the same way the individual figures already are. The vertical Eötvös component is not part of this sum: it is already integrated directly into Drop (Section 8), not a separate lateral figure that would need combining in. The results table’s own Wind Deflection, Spin Drift, and Coriolis columns are deliberately left as three separate figures rather than being replaced by this combined total, so a shooter can still see which of the three is contributing what; the combined total is produced only where the application hands over a single dial/hold figure for windage.</w:t>
-      </w:r>
-    </w:p>
-    <w:p>
-      <w:pPr>
-        <w:pStyle w:val="Heading2"/>
-      </w:pPr>
-      <w:bookmarkStart w:id="11" w:name="gyroscopic-stability"/>
-      <w:r>
-        <w:t>10. Gyroscopic Stability</w:t>
-      </w:r>
-      <w:bookmarkEnd w:id="11"/>
-    </w:p>
-    <w:p>
-      <w:pPr>
-        <w:pStyle w:val="FirstParagraph"/>
-      </w:pPr>
-      <w:r>
-        <w:t xml:space="preserve">Whether a spinning projectile is adequately stabilised is estimated with </w:t>
-      </w:r>
-      <w:r>
-        <w:rPr>
-          <w:b/>
-        </w:rPr>
-        <w:t>Miller’s stability formula</w:t>
-      </w:r>
-      <w:r>
-        <w:t>:</w:t>
-      </w:r>
-    </w:p>
-    <w:p>
-      <w:pPr>
-        <w:pStyle w:val="SourceCode"/>
-      </w:pPr>
-      <w:r>
-        <w:rPr>
-          <w:rStyle w:val="VerbatimChar"/>
-        </w:rPr>
-        <w:t>Sg = 30·W / (n² · d³ · l_c · (1 + l_c²) · ρ_ratio)</w:t>
-      </w:r>
-    </w:p>
-    <w:p>
-      <w:pPr>
-        <w:pStyle w:val="FirstParagraph"/>
-      </w:pPr>
-      <w:r>
-        <w:t xml:space="preserve">where </w:t>
-      </w:r>
-      <w:r>
-        <w:rPr>
-          <w:i/>
-        </w:rPr>
-        <w:t>W</w:t>
-      </w:r>
-      <w:r>
-        <w:t xml:space="preserve"> is projectile weight in grains, </w:t>
-      </w:r>
-      <w:r>
-        <w:rPr>
-          <w:i/>
-        </w:rPr>
-        <w:t>d</w:t>
-      </w:r>
-      <w:r>
-        <w:t xml:space="preserve"> is diameter in inches, </w:t>
-      </w:r>
-      <w:r>
-        <w:rPr>
-          <w:i/>
-        </w:rPr>
-        <w:t>n</w:t>
-      </w:r>
-      <w:r>
-        <w:t xml:space="preserve"> is the twist rate expressed in calibers (twist length ÷ diameter), and </w:t>
-      </w:r>
-      <w:r>
-        <w:rPr>
-          <w:i/>
-        </w:rPr>
-        <w:t>l_c</w:t>
-      </w:r>
-      <w:r>
-        <w:t xml:space="preserve"> is the length-to-diameter ratio. The same relationship is solved in reverse to report the minimum twist rate required for a given projectile:</w:t>
-      </w:r>
-    </w:p>
-    <w:p>
-      <w:pPr>
-        <w:pStyle w:val="SourceCode"/>
-      </w:pPr>
-      <w:r>
-        <w:rPr>
-          <w:rStyle w:val="VerbatimChar"/>
-        </w:rPr>
-        <w:t>T_min = d × √(30·W·ρ_ratio / (1.5·d³·l_c·(1+l_c²)))</w:t>
-      </w:r>
-    </w:p>
-    <w:p>
-      <w:pPr>
-        <w:pStyle w:val="FirstParagraph"/>
-      </w:pPr>
-      <w:r>
-        <w:rPr>
-          <w:b/>
-        </w:rPr>
-        <w:t>Greenhill’s rule</w:t>
-      </w:r>
-      <w:r>
-        <w:t xml:space="preserve"> is also available as a simpler, independent cross-check:</w:t>
-      </w:r>
-    </w:p>
-    <w:p>
-      <w:pPr>
-        <w:pStyle w:val="SourceCode"/>
-      </w:pPr>
-      <w:r>
-        <w:rPr>
-          <w:rStyle w:val="VerbatimChar"/>
-        </w:rPr>
-        <w:t>T = C × d² / l         (C = 150 below 2700 fps muzzle velocity, 180 at or above it)</w:t>
-      </w:r>
-    </w:p>
-    <w:p>
-      <w:pPr>
-        <w:pStyle w:val="FirstParagraph"/>
-      </w:pPr>
-      <w:r>
-        <w:rPr>
-          <w:b/>
-        </w:rPr>
-        <w:t>Shape correction factors.</w:t>
-      </w:r>
-      <w:r>
-        <w:t xml:space="preserve"> Miller’s formula implicitly assumes a roughly solid, uniform-density projectile, so it has no way to account for a boat-tail shedding mass toward the rear, or a diabolo pellet’s mostly-hollow skirt — both of which need less spin than the formula would otherwise predict for the same length-to-diameter ratio. The application applies commonly-cited, community-sourced correction factors on top of the raw Miller result — explicitly documented in the source as approximate corrections, not a first-principles recalculation of the projectile’s actual moment of inertia:</w:t>
+        <w:t>formula would otherwise predict for the same length-to-diameter ratio. The application applies commonly-cited, community-sourced correction factors on top of the raw Miller result — explicitly documented in the source as approximate corrections, not a first-principles recalculation of the projectile’s actual moment of inertia:</w:t>
       </w:r>
     </w:p>
     <w:tbl>
@@ -1822,52 +1847,52 @@
         <w:pStyle w:val="FirstParagraph"/>
       </w:pPr>
       <w:r>
+        <w:t>using 7000 grains per pound and g = 32.174 ft/s² as the weight-to-mass conversion, and the standard ft·lb-to-joule constant.</w:t>
+      </w:r>
+    </w:p>
+    <w:p>
+      <w:pPr>
+        <w:pStyle w:val="BodyText"/>
+      </w:pPr>
+      <w:r>
+        <w:t>Linear drop and drift are converted to angular holdover units using the standard small-angle approximations, with a cos²(shot angle) correction applied to project the true (sloped) range onto the horizontal — the same simplification commonly known as “rifleman’s rule”:</w:t>
+      </w:r>
+    </w:p>
+    <w:p>
+      <w:pPr>
+        <w:pStyle w:val="SourceCode"/>
+      </w:pPr>
+      <w:r>
+        <w:rPr>
+          <w:rStyle w:val="VerbatimChar"/>
+        </w:rPr>
+        <w:t>MOA  = −drop(in) × cos²(angle) / (range(yd)/100 × 1.0472)</w:t>
+      </w:r>
+      <w:r>
+        <w:br/>
+      </w:r>
+      <w:r>
+        <w:rPr>
+          <w:rStyle w:val="VerbatimChar"/>
+        </w:rPr>
+        <w:t>Mils = −drop(in) × cos²(angle) / (range(yd) × 0.036)</w:t>
+      </w:r>
+    </w:p>
+    <w:p>
+      <w:pPr>
+        <w:pStyle w:val="FirstParagraph"/>
+      </w:pPr>
+      <w:r>
+        <w:t>(1.0472 in per 100 yd defines one MOA; 0.036 in per yd defines one mil — both standard reference constants.)</w:t>
+      </w:r>
+    </w:p>
+    <w:p>
+      <w:pPr>
+        <w:pStyle w:val="Heading2"/>
+      </w:pPr>
+      <w:bookmarkStart w:id="13" w:name="Xa84dc48bafbb7bc4379dc77120e2827a0e85e16"/>
+      <w:r>
         <w:lastRenderedPageBreak/>
-        <w:t>using 7000 grains per pound and g = 32.174 ft/s² as the weight-to-mass conversion, and the standard ft·lb-to-joule constant.</w:t>
-      </w:r>
-    </w:p>
-    <w:p>
-      <w:pPr>
-        <w:pStyle w:val="BodyText"/>
-      </w:pPr>
-      <w:r>
-        <w:t>Linear drop and drift are converted to angular holdover units using the standard small-angle approximations, with a cos²(shot angle) correction applied to project the true (sloped) range onto the horizontal — the same simplification commonly known as “rifleman’s rule”:</w:t>
-      </w:r>
-    </w:p>
-    <w:p>
-      <w:pPr>
-        <w:pStyle w:val="SourceCode"/>
-      </w:pPr>
-      <w:r>
-        <w:rPr>
-          <w:rStyle w:val="VerbatimChar"/>
-        </w:rPr>
-        <w:t>MOA  = −drop(in) × cos²(angle) / (range(yd)/100 × 1.0472)</w:t>
-      </w:r>
-      <w:r>
-        <w:br/>
-      </w:r>
-      <w:r>
-        <w:rPr>
-          <w:rStyle w:val="VerbatimChar"/>
-        </w:rPr>
-        <w:t>Mils = −drop(in) × cos²(angle) / (range(yd) × 0.036)</w:t>
-      </w:r>
-    </w:p>
-    <w:p>
-      <w:pPr>
-        <w:pStyle w:val="FirstParagraph"/>
-      </w:pPr>
-      <w:r>
-        <w:t>(1.0472 in per 100 yd defines one MOA; 0.036 in per yd defines one mil — both standard reference constants.)</w:t>
-      </w:r>
-    </w:p>
-    <w:p>
-      <w:pPr>
-        <w:pStyle w:val="Heading2"/>
-      </w:pPr>
-      <w:bookmarkStart w:id="13" w:name="Xa84dc48bafbb7bc4379dc77120e2827a0e85e16"/>
-      <w:r>
         <w:t>12. Trajectory Truing (Empirical BC Calibration)</w:t>
       </w:r>
       <w:bookmarkEnd w:id="13"/>
@@ -2000,25 +2025,51 @@
         <w:pStyle w:val="FirstParagraph"/>
       </w:pPr>
       <w:r>
-        <w:t xml:space="preserve">A shooter who has zeroed a rifle for one load, then switches to a different projectile without re-zeroing, often already knows from field experience how much that new load holds over or under point of aim at the zero range. Zero Offset lets that known figure be </w:t>
+        <w:t>A shooter who has zeroed a rifle for one load, then switches to a different projectile without re-zeroing, often already knows from field experience how much that new load holds over or under point of aim at the zero range. Zero Offset lets that known figure be entered directly — in mils, MOA, or clicks — and applied to the whole table, without touching the drag model at all. This correction was originally elevation-only; a second, independent field applies the identical idea to windage, covered later in this section.</w:t>
+      </w:r>
+    </w:p>
+    <w:p>
+      <w:pPr>
+        <w:pStyle w:val="BodyText"/>
+      </w:pPr>
+      <w:r>
+        <w:t>Both the elevation and windage forms of Zero Offset are deliberately distinct corrections from Trajectory Truing above, not variants of it. Truing solves for a BC multiplier so the drag model matches one observed data point, which implicitly assumes the zero itself is a true, zero-drop reference. Zero Offset does the opposite: it takes the zero as a starting point that is deliberately not a true zero, and shifts the relevant table column by a constant angular amount to match a directly known holdover.</w:t>
+      </w:r>
+    </w:p>
+    <w:p>
+      <w:pPr>
+        <w:pStyle w:val="BodyText"/>
+      </w:pPr>
+      <w:r>
+        <w:t>The elevation offset is converted once, on entry, to a single canonical mils-equivalent value, then applied as a term added to the drop calculation at every range:</w:t>
+      </w:r>
+    </w:p>
+    <w:p>
+      <w:pPr>
+        <w:pStyle w:val="SourceCode"/>
+      </w:pPr>
+      <w:r>
+        <w:rPr>
+          <w:rStyle w:val="VerbatimChar"/>
+        </w:rPr>
         <w:lastRenderedPageBreak/>
-        <w:t>entered directly — in mils, MOA, or clicks — and applied to the whole table, without touching the drag model at all. This correction was originally elevation-only; a second, independent field applies the identical idea to windage, covered later in this section.</w:t>
-      </w:r>
-    </w:p>
-    <w:p>
-      <w:pPr>
-        <w:pStyle w:val="BodyText"/>
-      </w:pPr>
-      <w:r>
-        <w:t>Both the elevation and windage forms of Zero Offset are deliberately distinct corrections from Trajectory Truing above, not variants of it. Truing solves for a BC multiplier so the drag model matches one observed data point, which implicitly assumes the zero itself is a true, zero-drop reference. Zero Offset does the opposite: it takes the zero as a starting point that is deliberately not a true zero, and shifts the relevant table column by a constant angular amount to match a directly known holdover.</w:t>
-      </w:r>
-    </w:p>
-    <w:p>
-      <w:pPr>
-        <w:pStyle w:val="BodyText"/>
-      </w:pPr>
-      <w:r>
-        <w:t>The elevation offset is converted once, on entry, to a single canonical mils-equivalent value, then applied as a term added to the drop calculation at every range:</w:t>
+        <w:t>drop(in) -= offsetMils × range(yd) × 0.036 / cos²(angle)</w:t>
+      </w:r>
+    </w:p>
+    <w:p>
+      <w:pPr>
+        <w:pStyle w:val="BodyText"/>
+      </w:pPr>
+      <w:r>
+        <w:t>Because mils and MOA are angular units, a constant angular holdover corresponds to a growing linear correction downrange rather than a fixed number of inches — the term above scales with range for exactly that reason, and divides through cos²(angle) so an inclined shot’s holdover is not distorted by the same slope correction already applied to drop (Section 11). Since the correction modifies the shared drop value every other output is derived from, the results table, chart, CSV export, Range Card view, and turret-strip graphics all reflect it automatically with no separate implementation in each; energy, velocity, windage, and spin-drift columns are untouched, since the correction is a pure holdover shift rather than a change to the physical model.</w:t>
+      </w:r>
+    </w:p>
+    <w:p>
+      <w:pPr>
+        <w:pStyle w:val="BodyText"/>
+      </w:pPr>
+      <w:r>
+        <w:t>A second, independent field — Windage Zero Offset — applies the identical idea to the windage column instead of drop, for a known left/right correction at the zero range (for example a scope that is not perfectly boresighted, or a previous zero taken in a crosswind). It has its own mils/MOA/clicks unit toggle, entirely separate from the elevation field’s, and is converted to a canonical mils-equivalent the same way before being applied:</w:t>
       </w:r>
     </w:p>
     <w:p>
@@ -2029,23 +2080,80 @@
         <w:rPr>
           <w:rStyle w:val="VerbatimChar"/>
         </w:rPr>
-        <w:t>drop(in) -= offsetMils × range(yd) × 0.036 / cos²(angle)</w:t>
-      </w:r>
-    </w:p>
-    <w:p>
-      <w:pPr>
-        <w:pStyle w:val="BodyText"/>
-      </w:pPr>
-      <w:r>
-        <w:t>Because mils and MOA are angular units, a constant angular holdover corresponds to a growing linear correction downrange rather than a fixed number of inches — the term above scales with range for exactly that reason, and divides through cos²(angle) so an inclined shot’s holdover is not distorted by the same slope correction already applied to drop (Section 11). Since the correction modifies the shared drop value every other output is derived from, the results table, chart, CSV export, Range Card view, and turret-strip graphics all reflect it automatically with no separate implementation in each; energy, velocity, windage, and spin-drift columns are untouched, since the correction is a pure holdover shift rather than a change to the physical model.</w:t>
-      </w:r>
-    </w:p>
-    <w:p>
-      <w:pPr>
-        <w:pStyle w:val="BodyText"/>
-      </w:pPr>
-      <w:r>
-        <w:t>A second, independent field — Windage Zero Offset — applies the identical idea to the windage column instead of drop, for a known left/right correction at the zero range (for example a scope that is not perfectly boresighted, or a previous zero taken in a crosswind). It has its own mils/MOA/clicks unit toggle, entirely separate from the elevation field’s, and is converted to a canonical mils-equivalent the same way before being applied:</w:t>
+        <w:t>windage(in) += offsetMils × range(yd) × 0.036 / cos²(angle)</w:t>
+      </w:r>
+    </w:p>
+    <w:p>
+      <w:pPr>
+        <w:pStyle w:val="BodyText"/>
+      </w:pPr>
+      <w:r>
+        <w:t>Two details distinguish this from the elevation term above, both a direct consequence of what the drop and windage values represent structurally. First, the sign: the drop formula above subtracts, because the downstream elevation formulas (moa, mils) already carry a leading negative sign relative to drop, so subtracting there is what makes a positive entered value read as a positive hold-up figure. The windage formulas carry no such leading negative sign, so the windage term above adds rather than subtracts — a positive entered value comes out as a positive, right-hand correction, matching the sign convention used throughout the rest of the app for Wind Deflection, Spin Drift, and Coriolis (positive = right). Second, unlike drop, windage is not already exactly zero at the zero range by construction — real crosswind deflection at a typical zero distance is normally small but not zero — so this term is simply “shift the whole windage figure by a known constant amount,” not “make the zero row read a real value instead of always zero” the way the elevation version is. The offset is applied to the same shared windage value that Wind Deflection, Spin Drift, and the horizontal Coriolis component are summed into (Section 9), before that sum is rounded — so it appears in the main results table’s Wind column, and in the combined windage figure Reticle View, HUD, and the Turret Dial’s Windage control use (see the combined-windage design note at the end of Section 9). Elevation and windage offsets are read from independent fields and applied to independent variables, so setting one has no effect on the other.</w:t>
+      </w:r>
+    </w:p>
+    <w:p>
+      <w:pPr>
+        <w:pStyle w:val="BodyText"/>
+      </w:pPr>
+      <w:r>
+        <w:t xml:space="preserve">Both fields also accept a third entry unit, clicks, alongside mils and MOA. Unlike mils and MOA — fixed ratios to each other that never change — a click’s angular size depends on the turret it represents, so clicks resolves through the same clickSizeMoa global already shared by the results table’s own clicks column and the Turret Dial (Part 3, Section 3), rather than being a third independently fixed constant: raw = clicks × clickSizeMoa (a MOA-equivalent, so this feeds directly into the same ×1.0472/3.6 conversion used for a direct MOA entry). Selecting clicks on either field reveals the same click-size selector used everywhere else in the app; choosing a size there updates clickSizeMoa globally, so the other Zero Offset field’s selector (if also showing) and the results table’s own selector all stay in agreement, since there is only ever one current click size for the </w:t>
+      </w:r>
+      <w:r>
+        <w:lastRenderedPageBreak/>
+        <w:t>whole app. This is a deliberate extension of the existing “clicks are always live, never baked” principle into an editable field rather than a read-only one: what is actually saved to a preset is the raw click count and the unit string “clicks,” not a frozen angle, so if the click-size selector is changed after saving, the same typed click count resolves to a different angle the next time Calculate runs — consistent with how the results table’s own clicks column already behaves, not a new class of behaviour introduced here.</w:t>
+      </w:r>
+    </w:p>
+    <w:p>
+      <w:pPr>
+        <w:pStyle w:val="BodyText"/>
+      </w:pPr>
+      <w:r>
+        <w:t>Which unit the Zero Offset field defaults to was originally tied to calibre — the same convention the results table itself has always used, where .177 loads default to MOA and everything else defaults to mils. A user report showed that heuristic to be the wrong signal for Zero Offset specifically: calibre says nothing about which turret is actually mounted on a given rifle, and a .308 with an MOA-turret scope or a .177 with a mil-dot scope are both real, common configurations. The fix replaces the calibre guess with a per-preset stored preference — a new angularUnit field, captured automatically the first time a preset is saved with the results table showing mils or MOA, and preferred over the calibre guess on every later load of that same preset. Saving while viewing a non-angular display mode (clicks, inches, or centimetres) neither sets nor overwrites this preference, so briefly checking click values before saving can never silently erase a preference set earlier; a preset that has never been saved on mils or MOA at all simply falls back to the original calibre-based guess, exactly as before this field existed, which keeps every preset saved prior to this change behaving identically. Both Zero Offset toggles then default to whichever unit that resolution settles on, rather than always mils.</w:t>
+      </w:r>
+    </w:p>
+    <w:p>
+      <w:pPr>
+        <w:pStyle w:val="Heading2"/>
+      </w:pPr>
+      <w:bookmarkStart w:id="15" w:name="plausibility-checks"/>
+      <w:r>
+        <w:t>14. Plausibility Checks</w:t>
+      </w:r>
+      <w:bookmarkEnd w:id="15"/>
+    </w:p>
+    <w:p>
+      <w:pPr>
+        <w:pStyle w:val="FirstParagraph"/>
+      </w:pPr>
+      <w:r>
+        <w:t xml:space="preserve">Before every calculation, entered values are checked against soft, per-discipline bounds (air rifle / rimfire / centrefire) on muzzle velocity, projectile weight, and BC (0.01–1.0 for all disciplines, the realistic range for small-arms projectiles generally). These checks are deliberately </w:t>
+      </w:r>
+      <w:r>
+        <w:rPr>
+          <w:b/>
+        </w:rPr>
+        <w:t>advisory only</w:t>
+      </w:r>
+      <w:r>
+        <w:t xml:space="preserve"> — they surface a dismissible warning (e.g. “muzzle velocity looks unusual — check fps vs m/s”) to catch likely typos or unit mix-ups, but never block or alter a calculation. This reflects a considered design choice, discussed further in Part 2.</w:t>
+      </w:r>
+    </w:p>
+    <w:p>
+      <w:pPr>
+        <w:pStyle w:val="Heading2"/>
+      </w:pPr>
+      <w:bookmarkStart w:id="16" w:name="aerodynamic-jump"/>
+      <w:r>
+        <w:t>15. Aerodynamic Jump</w:t>
+      </w:r>
+      <w:bookmarkEnd w:id="16"/>
+    </w:p>
+    <w:p>
+      <w:pPr>
+        <w:pStyle w:val="FirstParagraph"/>
+      </w:pPr>
+      <w:r>
+        <w:t>A crosswind produces a small VERTICAL deflection in addition to the horizontal effects covered in Sections 5 (Wind Deflection) and 9 (Spin Drift), via a distinct mechanism: as the bullet exits the muzzle into a crosswind, it briefly develops a small angle of attack (yaw) relative to the oncoming air; because the bullet is spinning, gyroscopic precession converts that transient yaw into a vertical velocity component within the first few calibers of travel, well before the bullet settles into its longer-term yaw-of-repose behaviour (the mechanism actually responsible for Spin Drift). The model uses Bryan Litz’s published rule-of-thumb (from “Modern Advancements in Long Range Shooting”):</w:t>
       </w:r>
     </w:p>
     <w:p>
@@ -2056,312 +2164,247 @@
         <w:rPr>
           <w:rStyle w:val="VerbatimChar"/>
         </w:rPr>
-        <w:t>windage(in) += offsetMils × range(yd) × 0.036 / cos²(angle)</w:t>
-      </w:r>
-    </w:p>
-    <w:p>
-      <w:pPr>
-        <w:pStyle w:val="BodyText"/>
-      </w:pPr>
-      <w:r>
-        <w:t>Two details distinguish this from the elevation term above, both a direct consequence of what the drop and windage values represent structurally. First, the sign: the drop formula above subtracts, because the downstream elevation formulas (moa, mils) already carry a leading negative sign relative to drop, so subtracting there is what makes a positive entered value read as a positive hold-up figure. The windage formulas carry no such leading negative sign, so the windage term above adds rather than subtracts — a positive entered value comes out as a positive, right-hand correction, matching the sign convention used throughout the rest of the app for Wind Deflection, Spin Drift, and Coriolis (positive = right). Second, unlike drop, windage is not already exactly zero at the zero range by construction — real crosswind deflection at a typical zero distance is normally small but not zero — so this term is simply “shift the whole windage figure by a known constant amount,” not “make the zero row read a real value instead of always zero” the way the elevation version is. The offset is applied to the same shared windage value that Wind Deflection, Spin Drift, and the horizontal Coriolis component are summed into (Section 9), before that sum is rounded — so it appears in the main results table’s Wind column, and in the combined windage figure Reticle View, HUD, and the Turret Dial’s Windage control use (see the combined-windage design note at the end of Section 9). Elevation and windage offsets are read from independent fields and applied to independent variables, so setting one has no effect on the other.</w:t>
-      </w:r>
-    </w:p>
-    <w:p>
-      <w:pPr>
-        <w:pStyle w:val="BodyText"/>
-      </w:pPr>
-      <w:r>
-        <w:t>Both fields also accept a third entry unit, clicks, alongside mils and MOA. Unlike mils and MOA — fixed ratios to each other that never change — a click’s angular size depends on the turret it represents, so clicks resolves through the same clickSizeMoa global already shared by the results table’s own clicks column and the Turret Dial (Part 3, Section 3), rather than being a third independently fixed constant: raw = clicks × clickSizeMoa (a MOA-equivalent, so this feeds directly into the same ×1.0472/3.6 conversion used for a direct MOA entry). Selecting clicks on either field reveals the same click-size selector used everywhere else in the app; choosing a size there updates clickSizeMoa globally, so the other Zero Offset field’s selector (if also showing) and the results table’s own selector all stay in agreement, since there is only ever one current click size for the whole app. This is a deliberate extension of the existing “clicks are always live, never baked” principle into an editable field rather than a read-only one: what is actually saved to a preset is the raw click count and the unit string “clicks,” not a frozen angle, so if the click-size selector is changed after saving, the same typed click count resolves to a different angle the next time Calculate runs — consistent with how the results table’s own clicks column already behaves, not a new class of behaviour introduced here.</w:t>
-      </w:r>
-    </w:p>
-    <w:p>
-      <w:pPr>
-        <w:pStyle w:val="BodyText"/>
-      </w:pPr>
-      <w:r>
-        <w:t xml:space="preserve">Which unit the Zero Offset field defaults to was originally tied to calibre — the same convention the results table itself has always used, where .177 loads default to MOA and everything else defaults to mils. A user report showed that heuristic to be the wrong signal for Zero Offset specifically: calibre says nothing about which turret is actually mounted on a given rifle, and a .308 with an MOA-turret scope or a .177 with a mil-dot scope are both real, common configurations. The fix replaces the calibre guess with a per-preset stored preference — a new angularUnit field, captured automatically the first time a preset is saved with the results table showing mils or MOA, and preferred over the calibre guess on every later load of that same preset. Saving while viewing a non-angular display mode (clicks, inches, or centimetres) neither sets nor overwrites this preference, so briefly checking click values before saving can never silently erase a preference set earlier; a preset that has never been saved on mils or MOA at all simply falls back to the original calibre-based guess, exactly as before this field existed, which keeps every preset saved prior to this change behaving identically. Both Zero Offset toggles then default to whichever unit that resolution settles on, rather than always mils.</w:t>
+        <w:t>Y (MOA per mph of crosswind) = 0.01·Sg − 0.0024·L + 0.032</w:t>
+      </w:r>
+    </w:p>
+    <w:p>
+      <w:pPr>
+        <w:pStyle w:val="FirstParagraph"/>
+      </w:pPr>
+      <w:r>
+        <w:t xml:space="preserve">where Sg is the gyroscopic stability factor (Section 10) and L is bullet length expressed in calibers (length ÷ diameter). The result is a fixed angular correction — constant regardless of range, since it is set by conditions at the muzzle — converted to a linear inches value that grows with range the same way the Zero Offset elevation term does </w:t>
+      </w:r>
+      <w:r>
+        <w:lastRenderedPageBreak/>
+        <w:t>(Section 13), and applied directly to Drop with the same subtraction convention: dIn −= aeroJump, where a positive aeroJump value corresponds to less drop (the bullet shoots higher).</w:t>
+      </w:r>
+    </w:p>
+    <w:p>
+      <w:pPr>
+        <w:pStyle w:val="BodyText"/>
+      </w:pPr>
+      <w:r>
+        <w:t>Direction. The sign is derived from crosswindFromRight = windMph·sin(windClock·π/6) — positive when the wind is from the shooter’s right (Wind Clock = 3, using the same origin/Kestrel convention as Section 5) — multiplied by the barrel’s twist direction. For a right-hand-twist barrel, a crosswind from the right produces a positive aerodynamic jump (the bullet shoots high); a crosswind from the left produces a negative one (shoots low). Left-hand twist reverses both cases. This direction convention was verified against published sources describing Litz’s own methodology before implementation, rather than assumed from the formula’s magnitude alone.</w:t>
+      </w:r>
+    </w:p>
+    <w:p>
+      <w:pPr>
+        <w:pStyle w:val="BodyText"/>
+      </w:pPr>
+      <w:r>
+        <w:t>Gating. Aerodynamic jump is computed only when Sg is available (diameter, length, and twist rate have all been entered — the same precondition already used for Spin Drift and Gyroscopic Stability), and is additionally suppressed for Projectile Shape = Diabolo. Litz derived and validated this formula against supersonic, conventional spitzer/boat-tail projectiles; it has no established accuracy for the slow, subsonic, waisted-pellet aerodynamics of a traditional diabolo airgun pellet, so the application reports an explicit unavailable state there rather than a number the formula was never shown to support. Flat-base and boat-tail airgun slugs, which behave aerodynamically closer to small rifle bullets, are not excluded.</w:t>
+      </w:r>
+    </w:p>
+    <w:p>
+      <w:pPr>
+        <w:pStyle w:val="BodyText"/>
+      </w:pPr>
+      <w:r>
+        <w:t>Unlike Wind Deflection and Spin Drift, aerodynamic jump deliberately does not respond to a Wind at Target reading (Section 5’s two-point wind blend) — it depends only on conditions at the muzzle, since the responsible yaw develops and precesses out within the first few calibers of flight, well before any downrange wind reading could plausibly matter. The result is reported as its own headline figure alongside Drop, so a shooter can see how much of the total elevation correction came from this specific effect, the same way the Zero Offset badge shows its own separate contribution without requiring a combined-figure display.</w:t>
       </w:r>
     </w:p>
     <w:p>
       <w:pPr>
         <w:pStyle w:val="Heading2"/>
       </w:pPr>
-      <w:bookmarkStart w:id="15" w:name="plausibility-checks"/>
-      <w:r>
-        <w:t>14. Plausibility Checks</w:t>
-      </w:r>
-      <w:bookmarkEnd w:id="15"/>
+      <w:bookmarkStart w:id="17" w:name="doppler-bc-fit"/>
+      <w:r>
+        <w:t>16. Fitting BC from Multi-Point Doppler/Velocity Data</w:t>
+      </w:r>
+      <w:bookmarkEnd w:id="17"/>
     </w:p>
     <w:p>
       <w:pPr>
         <w:pStyle w:val="FirstParagraph"/>
       </w:pPr>
       <w:r>
-        <w:t xml:space="preserve">Before every calculation, entered values are checked against soft, per-discipline bounds (air rifle / rimfire / centrefire) on muzzle velocity, projectile weight, and BC (0.01–1.0 for all disciplines, the realistic range for small-arms projectiles generally). These checks are deliberately </w:t>
-      </w:r>
-      <w:r>
-        <w:rPr>
-          <w:b/>
-        </w:rPr>
-        <w:t>advisory only</w:t>
-      </w:r>
-      <w:r>
-        <w:t xml:space="preserve"> — they surface a dismissible warning (e.g. “muzzle velocity looks unusual — check fps vs m/s”) to catch likely typos or unit mix-ups, but never block or alter a calculation. This reflects a considered design choice, discussed further in Part 2.</w:t>
+        <w:t>Section 12 solves for a BC multiplier from a single observed holdover, exactly, by binary search. A shooter with a Doppler radar chronograph (a device that measures actual velocity at many points down range from one shot, rather than only at the muzzle) can supply a much richer dataset — potentially dozens of velocity samples from a single, internally consistent shot string, all recorded under identical atmospheric conditions. This section extends the Truing concept to that case: fitting one BC multiplier against many observations at once, which — unlike the single-point case — generally cannot be satisfied exactly, so the best fit is whichever multiplier minimizes the total error across every point.</w:t>
+      </w:r>
+    </w:p>
+    <w:p>
+      <w:pPr>
+        <w:pStyle w:val="BodyText"/>
+      </w:pPr>
+      <w:r>
+        <w:t>Velocity, not holdover, is the fitted quantity. A Doppler unit measures velocity directly, and comparing predicted to observed velocity needs no zeroing or sight-in geometry at all — unlike holdover, which is downstream of the zero-solve described in Section 4. This makes velocity a cleaner regression target than reusing Section 12’s holdover-based comparison would have been.</w:t>
+      </w:r>
+    </w:p>
+    <w:p>
+      <w:pPr>
+        <w:pStyle w:val="BodyText"/>
+      </w:pPr>
+      <w:r>
+        <w:lastRenderedPageBreak/>
+        <w:t>For a trial multiplier m, the model is evaluated once via a dense (every-yard) trajectory pass with BC = baseBC × m, and each entered distance is matched to its nearest sampled yard. The objective minimized is the sum of squared velocity residuals:</w:t>
+      </w:r>
+    </w:p>
+    <w:p>
+      <w:pPr>
+        <w:pStyle w:val="SourceCode"/>
+      </w:pPr>
+      <w:r>
+        <w:rPr>
+          <w:rStyle w:val="VerbatimChar"/>
+        </w:rPr>
+        <w:t>SSE(m) = Σᵢ (v_model(dᵢ, m) − v_observedᵢ)²</w:t>
+      </w:r>
+    </w:p>
+    <w:p>
+      <w:pPr>
+        <w:pStyle w:val="BodyText"/>
+      </w:pPr>
+      <w:r>
+        <w:t>Because increasing BC monotonically reduces drag — and therefore increases predicted velocity at every downrange point — each individual residual is a monotonic function of m, making SSE(m) well-behaved (effectively unimodal) for realistic data drawn from a single physical bullet. The search first evaluates SSE at 60 evenly-spaced points across the same [0.3, 2.5] multiplier bounds used by Section 12’s single-point solve, then refines around whichever coarse sample had the lowest error using a golden-section search (40 iterations). The coarse scan is a deliberate guard: golden-section search alone only guarantees finding the true minimum when the function is unimodal across the whole search range, and real, possibly noisy multi-point data does not strictly guarantee that in principle, even though it holds in every case tested.</w:t>
+      </w:r>
+    </w:p>
+    <w:p>
+      <w:pPr>
+        <w:pStyle w:val="BodyText"/>
+      </w:pPr>
+      <w:r>
+        <w:t>Input parsing is deliberately generic rather than built against one device’s export format: pasted lines are split on commas, tabs, or whitespace, a header row or other line that does not parse as two numbers is silently skipped and counted, and the shooter chooses which column is distance and which is velocity (auto-detection was rejected — a wrong silent guess would swap two different physical quantities into the regression with no obvious symptom until the result looked implausible). The fit’s own working maximum range is extended internally to cover the farthest entered point, independent of whatever range the results table itself is currently configured to show.</w:t>
+      </w:r>
+    </w:p>
+    <w:p>
+      <w:pPr>
+        <w:pStyle w:val="BodyText"/>
+      </w:pPr>
+      <w:r>
+        <w:t>The result is reported alongside a per-point residual table (observed velocity, predicted velocity, and the difference, at every entered distance) rather than only the fitted BC value, so a shooter can judge fit quality directly and identify a misread or outlier point — the regression itself is a least-squares average and will not flag a bad point on its own, but a point sitting well outside the others’ residuals is visible immediately in the table. This method sets the same BC multiplier Section 12’s single-point Truing does; only one method’s result is ever in effect at a time, and every downstream consumer (the Results page’s Trued badge, Save-to-preset, Reset) operates on that shared multiplier with no awareness of which method produced it.</w:t>
       </w:r>
     </w:p>
     <w:p>
       <w:pPr>
         <w:pStyle w:val="Heading2"/>
       </w:pPr>
-      <w:bookmarkStart w:id="200" w:name="aerodynamic-jump"/>
-      <w:r>
-        <w:t>15. Aerodynamic Jump</w:t>
-      </w:r>
-      <w:bookmarkEnd w:id="200"/>
+      <w:bookmarkStart w:id="18" w:name="fx-chrono-import"/>
+      <w:r>
+        <w:t>17. Importing Chronograph Shot-Log Averages</w:t>
+      </w:r>
+      <w:bookmarkEnd w:id="18"/>
     </w:p>
     <w:p>
       <w:pPr>
         <w:pStyle w:val="FirstParagraph"/>
       </w:pPr>
       <w:r>
-        <w:t xml:space="preserve">A crosswind produces a small VERTICAL deflection in addition to the horizontal effects covered in Sections 5 (Wind Deflection) and 9 (Spin Drift), via a distinct mechanism: as the bullet exits the muzzle into a crosswind, it briefly develops a small angle of attack (yaw) relative to the oncoming air; because the bullet is spinning, gyroscopic precession converts that transient yaw into a vertical velocity component within the first few calibers of travel, well before the bullet settles into its longer-term yaw-of-repose behaviour (the mechanism actually responsible for Spin Drift). The model uses Bryan Litz’s published rule-of-thumb (from “Modern Advancements in Long Range Shooting”):</w:t>
-      </w:r>
-    </w:p>
-    <w:p>
-      <w:pPr>
-        <w:pStyle w:val="SourceCode"/>
-      </w:pPr>
-      <w:r>
-        <w:rPr>
-          <w:rStyle w:val="VerbatimChar"/>
-        </w:rPr>
-        <w:t>Y (MOA per mph of crosswind) = 0.01·Sg − 0.0024·L + 0.032</w:t>
-      </w:r>
+        <w:t>Section 16’s Doppler fit assumes an exported dataset that exposes velocity at many points down one shot’s flight path. This is a question about the exported log, not the underlying hardware: the FX True Ballistics Chronograph (the format currently recognised here) is itself a genuine Doppler device, measuring velocity at multiple points down range from a single shot exactly as a LabRadar does — but its own shot log does not expose that full point-by-point string. Instead it reports, for each independent shot fired, one summarised velocity and one already-computed BC estimate (labelled “T-BC(model): value” in the exported log). Many other chronographs go further still and report only muzzle velocity, with no BC of any kind. This section covers importing that shape of data — one velocity, and optionally one BC, per shot — a fundamentally simpler operation than Section 16’s regression, since there is nothing to fit.</w:t>
+      </w:r>
+    </w:p>
+    <w:p>
+      <w:pPr>
+        <w:pStyle w:val="BodyText"/>
+      </w:pPr>
+      <w:r>
+        <w:lastRenderedPageBreak/>
+        <w:t>Averaging, not fitting. Because every shot in the string already carries its own complete velocity and BC reading, the correct combination of several shots is a plain average of each quantity — exactly the reasoning already used, informally, whenever a shooter trusts the mean of several ordinary chronograph readings over any single shot. No regression, search, or residual minimisation is involved: MV̅ = (1/n)Σvᵢ and BC̅ = (1/n)ΣBCᵢ, taken over every shot the parser can read from the pasted log, whatever n happens to be.</w:t>
+      </w:r>
+    </w:p>
+    <w:p>
+      <w:pPr>
+        <w:pStyle w:val="BodyText"/>
+      </w:pPr>
+      <w:r>
+        <w:t>Parsing is tolerant by design: the full exported log — header line, weather line, declared shot count, summary statistics — can be pasted in as-is, since only lines shaped like an actual shot row (containing a numeric velocity paired with the literal “FPS” unit, and a “T-BC(model):” field followed by a numeric value) are read; everything else is ignored rather than needing to be trimmed out first. Nothing in the parser assumes a fixed number of shots — a 3-shot string and a 30-shot string are both read and averaged the same way, one row at a time. When the log’s own declared “Shot count: N” header is present, it is cross-checked against how many rows were actually parsed and readable, and a mismatch is surfaced as a warning — the most common cause being a truncated paste.</w:t>
+      </w:r>
+    </w:p>
+    <w:p>
+      <w:pPr>
+        <w:pStyle w:val="BodyText"/>
+      </w:pPr>
+      <w:r>
+        <w:t>The averaged velocity can be applied directly to Muzzle Velocity, the same as manually typing in a new value — it has no relationship to BC multiplier, Trued badge, or Save-to-preset, and needs none of that machinery. The averaged BC, by contrast, sets the same BC multiplier that Section 12’s single-point Truing and Section 16’s Doppler fit both use, and is deliberately gated: it can only be applied when every shot in the log reports the same drag model, and that model matches the Drag Model currently selected in the application. A T-BC(G1) reading is specific to the G1 reference projectile; applying it while G7 is selected would silently mix two different drag models with no obvious symptom until the resulting trajectory looked implausible, so the control is disabled rather than assumed correct.</w:t>
+      </w:r>
+    </w:p>
+    <w:p>
+      <w:pPr>
+        <w:pStyle w:val="BodyText"/>
+      </w:pPr>
+      <w:r>
+        <w:t>Per-shot detail is retained and displayed alongside the average — velocity and BC for every individual shot, with any shot whose BC estimate sits more than 15% from the average flagged for a second look — for the same reason Section 16’s residual table exists: an average alone hides whether it was built from a tight, consistent string or one contaminated by a misread or a flier.</w:t>
+      </w:r>
+    </w:p>
+    <w:p>
+      <w:pPr>
+        <w:pStyle w:val="Heading2"/>
+      </w:pPr>
+      <w:bookmarkStart w:id="19" w:name="probability-of-hit"/>
+      <w:r>
+        <w:t>18. Probability of Hit: Sensitivity, Root-Sum-Square Error Budgets, and Elliptical Hit Probability</w:t>
+      </w:r>
+      <w:bookmarkEnd w:id="19"/>
     </w:p>
     <w:p>
       <w:pPr>
         <w:pStyle w:val="FirstParagraph"/>
       </w:pPr>
       <w:r>
-        <w:t xml:space="preserve">where Sg is the gyroscopic stability factor (Section 10) and L is bullet length expressed in calibers (length ÷ diameter). The result is a fixed angular correction — constant regardless of range, since it is set by conditions at the muzzle — converted to a linear inches value that grows with range the same way the Zero Offset elevation term does (Section 13), and applied directly to Drop with the same subtraction convention: dIn −= aeroJump, where a positive aeroJump value corresponds to less drop (the bullet shoots higher).</w:t>
-      </w:r>
-    </w:p>
-    <w:p>
-      <w:pPr>
-        <w:pStyle w:val="BodyText"/>
-      </w:pPr>
-      <w:r>
-        <w:t xml:space="preserve">Direction. The sign is derived from crosswindFromRight = windMph·sin(windClock·π/6) — positive when the wind is from the shooter’s right (Wind Clock = 3, using the same origin/Kestrel convention as Section 5) — multiplied by the barrel’s twist direction. For a right-hand-twist barrel, a crosswind from the right produces a positive aerodynamic jump (the bullet shoots high); a crosswind from the left produces a negative one (shoots low). Left-hand twist reverses both cases. This direction convention was verified against published sources describing Litz’s own methodology before implementation, rather than assumed from the formula’s magnitude alone.</w:t>
-      </w:r>
-    </w:p>
-    <w:p>
-      <w:pPr>
-        <w:pStyle w:val="BodyText"/>
-      </w:pPr>
-      <w:r>
-        <w:t xml:space="preserve">Gating. Aerodynamic jump is computed only when Sg is available (diameter, length, and twist rate have all been entered — the same precondition already used for Spin Drift and Gyroscopic Stability), and is additionally suppressed for Projectile Shape = Diabolo. Litz derived and validated this formula against supersonic, conventional spitzer/boat-tail projectiles; it has no established accuracy for the slow, subsonic, waisted-pellet aerodynamics of a traditional diabolo airgun pellet, so the application reports an explicit unavailable state there rather than a number the formula was never shown to support. Flat-base and boat-tail airgun slugs, which behave aerodynamically closer to small rifle bullets, are not excluded.</w:t>
-      </w:r>
-    </w:p>
-    <w:p>
-      <w:pPr>
-        <w:pStyle w:val="BodyText"/>
-      </w:pPr>
-      <w:r>
-        <w:t xml:space="preserve">Unlike Wind Deflection and Spin Drift, aerodynamic jump deliberately does not respond to a Wind at Target reading (Section 5’s two-point wind blend) — it depends only on conditions at the muzzle, since the responsible yaw develops and precesses out within the first few calibers of flight, well before any downrange wind reading could plausibly matter. The result is reported as its own headline figure alongside Drop, so a shooter can see how much of the total elevation correction came from this specific effect, the same way the Zero Offset badge shows its own separate contribution without requiring a combined-figure display.</w:t>
-      </w:r>
-    </w:p>
-    <w:p>
-      <w:pPr>
-        <w:pStyle w:val="Heading2"/>
-      </w:pPr>
-      <w:bookmarkStart w:id="201" w:name="doppler-bc-fit"/>
-      <w:r>
-        <w:t>16. Fitting BC from Multi-Point Doppler/Velocity Data</w:t>
-      </w:r>
-      <w:bookmarkEnd w:id="201"/>
-    </w:p>
-    <w:p>
-      <w:pPr>
-        <w:pStyle w:val="FirstParagraph"/>
-      </w:pPr>
-      <w:r>
-        <w:t xml:space="preserve">Section 12 solves for a BC multiplier from a single observed holdover, exactly, by binary search. A shooter with a Doppler radar chronograph (a device that measures actual velocity at many points down range from one shot, rather than only at the muzzle) can supply a much richer dataset — potentially dozens of velocity samples from a single, internally consistent shot string, all recorded under identical atmospheric conditions. This section extends the Truing concept to that case: fitting one BC multiplier against many observations at once, which — unlike the single-point case — generally cannot be satisfied exactly, so the best fit is whichever multiplier minimizes the total error across every point.</w:t>
-      </w:r>
-    </w:p>
-    <w:p>
-      <w:pPr>
-        <w:pStyle w:val="BodyText"/>
-      </w:pPr>
-      <w:r>
-        <w:t xml:space="preserve">Velocity, not holdover, is the fitted quantity. A Doppler unit measures velocity directly, and comparing predicted to observed velocity needs no zeroing or sight-in geometry at all — unlike holdover, which is downstream of the zero-solve described in Section 4. This makes velocity a cleaner regression target than reusing Section 12’s holdover-based comparison would have been.</w:t>
-      </w:r>
-    </w:p>
-    <w:p>
-      <w:pPr>
-        <w:pStyle w:val="BodyText"/>
-      </w:pPr>
-      <w:r>
-        <w:t xml:space="preserve">For a trial multiplier m, the model is evaluated once via a dense (every-yard) trajectory pass with BC = baseBC × m, and each entered distance is matched to its nearest sampled yard. The objective minimized is the sum of squared velocity residuals:</w:t>
-      </w:r>
-    </w:p>
-    <w:p>
-      <w:pPr>
-        <w:pStyle w:val="SourceCode"/>
-      </w:pPr>
-      <w:r>
-        <w:rPr>
-          <w:rStyle w:val="VerbatimChar"/>
-        </w:rPr>
-        <w:t>SSE(m) = Σᵢ (v_model(dᵢ, m) − v_observedᵢ)²</w:t>
-      </w:r>
-    </w:p>
-    <w:p>
-      <w:pPr>
-        <w:pStyle w:val="BodyText"/>
-      </w:pPr>
-      <w:r>
-        <w:t xml:space="preserve">Because increasing BC monotonically reduces drag — and therefore increases predicted velocity at every downrange point — each individual residual is a monotonic function of m, making SSE(m) well-behaved (effectively unimodal) for realistic data drawn from a single physical bullet. The search first evaluates SSE at 60 evenly-spaced points across the same [0.3, 2.5] multiplier bounds used by Section 12’s single-point solve, then refines around whichever coarse sample had the lowest error using a golden-section search (40 iterations). The coarse scan is a deliberate guard: golden-section search alone only guarantees finding the true minimum when the function is unimodal across the whole search range, and real, possibly noisy multi-point data does not strictly guarantee that in principle, even though it holds in every case tested.</w:t>
-      </w:r>
-    </w:p>
-    <w:p>
-      <w:pPr>
-        <w:pStyle w:val="BodyText"/>
-      </w:pPr>
-      <w:r>
-        <w:t xml:space="preserve">Input parsing is deliberately generic rather than built against one device’s export format: pasted lines are split on commas, tabs, or whitespace, a header row or other line that does not parse as two numbers is silently skipped and counted, and the shooter chooses which column is distance and which is velocity (auto-detection was rejected — a wrong silent guess would swap two different physical quantities into the regression with no obvious symptom until the result looked implausible). The fit’s own working maximum range is extended internally to cover the farthest entered point, independent of whatever range the results table itself is currently configured to show.</w:t>
-      </w:r>
-    </w:p>
-    <w:p>
-      <w:pPr>
-        <w:pStyle w:val="BodyText"/>
-      </w:pPr>
-      <w:r>
-        <w:t xml:space="preserve">The result is reported alongside a per-point residual table (observed velocity, predicted velocity, and the difference, at every entered distance) rather than only the fitted BC value, so a shooter can judge fit quality directly and identify a misread or outlier point — the regression itself is a least-squares average and will not flag a bad point on its own, but a point sitting well outside the others’ residuals is visible immediately in the table. This method sets the same BC multiplier Section 12’s single-point Truing does; only one method’s result is ever in effect at a time, and every downstream consumer (the Results page’s Trued badge, Save-to-preset, Reset) operates on that shared multiplier with no awareness of which method produced it.</w:t>
-      </w:r>
-    </w:p>
-    <w:p>
-      <w:pPr>
-        <w:pStyle w:val="Heading2"/>
-      </w:pPr>
-      <w:bookmarkStart w:id="202" w:name="fx-chrono-import"/>
-      <w:r>
-        <w:t>17. Importing Chronograph Shot-Log Averages</w:t>
-      </w:r>
-      <w:bookmarkEnd w:id="202"/>
-    </w:p>
-    <w:p>
-      <w:pPr>
-        <w:pStyle w:val="FirstParagraph"/>
-      </w:pPr>
-      <w:r>
-        <w:t xml:space="preserve">Section 16’s Doppler fit assumes an exported dataset that exposes velocity at many points down one shot’s flight path. This is a question about the exported log, not the underlying hardware: the FX True Ballistics Chronograph (the format currently recognised here) is itself a genuine Doppler device, measuring velocity at multiple points down range from a single shot exactly as a LabRadar does — but its own shot log does not expose that full point-by-point string. Instead it reports, for each independent shot fired, one summarised velocity and one already-computed BC estimate (labelled “T-BC(model): value” in the exported log). Many other chronographs go further still and report only muzzle velocity, with no BC of any kind. This section covers importing that shape of data — one velocity, and optionally one BC, per shot — a fundamentally simpler operation than Section 16’s regression, since there is nothing to fit.</w:t>
-      </w:r>
-    </w:p>
-    <w:p>
-      <w:pPr>
-        <w:pStyle w:val="BodyText"/>
-      </w:pPr>
-      <w:r>
-        <w:t xml:space="preserve">Averaging, not fitting. Because every shot in the string already carries its own complete velocity and BC reading, the correct combination of several shots is a plain average of each quantity — exactly the reasoning already used, informally, whenever a shooter trusts the mean of several ordinary chronograph readings over any single shot. No regression, search, or residual minimisation is involved: MV̅ = (1/n)Σvᵢ and BC̅ = (1/n)ΣBCᵢ, taken over every shot the parser can read from the pasted log, whatever n happens to be.</w:t>
-      </w:r>
-    </w:p>
-    <w:p>
-      <w:pPr>
-        <w:pStyle w:val="BodyText"/>
-      </w:pPr>
-      <w:r>
-        <w:t xml:space="preserve">Parsing is tolerant by design: the full exported log — header line, weather line, declared shot count, summary statistics — can be pasted in as-is, since only lines shaped like an actual shot row (containing a numeric velocity paired with the literal “FPS” unit, and a “T-BC(model):” field followed by a numeric value) are read; everything else is ignored rather than needing to be trimmed out first. Nothing in the parser assumes a fixed number of shots — a 3-shot string and a 30-shot string are both read and averaged the same way, one row at a time. When the log’s own declared “Shot count: N” header is present, it is cross-checked against how many rows were actually parsed and readable, and a mismatch is surfaced as a warning — the most common cause being a truncated paste.</w:t>
-      </w:r>
-    </w:p>
-    <w:p>
-      <w:pPr>
-        <w:pStyle w:val="BodyText"/>
-      </w:pPr>
-      <w:r>
-        <w:t xml:space="preserve">The averaged velocity can be applied directly to Muzzle Velocity, the same as manually typing in a new value — it has no relationship to BC multiplier, Trued badge, or Save-to-preset, and needs none of that machinery. The averaged BC, by contrast, sets the same BC multiplier that Section 12’s single-point Truing and Section 16’s Doppler fit both use, and is deliberately gated: it can only be applied when every shot in the log reports the same drag model, and that model matches the Drag Model currently selected in the application. A T-BC(G1) reading is specific to the G1 reference projectile; applying it while G7 is selected would silently mix two different drag models with no obvious symptom until the resulting trajectory looked implausible, so the control is disabled rather than assumed correct.</w:t>
-      </w:r>
-    </w:p>
-    <w:p>
-      <w:pPr>
-        <w:pStyle w:val="BodyText"/>
-      </w:pPr>
-      <w:r>
-        <w:t xml:space="preserve">Per-shot detail is retained and displayed alongside the average — velocity and BC for every individual shot, with any shot whose BC estimate sits more than 15% from the average flagged for a second look — for the same reason Section 16’s residual table exists: an average alone hides whether it was built from a tight, consistent string or one contaminated by a misread or a flier.</w:t>
-      </w:r>
-    </w:p>
-    <w:p>
-      <w:pPr>
-        <w:pStyle w:val="Heading2"/>
-      </w:pPr>
-      <w:bookmarkStart w:id="300" w:name="probability-of-hit"/>
-      <w:r>
-        <w:t>18. Probability of Hit: Sensitivity, Root-Sum-Square Error Budgets, and Elliptical Hit Probability</w:t>
-      </w:r>
-      <w:bookmarkEnd w:id="300"/>
-    </w:p>
-    <w:p>
-      <w:pPr>
-        <w:pStyle w:val="FirstParagraph"/>
-      </w:pPr>
-      <w:r>
-        <w:t xml:space="preserve">Every figure this application reports elsewhere — drop, windage, energy — is a single point estimate: the trajectory a load would follow if every input were known exactly. In practice a shooter never has that. The wind call is a guess, however good; the load’s muzzle velocity varies shot to shot; the rifle itself groups to some finite size; and the shooter’s own hold and trigger control add a further, genuinely random, dispersion. Probability of Hit turns those four separate uncertainties into one number: given a target of a stated size at a stated range, how likely is a hit? This section covers how each source is quantified, how they are combined, and how the resulting figure is turned into an actual probability against a circular target.</w:t>
-      </w:r>
-    </w:p>
-    <w:p>
-      <w:pPr>
-        <w:pStyle w:val="BodyText"/>
-      </w:pPr>
-      <w:r>
-        <w:t xml:space="preserve">Two of the four sources — wind-call uncertainty and muzzle-velocity spread (“velocity SD”) — are quantified by finite-difference sensitivity against the same computeTrajectory() engine every other page in the application calls, rather than by any closed-form formula. For each source, the relevant input (wind speed or muzzle velocity) is nudged by plus and minus its own one-sigma figure around whatever baseline the page is currently showing, the trajectory is recomputed at the selected range for each nudge, and the resulting shift in Drop and in total windage (crosswind drift + spin drift + Coriolis, the same combined figure Section 11 and the HUD/Reticle views already use) is measured against the unperturbed baseline. The two one-sided shifts are averaged (a central difference) into a single one-sigma linear dispersion, in inches, for that source — separately for elevation and for windage, since a given source generally does not affect both axes equally. Recomputing the full trajectory for each nudge, rather than approximating from the baseline table's own numbers, keeps this consistent with every other override in the application: wind and velocity both have second-order effects (via time of flight and airspeed-dependent drag) that a naive linear scaling would miss.</w:t>
-      </w:r>
-    </w:p>
-    <w:p>
-      <w:pPr>
-        <w:pStyle w:val="BodyText"/>
-      </w:pPr>
-      <w:r>
-        <w:t xml:space="preserve">Velocity SD — this load’s own round-to-round muzzle-velocity spread — cannot be derived from anything else already in the application: there is no formula connecting ballistic coefficient, weight, velocity, or drag model to an empirical shot-to-shot spread, since it depends on things (powder charge consistency, primer, case volume, or airgun valve/hammer-spring behaviour) the physics engine has no visibility into. It therefore starts as a rough manual placeholder (10fps) and is only ever replaced by a measured figure once a chronograph log of two or more shots is read on the Trajectory Truing tab (Section 17) and explicitly applied — at which point it is both relabelled “from log” and computed as the ordinary sample standard deviation, σ = √(Σ(vi − v̄)² / (n−1)), over the parsed shot velocities. Editing the figure by hand afterwards reverts the label back to “manual,” so a stale, no-longer-current log reading can never keep being presented as measured. Wind-call uncertainty has no equivalent measured path — it is inherently a statement about the shooter’s own confidence in a single wind reading, not a property of the rifle or ammunition — and is always a manual entry.</w:t>
-      </w:r>
-    </w:p>
-    <w:p>
-      <w:pPr>
-        <w:pStyle w:val="BodyText"/>
-      </w:pPr>
-      <w:r>
-        <w:t xml:space="preserve">The remaining two sources — rifle mechanical precision (group size) and shooter proficiency — are entered directly as angular dispersion figures rather than run through computeTrajectory() at all, since both already describe an angular spread rather than a response to some other physical input. Shooter proficiency is a single global setting shared across every rifle and load — by explicit design decision it describes the shooter, not any one firearm, so it is never tied to a preset and can be adjusted at any time. Rifle group size, in contrast, is a property of a specific rifle-and-ammunition combination and is saved per-preset, alongside BC and weight. Both are entered through the identical mechanism, directly in mils or MOA, or as a linear group — inches or centimetres — measured at a stated distance, converted to MOA by MOA = inches ÷ (yards × 0.010472), the same inches-per-100-yards-per-MOA relationship computeTrajectory()’s own moa/mils row fields are built from (Section 11), just solved for a standalone measurement rather than a trajectory row. Whichever unit is used, the resulting MOA figure is converted to a linear one-sigma dispersion at the selected range by inches = MOA × (range⁄100) × 1.0472, and applied identically to both the elevation and the windage axis — a deliberate simplifying assumption that a rifle’s mechanical group and a shooter’s own hold are each roughly isotropic (equally dispersed in every direction), rather than preferentially wider on one axis. Both figures are treated as one-sigma (standard-deviation) dispersion radii, not as extreme spread (the diameter of an observed group) — a shooter working from a group measured as extreme spread should convert before entering it here, and this distinction is called out in the in-app help text rather than silently assumed.</w:t>
-      </w:r>
-    </w:p>
-    <w:p>
-      <w:pPr>
-        <w:pStyle w:val="BodyText"/>
-      </w:pPr>
-      <w:r>
-        <w:t xml:space="preserve">All four one-sigma figures — velocity-SD sensitivity, wind-uncertainty sensitivity, rifle group size, and shooter proficiency — are combined separately for the elevation axis and the windage axis by root-sum-square: σ = √(σ₁² + σ₂² + σ₃² + σ₄²). This is the standard treatment for combining independent sources of uncertainty — the same reasoning used to combine independent measurement uncertainties in any physical error budget — and is correct precisely to the extent the four sources are actually independent of one another, which is treated here as a reasonable working assumption rather than something separately verified. The result is one elevation sigma and one windage sigma, generally unequal, describing an elliptical (not circular) impact-point dispersion pattern at the selected range.</w:t>
-      </w:r>
-    </w:p>
-    <w:p>
-      <w:pPr>
-        <w:pStyle w:val="BodyText"/>
-      </w:pPr>
-      <w:r>
-        <w:t xml:space="preserve">Turning that elliptical dispersion into an actual hit probability against a circular target has no simple closed form. The one case that does — an isotropic (circular) dispersion, σelevation = σwindage = σ — reduces to the Rayleigh cumulative distribution function, P = 1 − exp(−R² ⁄ (2σ²)), where R is the target radius; this is the formula the simpler circular-dispersion-only case (and many published field-target probability tools) use. Because wind and velocity sensitivity generally differ between the elevation and windage axes, the general case here is elliptical rather than circular, and is instead evaluated by direct numerical integration of the (uncorrelated) bivariate-normal impact-point density over the target disk: the disk is gridded into a fine Cartesian mesh (220 divisions across the diameter, clipped to the circle on each row), the density at each cell’s centre is evaluated as the product of two independent one-dimensional normal densities (one per axis, using each axis’s own sigma), and the weighted sum over every cell inside the disk gives the probability. This numerical approach was cross-checked against the closed-form Rayleigh result for the isotropic special case (σelevation = σwindage) across several sigma/radius combinations, agreeing to within 0.5%, before being relied on for the general elliptical case that has no closed form to check against.</w:t>
-      </w:r>
-    </w:p>
-    <w:p>
-      <w:pPr>
-        <w:pStyle w:val="BodyText"/>
-      </w:pPr>
-      <w:r>
-        <w:t xml:space="preserve">Three simplifications are deliberate, documented scope limits for this first version rather than oversights. First, the target is always treated as a single circular-equivalent diameter, even for a target that is not actually circular — the same convention the reference field-target tools this feature was modelled on use, and the more mathematically tractable case besides (an axis-aligned rectangular target would in fact reduce to two independent one-dimensional normal CDF lookups, a simpler case than the circular one implemented here). Second, range-estimation error and atmospheric uncertainty are not modelled at all: nothing already in the application can honestly source either figure yet (there is no rangefinder integration, and atmospheric readings are taken as entered, not as uncertain), and published breakdowns of comparable tools show both contributing a small fraction of the total error budget under typical conditions — so their omission is judged an acceptable, honestly-disclosed gap rather than a silently wrong number dressed up as complete. Third, this is a single static probability for the conditions entered, not a live, continuously-updated figure tracking a shooter’s hold in real time, and there is no Monte-Carlo scatter-plot visualisation of the underlying dispersion — both reasonable directions for a future version, but neither essential to a first, honestly-scoped release.</w:t>
-      </w:r>
-    </w:p>
-    <w:p>
-      <w:pPr>
-        <w:pStyle w:val="BodyText"/>
-      </w:pPr>
-      <w:r>
-        <w:t xml:space="preserve">A small circular graphic accompanies the headline percentage, plotting a random sample of simulated impact points against the selected target — drawn from the same elevation and windage sigmas by the standard Box-Muller transform, purely as a visual aid rather than as a second, independently-computed figure. This is a deliberate, documented distinction: the headline percentage comes from phHitProbability()'s exact numerical integration, while a small random sample (24 points) will not always land inside the target ring in precisely the same proportion the analytic figure states, simply from ordinary sampling variance at that sample size. Rather than compute and display a second, sample-based percentage that could occasionally disagree with the analytically correct one — a source of confusion this project's own transparency-about-approximations principle (Part 2) argues against — the graphic is captioned as illustrative only, and carries no percentage readout of its own.</w:t>
+        <w:t>Every figure this application reports elsewhere — drop, windage, energy — is a single point estimate: the trajectory a load would follow if every input were known exactly. In practice a shooter never has that. The wind call is a guess, however good; the load’s muzzle velocity varies shot to shot; the rifle itself groups to some finite size; and the shooter’s own hold and trigger control add a further, genuinely random, dispersion. Probability of Hit turns those four separate uncertainties into one number: given a target of a stated size at a stated range, how likely is a hit? This section covers how each source is quantified, how they are combined, and how the resulting figure is turned into an actual probability against a circular target.</w:t>
+      </w:r>
+    </w:p>
+    <w:p>
+      <w:pPr>
+        <w:pStyle w:val="BodyText"/>
+      </w:pPr>
+      <w:r>
+        <w:t xml:space="preserve">Two of the four sources — wind-call uncertainty and muzzle-velocity spread (“velocity SD”) — are quantified by finite-difference sensitivity against the same </w:t>
+      </w:r>
+      <w:r>
+        <w:lastRenderedPageBreak/>
+        <w:t>computeTrajectory() engine every other page in the application calls, rather than by any closed-form formula. For each source, the relevant input (wind speed or muzzle velocity) is nudged by plus and minus its own one-sigma figure around whatever baseline the page is currently showing, the trajectory is recomputed at the selected range for each nudge, and the resulting shift in Drop and in total windage (crosswind drift + spin drift + Coriolis, the same combined figure Section 11 and the HUD/Reticle views already use) is measured against the unperturbed baseline. The two one-sided shifts are averaged (a central difference) into a single one-sigma linear dispersion, in inches, for that source — separately for elevation and for windage, since a given source generally does not affect both axes equally. Recomputing the full trajectory for each nudge, rather than approximating from the baseline table's own numbers, keeps this consistent with every other override in the application: wind and velocity both have second-order effects (via time of flight and airspeed-dependent drag) that a naive linear scaling would miss.</w:t>
+      </w:r>
+    </w:p>
+    <w:p>
+      <w:pPr>
+        <w:pStyle w:val="BodyText"/>
+      </w:pPr>
+      <w:r>
+        <w:t>Velocity SD — this load’s own round-to-round muzzle-velocity spread — cannot be derived from anything else already in the application: there is no formula connecting ballistic coefficient, weight, velocity, or drag model to an empirical shot-to-shot spread, since it depends on things (powder charge consistency, primer, case volume, or airgun valve/hammer-spring behaviour) the physics engine has no visibility into. It therefore starts as a rough manual placeholder (10fps) and is only ever replaced by a measured figure once a chronograph log of two or more shots is read on the Trajectory Truing tab (Section 17) and explicitly applied — at which point it is both relabelled “from log” and computed as the ordinary sample standard deviation, σ = √(Σ(vi − v̄)² / (n−1)), over the parsed shot velocities. Editing the figure by hand afterwards reverts the label back to “manual,” so a stale, no-longer-current log reading can never keep being presented as measured. Wind-call uncertainty has no equivalent measured path — it is inherently a statement about the shooter’s own confidence in a single wind reading, not a property of the rifle or ammunition — and is always a manual entry.</w:t>
+      </w:r>
+    </w:p>
+    <w:p>
+      <w:pPr>
+        <w:pStyle w:val="BodyText"/>
+      </w:pPr>
+      <w:r>
+        <w:t xml:space="preserve">The remaining two sources — rifle mechanical precision (group size) and shooter proficiency — are entered directly as angular dispersion figures rather than run through computeTrajectory() at all, since both already describe an angular spread rather than a response to some other physical input. Shooter proficiency is a single global setting shared across every rifle and load — by explicit design decision it describes the shooter, not any one firearm, so it is never tied to a preset and can be adjusted at any time. Rifle group size, in contrast, is a property of a specific rifle-and-ammunition combination and is saved per-preset, alongside BC and weight. Both are entered through the identical mechanism, directly in mils or MOA, or as a linear group — inches or centimetres — measured at a stated distance, converted to MOA by MOA = inches ÷ (yards × 0.010472), the same inches-per-100-yards-per-MOA relationship computeTrajectory()’s own moa/mils row fields are built from (Section 11), just solved for a standalone measurement rather than a trajectory row. Whichever unit is used, the resulting MOA figure is converted to a linear one-sigma dispersion at the selected range by inches = MOA × (range⁄100) × 1.0472, and applied identically to both the elevation and the windage axis — a deliberate simplifying assumption that a rifle’s mechanical group and a shooter’s own hold are each roughly isotropic (equally dispersed in every direction), rather than preferentially wider on one axis. Both figures are treated as one-sigma (standard-deviation) dispersion radii, not as extreme spread (the diameter of an observed group) — a shooter working from a group measured as extreme spread </w:t>
+      </w:r>
+      <w:r>
+        <w:lastRenderedPageBreak/>
+        <w:t>should convert before entering it here, and this distinction is called out in the in-app help text rather than silently assumed.</w:t>
+      </w:r>
+    </w:p>
+    <w:p>
+      <w:pPr>
+        <w:pStyle w:val="BodyText"/>
+      </w:pPr>
+      <w:r>
+        <w:t>All four one-sigma figures — velocity-SD sensitivity, wind-uncertainty sensitivity, rifle group size, and shooter proficiency — are combined separately for the elevation axis and the windage axis by root-sum-square: σ = √(σ₁² + σ₂² + σ₃² + σ₄²). This is the standard treatment for combining independent sources of uncertainty — the same reasoning used to combine independent measurement uncertainties in any physical error budget — and is correct precisely to the extent the four sources are actually independent of one another, which is treated here as a reasonable working assumption rather than something separately verified. The result is one elevation sigma and one windage sigma, generally unequal, describing an elliptical (not circular) impact-point dispersion pattern at the selected range.</w:t>
+      </w:r>
+    </w:p>
+    <w:p>
+      <w:pPr>
+        <w:pStyle w:val="BodyText"/>
+      </w:pPr>
+      <w:r>
+        <w:t>Turning that elliptical dispersion into an actual hit probability against a circular target has no simple closed form. The one case that does — an isotropic (circular) dispersion, σelevation = σwindage = σ — reduces to the Rayleigh cumulative distribution function, P = 1 − exp(−R² ⁄ (2σ²)), where R is the target radius; this is the formula the simpler circular-dispersion-only case (and many published field-target probability tools) use. Because wind and velocity sensitivity generally differ between the elevation and windage axes, the general case here is elliptical rather than circular, and is instead evaluated by direct numerical integration of the (uncorrelated) bivariate-normal impact-point density over the target disk: the disk is gridded into a fine Cartesian mesh (220 divisions across the diameter, clipped to the circle on each row), the density at each cell’s centre is evaluated as the product of two independent one-dimensional normal densities (one per axis, using each axis’s own sigma), and the weighted sum over every cell inside the disk gives the probability. This numerical approach was cross-checked against the closed-form Rayleigh result for the isotropic special case (σelevation = σwindage) across several sigma/radius combinations, agreeing to within 0.5%, before being relied on for the general elliptical case that has no closed form to check against.</w:t>
+      </w:r>
+    </w:p>
+    <w:p>
+      <w:pPr>
+        <w:pStyle w:val="BodyText"/>
+      </w:pPr>
+      <w:r>
+        <w:t>Three simplifications are deliberate, documented scope limits for this first version rather than oversights. First, the target is always treated as a single circular-equivalent diameter, even for a target that is not actually circular — the same convention the reference field-target tools this feature was modelled on use, and the more mathematically tractable case besides (an axis-aligned rectangular target would in fact reduce to two independent one-dimensional normal CDF lookups, a simpler case than the circular one implemented here). Second, range-estimation error and atmospheric uncertainty are not modelled at all: nothing already in the application can honestly source either figure yet (there is no rangefinder integration, and atmospheric readings are taken as entered, not as uncertain), and published breakdowns of comparable tools show both contributing a small fraction of the total error budget under typical conditions — so their omission is judged an acceptable, honestly-disclosed gap rather than a silently wrong number dressed up as complete. Third, this is a single static probability for the conditions entered, not a live, continuously-updated figure tracking a shooter’s hold in real time, and there is no Monte-Carlo scatter-plot visualisation of the underlying dispersion — both reasonable directions for a future version, but neither essential to a first, honestly-scoped release.</w:t>
+      </w:r>
+    </w:p>
+    <w:p>
+      <w:pPr>
+        <w:pStyle w:val="BodyText"/>
+      </w:pPr>
+      <w:r>
+        <w:lastRenderedPageBreak/>
+        <w:t>A small circular graphic accompanies the headline percentage, plotting a random sample of simulated impact points against the selected target — drawn from the same elevation and windage sigmas by the standard Box-Muller transform, purely as a visual aid rather than as a second, independently-computed figure. This is a deliberate, documented distinction: the headline percentage comes from phHitProbability()'s exact numerical integration, while a small random sample (24 points) will not always land inside the target ring in precisely the same proportion the analytic figure states, simply from ordinary sampling variance at that sample size. Rather than compute and display a second, sample-based percentage that could occasionally disagree with the analytically correct one — a source of confusion this project's own transparency-about-approximations principle (Part 2) argues against — the graphic is captioned as illustrative only, and carries no percentage readout of its own.</w:t>
       </w:r>
     </w:p>
     <w:p>
@@ -2421,7 +2464,7 @@
               </wp:inline>
             </w:drawing>
           </mc:Choice>
-          <mc:Fallback>
+          <mc:Fallback xmlns:w16cei="http://schemas.microsoft.com/office/word/2026/wordml/cei">
             <w:pict>
               <v:rect w14:anchorId="5013429C" id="Horizontal Line 2" o:spid="_x0000_s1026" style="width:468pt;height:1.1pt;visibility:visible;mso-wrap-style:square;mso-left-percent:-10001;mso-top-percent:-10001;mso-position-horizontal:absolute;mso-position-horizontal-relative:char;mso-position-vertical:absolute;mso-position-vertical-relative:line;mso-left-percent:-10001;mso-top-percent:-10001;v-text-anchor:top" o:gfxdata="UEsDBBQABgAIAAAAIQC2gziS/gAAAOEBAAATAAAAW0NvbnRlbnRfVHlwZXNdLnhtbJSRQU7DMBBF 90jcwfIWJU67QAgl6YK0S0CoHGBkTxKLZGx5TGhvj5O2G0SRWNoz/78nu9wcxkFMGNg6quQqL6RA 0s5Y6ir5vt9lD1JwBDIwOMJKHpHlpr69KfdHjyxSmriSfYz+USnWPY7AufNIadK6MEJMx9ApD/oD OlTrorhX2lFEilmcO2RdNtjC5xDF9pCuTyYBB5bi6bQ4syoJ3g9WQ0ymaiLzg5KdCXlKLjvcW893 SUOqXwnz5DrgnHtJTxOsQfEKIT7DmDSUCaxw7Rqn8787ZsmRM9e2VmPeBN4uqYvTtW7jvijg9N/y JsXecLq0q+WD6m8AAAD//wMAUEsDBBQABgAIAAAAIQA4/SH/1gAAAJQBAAALAAAAX3JlbHMvLnJl bHOkkMFqwzAMhu+DvYPRfXGawxijTi+j0GvpHsDYimMaW0Yy2fr2M4PBMnrbUb/Q94l/f/hMi1qR JVI2sOt6UJgd+ZiDgffL8ekFlFSbvV0oo4EbChzGx4f9GRdb25HMsYhqlCwG5lrLq9biZkxWOiqY 22YiTra2kYMu1l1tQD30/bPm3wwYN0x18gb45AdQl1tp5j/sFB2T0FQ7R0nTNEV3j6o9feQzro1i OWA14Fm+Q8a1a8+Bvu/d/dMb2JY5uiPbhG/ktn4cqGU/er3pcvwCAAD//wMAUEsDBBQABgAIAAAA IQB2Bga0KQIAAD8EAAAOAAAAZHJzL2Uyb0RvYy54bWysU8Fu2zAMvQ/YPwi6L07SpG2MOEWRtsOA bivW7AMUWbaFSaJGKXGyry+lpGm23Yb5YJAi9fT4SM5vdtawrcKgwVV8NBhyppyEWru24t9XDx+u OQtRuFoYcKriexX4zeL9u3nvSzWGDkytkBGIC2XvK97F6MuiCLJTVoQBeOUo2ABaEcnFtqhR9IRu TTEeDi+LHrD2CFKFQKd3hyBfZPymUTJ+bZqgIjMVJ24x/zH/1+lfLOaibFH4TssjDfEPLKzQjh49 Qd2JKNgG9V9QVkuEAE0cSLAFNI2WKtdA1YyGf1Tz3Amvci0kTvAnmcL/g5Vfts/+CRP14B9B/gjM wTcgnUacrGUnXKtugychj0f3tY5PoF0kFuc5iNB3StS/H+cSVntPrc/JK7WLCSG5pH3R+1CeOCQn EBu27j9DTVfEJkKWddegTRxJMLbL3dufukeITNLhdDa5uBxSkyXFRhezq9zdQpSvlz2G+FGBZcmo OFJNGVxsH0NMZET5mpLecvCgjckDYhzrKz6bjqf5QgCj6xTMsmG7XhpkW5FGLH+5MhL0PM3qSINu tK349SlJlEmxe1fnV6LQ5mATE+OO6iRB0jiHcg31nsTB1B0qk7aOjA7wF2c9TXDFw8+NQMWZ+eSo C7PRZJJGPjuT6dWYHDyPrM8jwkmCqnjk7GAu42FNNh512+WGHVS5paY0Ogv2xupIlqY063jcqLQG 537Oetv7xQsAAAD//wMAUEsDBBQABgAIAAAAIQAvqYUv3AAAAAgBAAAPAAAAZHJzL2Rvd25yZXYu eG1sTI/NTsMwEITvSLyDtUjcqEMQFU3jVOGn10oUJMrNjRc7aryOYrcJb8/CpVxGGo12dr5yNflO nHCIbSAFt7MMBFITTEtWwfvb+uYBREyajO4CoYJvjLCqLi9KXZgw0iuetskKLqFYaAUupb6QMjYO vY6z0CNx9hUGrxPbwUoz6JHLfSfzLJtLr1viD073+OSwOWyPXsFL/7mp722U9Udyu0N4HNduY5W6 vpqelyz1EkTCKZ0v4JeB90PFw/bhSCaKTgHTpD/lbHE3Z7tXkOcgq1L+B6h+AAAA//8DAFBLAQIt ABQABgAIAAAAIQC2gziS/gAAAOEBAAATAAAAAAAAAAAAAAAAAAAAAABbQ29udGVudF9UeXBlc10u eG1sUEsBAi0AFAAGAAgAAAAhADj9If/WAAAAlAEAAAsAAAAAAAAAAAAAAAAALwEAAF9yZWxzLy5y ZWxzUEsBAi0AFAAGAAgAAAAhAHYGBrQpAgAAPwQAAA4AAAAAAAAAAAAAAAAALgIAAGRycy9lMm9E b2MueG1sUEsBAi0AFAAGAAgAAAAhAC+phS/cAAAACAEAAA8AAAAAAAAAAAAAAAAAgwQAAGRycy9k b3ducmV2LnhtbFBLBQYAAAAABAAEAPMAAACMBQAAAAA= " filled="f">
                 <o:lock v:ext="edit" rotation="t" aspectratio="t" verticies="t" text="t" shapetype="t"/>
@@ -2436,21 +2479,21 @@
       <w:pPr>
         <w:pStyle w:val="Heading1"/>
       </w:pPr>
-      <w:bookmarkStart w:id="16" w:name="part-2-design-methodology"/>
+      <w:bookmarkStart w:id="20" w:name="part-2-design-methodology"/>
       <w:r>
         <w:t>Part 2 — Design Methodology</w:t>
       </w:r>
-      <w:bookmarkEnd w:id="16"/>
+      <w:bookmarkEnd w:id="20"/>
     </w:p>
     <w:p>
       <w:pPr>
         <w:pStyle w:val="Heading2"/>
       </w:pPr>
-      <w:bookmarkStart w:id="17" w:name="single-file-zero-dependency-architecture"/>
+      <w:bookmarkStart w:id="21" w:name="single-file-zero-dependency-architecture"/>
       <w:r>
         <w:t>1. Single-File, Zero-Dependency Architecture</w:t>
       </w:r>
-      <w:bookmarkEnd w:id="17"/>
+      <w:bookmarkEnd w:id="21"/>
     </w:p>
     <w:p>
       <w:pPr>
@@ -2465,333 +2508,335 @@
         <w:pStyle w:val="BodyText"/>
       </w:pPr>
       <w:r>
-        <w:t xml:space="preserve">This constraint was tested directly when the user asked whether the Range Card could integrate with an Apple Watch. watchOS has no general-purpose web browser, so there is no way for a device to load the application directly, and building a companion watch app or a backend sync service would have meant abandoning the single-file, server-free model rather than working within it. The resolution kept the constraint intact: a “Share” button was added to the Range Card using the standard Web Share API, handing the currently displayed range/holdover data to the native iOS/macOS share sheet as plain text, which the user can then route to Notes, Reminders, or a Shortcut — several of which already sync to and display on a paired Watch without the application needing to know anything about watchOS at all. A clipboard-copy fallback covers browsers without share-sheet support, so the button degrades gracefully rather than failing silently. A follow-up report showed one concrete cost of that architectural choice: on macOS, sharing to Notes produced an empty note with only a link back to the application instead of the range text, because Safari’s share sheet — invoked from a regular browser tab rather than an installed web app — also offers the current page itself as a shareable item, and Notes’ share extension preferred that page-link item over the supplied text when both a title and text were present with no url. This is a documented WebKit behaviour, not something the application controls; the mitigation was to stop supplying a title and share text alone, the combination most consistently reported to avoid the substitution, with the pre-existing clipboard fallback remaining available if a target app still prefers a link card.</w:t>
-      </w:r>
-    </w:p>
-    <w:p>
-      <w:pPr>
-        <w:pStyle w:val="BodyText"/>
-      </w:pPr>
-      <w:r>
-        <w:t xml:space="preserve">A later refinement extended the Range Card with a wind-correction reference, prompted by a design question about whether wind should be part of a printed range card at all. Unlike elevation holdover, which is deterministic for a given rifle/load/zero and therefore safe to state as a single static number, wind correction on this application depends on a single wind-speed-and-direction input entered before Calculate — one static guess standing in for real field wind, which varies continuously. Printing that single computed correction directly on the card risked implying a precision the input never had. The resolution mirrors how printed dope/wind cards have traditionally handled this: rather than a baked-in correction, each range row also shows a per-1mph (or per-1kph, in metric mode) reference figure — drift divided back down by the wind speed used in the calculation, expressed in kilometres per hour rather than miles per hour whenever the page is set to metric, matching how every other Range Card value already follows that toggle — in whichever unit — mils, MOA, clicks, inches, or centimetres — the elevation value is already shown in, so the shooter can scale it by whatever wind they actually observe at the line rather than trusting a single number computed from a guess. The figure is labelled explicitly as “Wind (per mph)” or “Wind (per kph)” rather than a bare unit suffix, since a follow-up review noted that a plain “(mph)” or “(kph)” reads like a wind-speed reading rather than a rate — easy to misread as “wind is 0.28mph” instead of “0.28 for every 1mph of wind.” Angular units (mils, MOA) are shown as decimals, consistent with how drift is displayed everywhere else in the application; clicks are rounded to a whole number, since clicks are inherently discrete. The figure is omitted entirely when the calculation used 0mph wind, since there is no rate to derive. The addition required no change to the underlying physics or the plain-text Share export path, since both already derive their values from the same per-row drift fields the main results table uses; the wind reference simply reads them a second time and divides.</w:t>
+        <w:t>This constraint was tested directly when the user asked whether the Range Card could integrate with an Apple Watch. watchOS has no general-purpose web browser, so there is no way for a device to load the application directly, and building a companion watch app or a backend sync service would have meant abandoning the single-file, server-free model rather than working within it. The resolution kept the constraint intact: a “Share” button was added to the Range Card using the standard Web Share API, handing the currently displayed range/holdover data to the native iOS/macOS share sheet as plain text, which the user can then route to Notes, Reminders, or a Shortcut — several of which already sync to and display on a paired Watch without the application needing to know anything about watchOS at all. A clipboard-copy fallback covers browsers without share-sheet support, so the button degrades gracefully rather than failing silently. A follow-up report showed one concrete cost of that architectural choice: on macOS, sharing to Notes produced an empty note with only a link back to the application instead of the range text, because Safari’s share sheet — invoked from a regular browser tab rather than an installed web app — also offers the current page itself as a shareable item, and Notes’ share extension preferred that page-link item over the supplied text when both a title and text were present with no url. This is a documented WebKit behaviour, not something the application controls; the mitigation was to stop supplying a title and share text alone, the combination most consistently reported to avoid the substitution, with the pre-existing clipboard fallback remaining available if a target app still prefers a link card.</w:t>
+      </w:r>
+    </w:p>
+    <w:p>
+      <w:pPr>
+        <w:pStyle w:val="BodyText"/>
+      </w:pPr>
+      <w:r>
+        <w:lastRenderedPageBreak/>
+        <w:t>A later refinement extended the Range Card with a wind-correction reference, prompted by a design question about whether wind should be part of a printed range card at all. Unlike elevation holdover, which is deterministic for a given rifle/load/zero and therefore safe to state as a single static number, wind correction on this application depends on a single wind-speed-and-direction input entered before Calculate — one static guess standing in for real field wind, which varies continuously. Printing that single computed correction directly on the card risked implying a precision the input never had. The resolution mirrors how printed dope/wind cards have traditionally handled this: rather than a baked-in correction, each range row also shows a per-1mph (or per-1kph, in metric mode) reference figure — drift divided back down by the wind speed used in the calculation, expressed in kilometres per hour rather than miles per hour whenever the page is set to metric, matching how every other Range Card value already follows that toggle — in whichever unit — mils, MOA, clicks, inches, or centimetres — the elevation value is already shown in, so the shooter can scale it by whatever wind they actually observe at the line rather than trusting a single number computed from a guess. The figure is labelled explicitly as “Wind (per mph)” or “Wind (per kph)” rather than a bare unit suffix, since a follow-up review noted that a plain “(mph)” or “(kph)” reads like a wind-speed reading rather than a rate — easy to misread as “wind is 0.28mph” instead of “0.28 for every 1mph of wind.” Angular units (mils, MOA) are shown as decimals, consistent with how drift is displayed everywhere else in the application; clicks are rounded to a whole number, since clicks are inherently discrete. The figure is omitted entirely when the calculation used 0mph wind, since there is no rate to derive. The addition required no change to the underlying physics or the plain-text Share export path, since both already derive their values from the same per-row drift fields the main results table uses; the wind reference simply reads them a second time and divides.</w:t>
       </w:r>
     </w:p>
     <w:p>
       <w:pPr>
         <w:pStyle w:val="Heading2"/>
       </w:pPr>
-      <w:bookmarkStart w:id="18" w:name="X03f352a211ec1f9d2d2cb2ccc4f504801693093"/>
+      <w:bookmarkStart w:id="22" w:name="X03f352a211ec1f9d2d2cb2ccc4f504801693093"/>
+      <w:r>
+        <w:t>2. Canonical Internal Units, Converted Only at the Boundary</w:t>
+      </w:r>
+      <w:bookmarkEnd w:id="22"/>
+    </w:p>
+    <w:p>
+      <w:pPr>
+        <w:pStyle w:val="FirstParagraph"/>
+      </w:pPr>
+      <w:r>
+        <w:t>All physics computation is carried out in imperial units internally, regardless of whether the user has the interface set to imperial or metric display. Metric values are converted to imperial on input and back to metric only for display. This was chosen over maintaining two parallel unit-aware code paths through the physics engine, which would have doubled the surface area for bugs and made the two systems drift out of agreement over time.</w:t>
+      </w:r>
+    </w:p>
+    <w:p>
+      <w:pPr>
+        <w:pStyle w:val="BodyText"/>
+      </w:pPr>
+      <w:r>
+        <w:t xml:space="preserve">This decision was validated by a real bug it prevented from being worse than it was: an early metric-interval implementation rounded each successive table row’s </w:t>
+      </w:r>
+      <w:r>
+        <w:rPr>
+          <w:i/>
+        </w:rPr>
+        <w:t>native</w:t>
+      </w:r>
+      <w:r>
+        <w:t xml:space="preserve"> interval mark (e.g. every 10 m) to the nearest yard independently by repeatedly adding a fixed yard increment, which let small rounding errors compound row over row into a visible drift (…80 m, 91 m, 101 m, 111 m…). The fix — generating each target mark directly in its native unit and converting </w:t>
+      </w:r>
+      <w:r>
+        <w:rPr>
+          <w:i/>
+        </w:rPr>
+        <w:t>each one independently</w:t>
+      </w:r>
+      <w:r>
+        <w:t xml:space="preserve"> to the nearest yard, rather than accumulating an already-rounded step — is a direct consequence of the “single canonical unit, convert at the boundary” philosophy: the bug was in the conversion boundary, not the physics, and was fixed there without touching the engine at all.</w:t>
+      </w:r>
+    </w:p>
+    <w:p>
+      <w:pPr>
+        <w:pStyle w:val="Heading2"/>
+      </w:pPr>
+      <w:bookmarkStart w:id="23" w:name="Xb65f980db82093c0ec65188b4e953a836b7ec15"/>
       <w:r>
         <w:lastRenderedPageBreak/>
-        <w:t>2. Canonical Internal Units, Converted Only at the Boundary</w:t>
-      </w:r>
-      <w:bookmarkEnd w:id="18"/>
+        <w:t>3. Iterative, Usage-Driven Feature Development</w:t>
+      </w:r>
+      <w:bookmarkEnd w:id="23"/>
     </w:p>
     <w:p>
       <w:pPr>
         <w:pStyle w:val="FirstParagraph"/>
       </w:pPr>
       <w:r>
-        <w:t>All physics computation is carried out in imperial units internally, regardless of whether the user has the interface set to imperial or metric display. Metric values are converted to imperial on input and back to metric only for display. This was chosen over maintaining two parallel unit-aware code paths through the physics engine, which would have doubled the surface area for bugs and made the two systems drift out of agreement over time.</w:t>
-      </w:r>
-    </w:p>
-    <w:p>
-      <w:pPr>
-        <w:pStyle w:val="BodyText"/>
-      </w:pPr>
-      <w:r>
-        <w:t xml:space="preserve">This decision was validated by a real bug it prevented from being worse than it was: an early metric-interval implementation rounded each successive table row’s </w:t>
+        <w:t>Features were added in direct response to concrete friction encountered in real use, rather than speculative up-front design. Trajectory Truing and its later Verification step, the Range Card view, live-weather auto-fill, preset drag-reordering (including a dedicated touch-based reimplementation once it became clear the native HTML5 drag API silently does nothing for ordinary elements on iOS Safari), and the recent overflow-menu consolidation of per-preset actions are all examples of a feature being introduced, used, found lacking in some specific way, and then refined — sometimes across several successive passes — rather than being designed exhaustively before first use.</w:t>
+      </w:r>
+    </w:p>
+    <w:p>
+      <w:pPr>
+        <w:pStyle w:val="BodyText"/>
+      </w:pPr>
+      <w:r>
+        <w:t>Compare Loads is the most extensive recent example of this pattern: shipped first with a fixed, auto-computed reference distance and an explicit Compare button, then made editable on request, then extended to read a currently-loaded preset’s live, unsaved amendments rather than always the stored version, and finally refined again once real use showed one of its warnings was firing too often to stay useful. See Part 3.</w:t>
+      </w:r>
+    </w:p>
+    <w:p>
+      <w:pPr>
+        <w:pStyle w:val="Heading2"/>
+      </w:pPr>
+      <w:bookmarkStart w:id="24" w:name="X76af9a41c1155abeec07dcf3050babbfb908300"/>
+      <w:r>
+        <w:t>4. Testing Without a Browser: Headless Node/VM Harnesses</w:t>
+      </w:r>
+      <w:bookmarkEnd w:id="24"/>
+    </w:p>
+    <w:p>
+      <w:pPr>
+        <w:pStyle w:val="FirstParagraph"/>
+      </w:pPr>
+      <w:r>
+        <w:t xml:space="preserve">The development environment has no access to a real browser or to the npm package registry, which rules out both conventional browser-automation testing and most off-the-shelf JavaScript testing frameworks. In their place, a custom pattern was developed: the application’s actual </w:t>
+      </w:r>
+      <w:r>
+        <w:rPr>
+          <w:rStyle w:val="VerbatimChar"/>
+        </w:rPr>
+        <w:t>&lt;script&gt;</w:t>
+      </w:r>
+      <w:r>
+        <w:t xml:space="preserve"> block is loaded verbatim into a Node </w:t>
+      </w:r>
+      <w:r>
+        <w:rPr>
+          <w:rStyle w:val="VerbatimChar"/>
+        </w:rPr>
+        <w:t>vm</w:t>
+      </w:r>
+      <w:r>
+        <w:t xml:space="preserve"> context, against a small hand-built fake DOM (fake elements supporting </w:t>
+      </w:r>
+      <w:r>
+        <w:rPr>
+          <w:rStyle w:val="VerbatimChar"/>
+        </w:rPr>
+        <w:t>classList</w:t>
+      </w:r>
+      <w:r>
+        <w:t xml:space="preserve">, </w:t>
+      </w:r>
+      <w:r>
+        <w:rPr>
+          <w:rStyle w:val="VerbatimChar"/>
+        </w:rPr>
+        <w:t>dataset</w:t>
+      </w:r>
+      <w:r>
+        <w:t xml:space="preserve">, </w:t>
+      </w:r>
+      <w:r>
+        <w:rPr>
+          <w:rStyle w:val="VerbatimChar"/>
+        </w:rPr>
+        <w:t>closest()</w:t>
+      </w:r>
+      <w:r>
+        <w:t xml:space="preserve">, event listeners, and enough of the canvas 2D context API to record what a chart would have drawn) and a fake </w:t>
+      </w:r>
+      <w:r>
+        <w:rPr>
+          <w:rStyle w:val="VerbatimChar"/>
+        </w:rPr>
+        <w:t>localStorage</w:t>
+      </w:r>
+      <w:r>
+        <w:t xml:space="preserve">. This allows the </w:t>
       </w:r>
       <w:r>
         <w:rPr>
           <w:i/>
         </w:rPr>
-        <w:t>native</w:t>
-      </w:r>
-      <w:r>
-        <w:t xml:space="preserve"> interval mark (e.g. every 10 m) to the nearest yard independently by repeatedly adding a fixed yard increment, which let small rounding errors compound row over row into a visible drift (…80 m, 91 m, 101 m, 111 m…). The fix — generating each target mark directly in its native unit and converting </w:t>
+        <w:t>real, unmodified</w:t>
+      </w:r>
+      <w:r>
+        <w:t xml:space="preserve"> production functions — </w:t>
+      </w:r>
+      <w:r>
+        <w:rPr>
+          <w:rStyle w:val="VerbatimChar"/>
+        </w:rPr>
+        <w:t>computeTrajectory</w:t>
+      </w:r>
+      <w:r>
+        <w:t xml:space="preserve">, </w:t>
+      </w:r>
+      <w:r>
+        <w:rPr>
+          <w:rStyle w:val="VerbatimChar"/>
+        </w:rPr>
+        <w:t>renderPresets</w:t>
+      </w:r>
+      <w:r>
+        <w:t xml:space="preserve">, </w:t>
+      </w:r>
+      <w:r>
+        <w:rPr>
+          <w:rStyle w:val="VerbatimChar"/>
+        </w:rPr>
+        <w:t>drawChart</w:t>
+      </w:r>
+      <w:r>
+        <w:t>, and so on — to be exercised directly and their outputs asserted on, without reimplementing or mocking the logic under test.</w:t>
+      </w:r>
+    </w:p>
+    <w:p>
+      <w:pPr>
+        <w:pStyle w:val="BodyText"/>
+      </w:pPr>
+      <w:r>
+        <w:t xml:space="preserve">Every fix or new feature is paired with a test that specifically exercises the bug or behaviour in question — not a superficial smoke test — and existing harnesses are re-run after every change to catch regressions. Several bugs were caught specifically because a harness was built to reproduce the </w:t>
       </w:r>
       <w:r>
         <w:rPr>
           <w:i/>
         </w:rPr>
-        <w:t>each one independently</w:t>
-      </w:r>
-      <w:r>
-        <w:t xml:space="preserve"> to the nearest yard, rather than accumulating an already-rounded step — is a direct consequence of the “single canonical unit, convert at the boundary” philosophy: the bug was in the conversion boundary, not the physics, and was fixed there without touching the engine at all.</w:t>
+        <w:t>exact</w:t>
+      </w:r>
+      <w:r>
+        <w:t xml:space="preserve"> reported symptom (for example, simulating a touch landing on a nested SVG icon rather than its parent button, which a naive same-element check would miss) rather than a generic version of the problem.</w:t>
       </w:r>
     </w:p>
     <w:p>
       <w:pPr>
         <w:pStyle w:val="Heading2"/>
       </w:pPr>
-      <w:bookmarkStart w:id="19" w:name="Xb65f980db82093c0ec65188b4e953a836b7ec15"/>
-      <w:r>
-        <w:t>3. Iterative, Usage-Driven Feature Development</w:t>
-      </w:r>
-      <w:bookmarkEnd w:id="19"/>
+      <w:bookmarkStart w:id="25" w:name="multi-variant-deployment-discipline"/>
+      <w:r>
+        <w:t>5. Multi-Variant Deployment Discipline</w:t>
+      </w:r>
+      <w:bookmarkEnd w:id="25"/>
     </w:p>
     <w:p>
       <w:pPr>
         <w:pStyle w:val="FirstParagraph"/>
       </w:pPr>
       <w:r>
-        <w:t>Features were added in direct response to concrete friction encountered in real use, rather than speculative up-front design. Trajectory Truing and its later Verification step, the Range Card view, live-weather auto-fill, preset drag-reordering (including a dedicated touch-based reimplementation once it became clear the native HTML5 drag API silently does nothing for ordinary elements on iOS Safari), and the recent overflow-menu consolidation of per-preset actions are all examples of a feature being introduced, used, found lacking in some specific way, and then refined — sometimes across several successive passes — rather than being designed exhaustively before first use.</w:t>
-      </w:r>
-    </w:p>
-    <w:p>
-      <w:pPr>
-        <w:pStyle w:val="BodyText"/>
-      </w:pPr>
-      <w:r>
-        <w:t>Compare Loads is the most extensive recent example of this pattern: shipped first with a fixed, auto-computed reference distance and an explicit Compare button, then made editable on request, then extended to read a currently-loaded preset’s live, unsaved amendments rather than always the stored version, and finally refined again once real use showed one of its warnings was firing too often to stay useful. See Part 3.</w:t>
+        <w:t xml:space="preserve">The calculator exists as four synchronised files: the full-featured main application, a stripped-down “General Release” public build with no built-in preset library, and two deployment mirror copies (a site-root </w:t>
+      </w:r>
+      <w:r>
+        <w:rPr>
+          <w:rStyle w:val="VerbatimChar"/>
+        </w:rPr>
+        <w:t>index.html</w:t>
+      </w:r>
+      <w:r>
+        <w:t xml:space="preserve"> and a personal-folder copy) kept byte-identical to their source in every shared code path. Every change to shared logic — the preset system, the chart, the physics engine — is applied identically across all four and reverified in each before being considered complete, rather than treating one file as canonical and letting the others drift.</w:t>
       </w:r>
     </w:p>
     <w:p>
       <w:pPr>
         <w:pStyle w:val="Heading2"/>
       </w:pPr>
-      <w:bookmarkStart w:id="20" w:name="X76af9a41c1155abeec07dcf3050babbfb908300"/>
-      <w:r>
-        <w:t>4. Testing Without a Browser: Headless Node/VM Harnesses</w:t>
-      </w:r>
-      <w:bookmarkEnd w:id="20"/>
+      <w:bookmarkStart w:id="26" w:name="transparency-about-approximations"/>
+      <w:r>
+        <w:t>6. Transparency About Approximations</w:t>
+      </w:r>
+      <w:bookmarkEnd w:id="26"/>
     </w:p>
     <w:p>
       <w:pPr>
         <w:pStyle w:val="FirstParagraph"/>
       </w:pPr>
       <w:r>
-        <w:t xml:space="preserve">The development environment has no access to a real browser or to the npm package registry, which rules out both conventional browser-automation testing and most off-the-shelf JavaScript testing frameworks. In their place, a custom pattern was developed: the application’s actual </w:t>
-      </w:r>
-      <w:r>
-        <w:rPr>
-          <w:rStyle w:val="VerbatimChar"/>
-        </w:rPr>
-        <w:t>&lt;script&gt;</w:t>
-      </w:r>
-      <w:r>
-        <w:t xml:space="preserve"> block is loaded verbatim into a Node </w:t>
-      </w:r>
-      <w:r>
-        <w:rPr>
-          <w:rStyle w:val="VerbatimChar"/>
-        </w:rPr>
-        <w:t>vm</w:t>
-      </w:r>
-      <w:r>
-        <w:t xml:space="preserve"> context, against a small hand-built fake DOM (fake elements supporting </w:t>
-      </w:r>
-      <w:r>
-        <w:rPr>
-          <w:rStyle w:val="VerbatimChar"/>
-        </w:rPr>
-        <w:t>classList</w:t>
-      </w:r>
-      <w:r>
-        <w:t xml:space="preserve">, </w:t>
-      </w:r>
-      <w:r>
-        <w:rPr>
-          <w:rStyle w:val="VerbatimChar"/>
-        </w:rPr>
-        <w:t>dataset</w:t>
-      </w:r>
-      <w:r>
-        <w:t xml:space="preserve">, </w:t>
-      </w:r>
-      <w:r>
-        <w:rPr>
-          <w:rStyle w:val="VerbatimChar"/>
-        </w:rPr>
-        <w:t>closest()</w:t>
-      </w:r>
-      <w:r>
-        <w:t xml:space="preserve">, event listeners, and enough of the canvas 2D context API to record what a chart would have drawn) and a fake </w:t>
-      </w:r>
-      <w:r>
-        <w:rPr>
-          <w:rStyle w:val="VerbatimChar"/>
-        </w:rPr>
-        <w:t>localStorage</w:t>
-      </w:r>
-      <w:r>
-        <w:t xml:space="preserve">. This allows the </w:t>
+        <w:t xml:space="preserve">Several of the physics relationships used are well-established approximations rather than exact derivations, and this is treated as something to document plainly rather than </w:t>
+      </w:r>
+      <w:r>
+        <w:lastRenderedPageBreak/>
+        <w:t>obscure behind confident-looking output. The G1↔G7 BC estimate ratio, the shape-based stability correction factors, and the community-sourced airgun drag table are all flagged in code comments as approximations with a stated provenance and stated limits on where they’re valid — and the project maintains an explicit, honestly-worded “known gaps” list (for example, the missing muzzle-velocity correction term in the stability calculation) rather than presenting the current model as complete.</w:t>
+      </w:r>
+    </w:p>
+    <w:p>
+      <w:pPr>
+        <w:pStyle w:val="Heading2"/>
+      </w:pPr>
+      <w:bookmarkStart w:id="27" w:name="advisory-validation-not-gatekeeping"/>
+      <w:r>
+        <w:t>7. Advisory Validation, Not Gatekeeping</w:t>
+      </w:r>
+      <w:bookmarkEnd w:id="27"/>
+    </w:p>
+    <w:p>
+      <w:pPr>
+        <w:pStyle w:val="FirstParagraph"/>
+      </w:pPr>
+      <w:r>
+        <w:t>Where the application checks user input for plausibility — velocity, weight, BC — it always does so as a dismissible, non-blocking warning rather than a hard validation error. The design preference throughout is to help a user catch their own likely mistake (a decimal point, an fps/m-s mix-up) without ever preventing them from running a calculation on genuinely unusual but real inputs, such as an intentionally low-powered air rifle load or an experimental wildcat cartridge.</w:t>
+      </w:r>
+    </w:p>
+    <w:p>
+      <w:pPr>
+        <w:pStyle w:val="Heading2"/>
+      </w:pPr>
+      <w:bookmarkStart w:id="28" w:name="accessibility-as-a-first-class-concern"/>
+      <w:r>
+        <w:t>8. Accessibility as a First-Class Concern</w:t>
+      </w:r>
+      <w:bookmarkEnd w:id="28"/>
+    </w:p>
+    <w:p>
+      <w:pPr>
+        <w:pStyle w:val="FirstParagraph"/>
+      </w:pPr>
+      <w:r>
+        <w:t xml:space="preserve">Distinguishing information is never conveyed by colour alone. On the trajectory chart, the drop and energy curves are differentiated by both colour </w:t>
       </w:r>
       <w:r>
         <w:rPr>
           <w:i/>
         </w:rPr>
-        <w:t>real, unmodified</w:t>
-      </w:r>
-      <w:r>
-        <w:t xml:space="preserve"> production functions — </w:t>
-      </w:r>
-      <w:r>
-        <w:rPr>
-          <w:rStyle w:val="VerbatimChar"/>
-        </w:rPr>
-        <w:t>computeTrajectory</w:t>
-      </w:r>
-      <w:r>
-        <w:t xml:space="preserve">, </w:t>
-      </w:r>
-      <w:r>
-        <w:rPr>
-          <w:rStyle w:val="VerbatimChar"/>
-        </w:rPr>
-        <w:t>renderPresets</w:t>
-      </w:r>
-      <w:r>
-        <w:t xml:space="preserve">, </w:t>
-      </w:r>
-      <w:r>
-        <w:rPr>
-          <w:rStyle w:val="VerbatimChar"/>
-        </w:rPr>
-        <w:t>drawChart</w:t>
-      </w:r>
-      <w:r>
-        <w:t>, and so on — to be exercised directly and their outputs asserted on, without reimplementing or mocking the logic under test.</w:t>
-      </w:r>
-    </w:p>
-    <w:p>
-      <w:pPr>
-        <w:pStyle w:val="BodyText"/>
-      </w:pPr>
-      <w:r>
-        <w:lastRenderedPageBreak/>
-        <w:t xml:space="preserve">Every fix or new feature is paired with a test that specifically exercises the bug or behaviour in question — not a superficial smoke test — and existing harnesses are re-run after every change to catch regressions. Several bugs were caught specifically because a harness was built to reproduce the </w:t>
-      </w:r>
-      <w:r>
-        <w:rPr>
-          <w:i/>
-        </w:rPr>
-        <w:t>exact</w:t>
-      </w:r>
-      <w:r>
-        <w:t xml:space="preserve"> reported symptom (for example, simulating a touch landing on a nested SVG icon rather than its parent button, which a naive same-element check would miss) rather than a generic version of the problem.</w:t>
+        <w:t>and</w:t>
+      </w:r>
+      <w:r>
+        <w:t xml:space="preserve"> line style (solid versus dashed) so the chart remains legible to colourblind users; the same principle was applied when auditing other colour-only status indicators elsewhere in the interface. This was addressed as a dedicated pass over the application rather than an incidental side-effect of a colour palette choice.</w:t>
       </w:r>
     </w:p>
     <w:p>
       <w:pPr>
         <w:pStyle w:val="Heading2"/>
       </w:pPr>
-      <w:bookmarkStart w:id="21" w:name="multi-variant-deployment-discipline"/>
-      <w:r>
-        <w:t>5. Multi-Variant Deployment Discipline</w:t>
-      </w:r>
-      <w:bookmarkEnd w:id="21"/>
+      <w:bookmarkStart w:id="29" w:name="X72546918724611ffeb226dceba3dbaec010b8b6"/>
+      <w:r>
+        <w:t>9. Deliberate Simplicity Over Feature Completeness</w:t>
+      </w:r>
+      <w:bookmarkEnd w:id="29"/>
     </w:p>
     <w:p>
       <w:pPr>
         <w:pStyle w:val="FirstParagraph"/>
       </w:pPr>
       <w:r>
-        <w:t xml:space="preserve">The calculator exists as four synchronised files: the full-featured main application, a stripped-down “General Release” public build with no built-in preset library, and two deployment mirror copies (a site-root </w:t>
-      </w:r>
-      <w:r>
-        <w:rPr>
-          <w:rStyle w:val="VerbatimChar"/>
-        </w:rPr>
-        <w:t>index.html</w:t>
-      </w:r>
-      <w:r>
-        <w:t xml:space="preserve"> and a personal-folder copy) kept byte-identical to their source in every shared code path. Every change to shared logic — the preset system, the chart, the physics engine — is applied identically across all four and reverified in each before being considered complete, rather than treating one file as canonical and letting the others drift.</w:t>
+        <w:t>Not every capability that was built was kept. A Bluetooth integration with a Kestrel 5700X weather meter was implemented and then deliberately removed once two problems became clear: Web Bluetooth is Chrome-only, directly conflicting with the project’s core Safari/iOS compatibility requirement, and the meter’s proprietary wind-speed encoding could not be reliably decoded. Rather than persisting with a partially-working, platform-incompatible feature, it was replaced with a simpler browser-geolocation-plus-weather-API “live weather” button that works identically everywhere the application itself runs. This stands as the clearest example of the project consistently preferring a smaller feature that works everywhere over a larger one that only works some of the time.</w:t>
       </w:r>
     </w:p>
     <w:p>
       <w:pPr>
         <w:pStyle w:val="Heading2"/>
       </w:pPr>
-      <w:bookmarkStart w:id="22" w:name="transparency-about-approximations"/>
-      <w:r>
-        <w:t>6. Transparency About Approximations</w:t>
-      </w:r>
-      <w:bookmarkEnd w:id="22"/>
-    </w:p>
-    <w:p>
-      <w:pPr>
-        <w:pStyle w:val="FirstParagraph"/>
-      </w:pPr>
-      <w:r>
-        <w:t>Several of the physics relationships used are well-established approximations rather than exact derivations, and this is treated as something to document plainly rather than obscure behind confident-looking output. The G1↔G7 BC estimate ratio, the shape-based stability correction factors, and the community-sourced airgun drag table are all flagged in code comments as approximations with a stated provenance and stated limits on where they’re valid — and the project maintains an explicit, honestly-worded “known gaps” list (for example, the missing muzzle-velocity correction term in the stability calculation) rather than presenting the current model as complete.</w:t>
-      </w:r>
-    </w:p>
-    <w:p>
-      <w:pPr>
-        <w:pStyle w:val="Heading2"/>
-      </w:pPr>
-      <w:bookmarkStart w:id="23" w:name="advisory-validation-not-gatekeeping"/>
-      <w:r>
-        <w:t>7. Advisory Validation, Not Gatekeeping</w:t>
-      </w:r>
-      <w:bookmarkEnd w:id="23"/>
-    </w:p>
-    <w:p>
-      <w:pPr>
-        <w:pStyle w:val="FirstParagraph"/>
-      </w:pPr>
-      <w:r>
-        <w:t>Where the application checks user input for plausibility — velocity, weight, BC — it always does so as a dismissible, non-blocking warning rather than a hard validation error. The design preference throughout is to help a user catch their own likely mistake (a decimal point, an fps/m-s mix-up) without ever preventing them from running a calculation on genuinely unusual but real inputs, such as an intentionally low-powered air rifle load or an experimental wildcat cartridge.</w:t>
-      </w:r>
-    </w:p>
-    <w:p>
-      <w:pPr>
-        <w:pStyle w:val="Heading2"/>
-      </w:pPr>
-      <w:bookmarkStart w:id="24" w:name="accessibility-as-a-first-class-concern"/>
-      <w:r>
-        <w:t>8. Accessibility as a First-Class Concern</w:t>
-      </w:r>
-      <w:bookmarkEnd w:id="24"/>
-    </w:p>
-    <w:p>
-      <w:pPr>
-        <w:pStyle w:val="FirstParagraph"/>
-      </w:pPr>
-      <w:r>
-        <w:t xml:space="preserve">Distinguishing information is never conveyed by colour alone. On the trajectory chart, the drop and energy curves are differentiated by both colour </w:t>
-      </w:r>
-      <w:r>
-        <w:rPr>
-          <w:i/>
-        </w:rPr>
-        <w:t>and</w:t>
-      </w:r>
-      <w:r>
-        <w:t xml:space="preserve"> line style (solid versus dashed) so the chart remains legible to colourblind users; the same principle was applied when auditing other colour-only status indicators elsewhere in the interface. This was addressed as a dedicated pass over the application rather than an incidental side-effect of a colour palette choice.</w:t>
-      </w:r>
-    </w:p>
-    <w:p>
-      <w:pPr>
-        <w:pStyle w:val="Heading2"/>
-      </w:pPr>
-      <w:bookmarkStart w:id="25" w:name="X72546918724611ffeb226dceba3dbaec010b8b6"/>
-      <w:r>
-        <w:t>9. Deliberate Simplicity Over Feature Completeness</w:t>
-      </w:r>
-      <w:bookmarkEnd w:id="25"/>
-    </w:p>
-    <w:p>
-      <w:pPr>
-        <w:pStyle w:val="FirstParagraph"/>
-      </w:pPr>
-      <w:r>
-        <w:t xml:space="preserve">Not every capability that was built was kept. A Bluetooth integration with a Kestrel 5700X weather meter was implemented and then deliberately removed once two problems became clear: Web Bluetooth is Chrome-only, directly conflicting with the </w:t>
-        <w:lastRenderedPageBreak/>
-        <w:t>project’s core Safari/iOS compatibility requirement, and the meter’s proprietary wind-speed encoding could not be reliably decoded. Rather than persisting with a partially-working, platform-incompatible feature, it was replaced with a simpler browser-geolocation-plus-weather-API “live weather” button that works identically everywhere the application itself runs. This stands as the clearest example of the project consistently preferring a smaller feature that works everywhere over a larger one that only works some of the time.</w:t>
-      </w:r>
-    </w:p>
-    <w:p>
-      <w:pPr>
-        <w:pStyle w:val="Heading2"/>
-      </w:pPr>
-      <w:bookmarkStart w:id="26" w:name="X7ea07aa20c72aed6ef2b2049cdfa9fb93eef527"/>
+      <w:bookmarkStart w:id="30" w:name="X7ea07aa20c72aed6ef2b2049cdfa9fb93eef527"/>
       <w:r>
         <w:t>10. The Changelog as an Engineering Discipline</w:t>
       </w:r>
-      <w:bookmarkEnd w:id="26"/>
+      <w:bookmarkEnd w:id="30"/>
     </w:p>
     <w:p>
       <w:pPr>
@@ -2858,7 +2903,7 @@
               </wp:inline>
             </w:drawing>
           </mc:Choice>
-          <mc:Fallback>
+          <mc:Fallback xmlns:w16cei="http://schemas.microsoft.com/office/word/2026/wordml/cei">
             <w:pict>
               <v:rect w14:anchorId="32AA944D" id="Horizontal Line 3" o:spid="_x0000_s1026" style="width:468pt;height:1.1pt;visibility:visible;mso-wrap-style:square;mso-left-percent:-10001;mso-top-percent:-10001;mso-position-horizontal:absolute;mso-position-horizontal-relative:char;mso-position-vertical:absolute;mso-position-vertical-relative:line;mso-left-percent:-10001;mso-top-percent:-10001;v-text-anchor:top" o:gfxdata="UEsDBBQABgAIAAAAIQC2gziS/gAAAOEBAAATAAAAW0NvbnRlbnRfVHlwZXNdLnhtbJSRQU7DMBBF 90jcwfIWJU67QAgl6YK0S0CoHGBkTxKLZGx5TGhvj5O2G0SRWNoz/78nu9wcxkFMGNg6quQqL6RA 0s5Y6ir5vt9lD1JwBDIwOMJKHpHlpr69KfdHjyxSmriSfYz+USnWPY7AufNIadK6MEJMx9ApD/oD OlTrorhX2lFEilmcO2RdNtjC5xDF9pCuTyYBB5bi6bQ4syoJ3g9WQ0ymaiLzg5KdCXlKLjvcW893 SUOqXwnz5DrgnHtJTxOsQfEKIT7DmDSUCaxw7Rqn8787ZsmRM9e2VmPeBN4uqYvTtW7jvijg9N/y JsXecLq0q+WD6m8AAAD//wMAUEsDBBQABgAIAAAAIQA4/SH/1gAAAJQBAAALAAAAX3JlbHMvLnJl bHOkkMFqwzAMhu+DvYPRfXGawxijTi+j0GvpHsDYimMaW0Yy2fr2M4PBMnrbUb/Q94l/f/hMi1qR JVI2sOt6UJgd+ZiDgffL8ekFlFSbvV0oo4EbChzGx4f9GRdb25HMsYhqlCwG5lrLq9biZkxWOiqY 22YiTra2kYMu1l1tQD30/bPm3wwYN0x18gb45AdQl1tp5j/sFB2T0FQ7R0nTNEV3j6o9feQzro1i OWA14Fm+Q8a1a8+Bvu/d/dMb2JY5uiPbhG/ktn4cqGU/er3pcvwCAAD//wMAUEsDBBQABgAIAAAA IQB2Bga0KQIAAD8EAAAOAAAAZHJzL2Uyb0RvYy54bWysU8Fu2zAMvQ/YPwi6L07SpG2MOEWRtsOA bivW7AMUWbaFSaJGKXGyry+lpGm23Yb5YJAi9fT4SM5vdtawrcKgwVV8NBhyppyEWru24t9XDx+u OQtRuFoYcKriexX4zeL9u3nvSzWGDkytkBGIC2XvK97F6MuiCLJTVoQBeOUo2ABaEcnFtqhR9IRu TTEeDi+LHrD2CFKFQKd3hyBfZPymUTJ+bZqgIjMVJ24x/zH/1+lfLOaibFH4TssjDfEPLKzQjh49 Qd2JKNgG9V9QVkuEAE0cSLAFNI2WKtdA1YyGf1Tz3Amvci0kTvAnmcL/g5Vfts/+CRP14B9B/gjM wTcgnUacrGUnXKtugychj0f3tY5PoF0kFuc5iNB3StS/H+cSVntPrc/JK7WLCSG5pH3R+1CeOCQn EBu27j9DTVfEJkKWddegTRxJMLbL3dufukeITNLhdDa5uBxSkyXFRhezq9zdQpSvlz2G+FGBZcmo OFJNGVxsH0NMZET5mpLecvCgjckDYhzrKz6bjqf5QgCj6xTMsmG7XhpkW5FGLH+5MhL0PM3qSINu tK349SlJlEmxe1fnV6LQ5mATE+OO6iRB0jiHcg31nsTB1B0qk7aOjA7wF2c9TXDFw8+NQMWZ+eSo C7PRZJJGPjuT6dWYHDyPrM8jwkmCqnjk7GAu42FNNh512+WGHVS5paY0Ogv2xupIlqY063jcqLQG 537Oetv7xQsAAAD//wMAUEsDBBQABgAIAAAAIQAvqYUv3AAAAAgBAAAPAAAAZHJzL2Rvd25yZXYu eG1sTI/NTsMwEITvSLyDtUjcqEMQFU3jVOGn10oUJMrNjRc7aryOYrcJb8/CpVxGGo12dr5yNflO nHCIbSAFt7MMBFITTEtWwfvb+uYBREyajO4CoYJvjLCqLi9KXZgw0iuetskKLqFYaAUupb6QMjYO vY6z0CNx9hUGrxPbwUoz6JHLfSfzLJtLr1viD073+OSwOWyPXsFL/7mp722U9Udyu0N4HNduY5W6 vpqelyz1EkTCKZ0v4JeB90PFw/bhSCaKTgHTpD/lbHE3Z7tXkOcgq1L+B6h+AAAA//8DAFBLAQIt ABQABgAIAAAAIQC2gziS/gAAAOEBAAATAAAAAAAAAAAAAAAAAAAAAABbQ29udGVudF9UeXBlc10u eG1sUEsBAi0AFAAGAAgAAAAhADj9If/WAAAAlAEAAAsAAAAAAAAAAAAAAAAALwEAAF9yZWxzLy5y ZWxzUEsBAi0AFAAGAAgAAAAhAHYGBrQpAgAAPwQAAA4AAAAAAAAAAAAAAAAALgIAAGRycy9lMm9E b2MueG1sUEsBAi0AFAAGAAgAAAAhAC+phS/cAAAACAEAAA8AAAAAAAAAAAAAAAAAgwQAAGRycy9k b3ducmV2LnhtbFBLBQYAAAAABAAEAPMAAACMBQAAAAA= " filled="f">
                 <o:lock v:ext="edit" rotation="t" aspectratio="t" verticies="t" text="t" shapetype="t"/>
@@ -2873,21 +2918,22 @@
       <w:pPr>
         <w:pStyle w:val="Heading1"/>
       </w:pPr>
-      <w:bookmarkStart w:id="27" w:name="part-3-the-compare-loads-feature"/>
-      <w:r>
+      <w:bookmarkStart w:id="31" w:name="part-3-the-compare-loads-feature"/>
+      <w:r>
+        <w:lastRenderedPageBreak/>
         <w:t>Part 3 — The Compare Loads Feature</w:t>
       </w:r>
-      <w:bookmarkEnd w:id="27"/>
+      <w:bookmarkEnd w:id="31"/>
     </w:p>
     <w:p>
       <w:pPr>
         <w:pStyle w:val="Heading2"/>
       </w:pPr>
-      <w:bookmarkStart w:id="28" w:name="purpose-and-architecture"/>
+      <w:bookmarkStart w:id="32" w:name="purpose-and-architecture"/>
       <w:r>
         <w:t>1. Purpose and Architecture</w:t>
       </w:r>
-      <w:bookmarkEnd w:id="28"/>
+      <w:bookmarkEnd w:id="32"/>
     </w:p>
     <w:p>
       <w:pPr>
@@ -2909,11 +2955,11 @@
       <w:pPr>
         <w:pStyle w:val="Heading2"/>
       </w:pPr>
-      <w:bookmarkStart w:id="29" w:name="reference-distance-resolution"/>
+      <w:bookmarkStart w:id="33" w:name="reference-distance-resolution"/>
       <w:r>
         <w:t>2. Reference Distance Resolution</w:t>
       </w:r>
-      <w:bookmarkEnd w:id="29"/>
+      <w:bookmarkEnd w:id="33"/>
     </w:p>
     <w:p>
       <w:pPr>
@@ -2936,53 +2982,56 @@
         <w:pStyle w:val="BodyText"/>
       </w:pPr>
       <w:r>
+        <w:t>The distance is not capped to any load’s own max range; the engine will extrapolate to whatever value is typed in. Instead, a load shown beyond its own saved (or, for a live-matched load, currently configured — see Section 4) max range triggers a dismissible, non-blocking warning rather than a hard limit, consistent with the advisory-only validation philosophy established in Part 2, Section 7.</w:t>
+      </w:r>
+    </w:p>
+    <w:p>
+      <w:pPr>
+        <w:pStyle w:val="Heading2"/>
+      </w:pPr>
+      <w:bookmarkStart w:id="34" w:name="display-unit-selection-drop-wind-drift"/>
+      <w:r>
+        <w:t>3. Display Unit Selection (Drop &amp; Wind Drift)</w:t>
+      </w:r>
+      <w:bookmarkEnd w:id="34"/>
+    </w:p>
+    <w:p>
+      <w:pPr>
+        <w:pStyle w:val="FirstParagraph"/>
+      </w:pPr>
+      <w:r>
+        <w:t>The Drop and Wind Drift rows of the comparison table can be read in mils, MOA, inches, or cm, chosen from a dropdown rendered directly above the table — independent of whichever unit the single-load Results table happens to be showing, since a shooter comparing loads may reasonably want a different readout in each place.</w:t>
+      </w:r>
+    </w:p>
+    <w:p>
+      <w:pPr>
+        <w:pStyle w:val="BodyText"/>
+      </w:pPr>
+      <w:r>
+        <w:t xml:space="preserve">The selection is held in a dedicated compareUnitDrop state variable, defaulting to mils to match the single-load table’s own default, and switching it is a pure re-render rather than a recomputation: every unit variant — dropIn, dropCm, moa, and mils for Drop; driftIn, driftCm, driftMoa, and driftMils for Wind Drift — is already present on each result row from the original calculation, exactly as the single-load table’s own five-way </w:t>
+      </w:r>
+      <w:r>
         <w:lastRenderedPageBreak/>
-        <w:t>The distance is not capped to any load’s own max range; the engine will extrapolate to whatever value is typed in. Instead, a load shown beyond its own saved (or, for a live-matched load, currently configured — see Section 4) max range triggers a dismissible, non-blocking warning rather than a hard limit, consistent with the advisory-only validation philosophy established in Part 2, Section 7.</w:t>
+        <w:t>unit toggle already relies on. runCompare() caches its last-computed list and reference distance; setCompareDropUnit() simply re-renders from that cache. The row labels update to state the active unit explicitly (e.g. “Drop (mil) at 500yd”), removing an earlier ambiguity where the same two rows were fixed to whichever of inches or cm matched the Imperial/Metric toggle, with no unit named in the label at all.</w:t>
+      </w:r>
+    </w:p>
+    <w:p>
+      <w:pPr>
+        <w:pStyle w:val="BodyText"/>
+      </w:pPr>
+      <w:r>
+        <w:t>A “clicks” option was added to this dropdown to match the single-load table, once that table gained its own Wind Drift, Spin Drift, and Coriolis clicks support. The two click-size selectors are intentionally not independent: both single-load and Compare read from and write to the one shared clickSizeMoa global, so changing the click size in either view updates the other, and there is only ever one “current” click size for the whole app rather than two that could silently disagree. Selecting clicks reveals the same click-size selector already used elsewhere, reusing the identical dropdown markup rather than a separate implementation.</w:t>
       </w:r>
     </w:p>
     <w:p>
       <w:pPr>
         <w:pStyle w:val="Heading2"/>
       </w:pPr>
-      <w:bookmarkStart w:id="34" w:name="display-unit-selection-drop-wind-drift"/>
-      <w:r>
-        <w:t>3. Display Unit Selection (Drop &amp; Wind Drift)</w:t>
-      </w:r>
-      <w:bookmarkEnd w:id="34"/>
-    </w:p>
-    <w:p>
-      <w:pPr>
-        <w:pStyle w:val="FirstParagraph"/>
-      </w:pPr>
-      <w:r>
-        <w:t xml:space="preserve">The Drop and Wind Drift rows of the comparison table can be read in mils, MOA, inches, or cm, chosen from a dropdown rendered directly above the table — independent of whichever unit the single-load Results table happens to be showing, since a shooter comparing loads may reasonably want a different readout in each place.</w:t>
-      </w:r>
-    </w:p>
-    <w:p>
-      <w:pPr>
-        <w:pStyle w:val="BodyText"/>
-      </w:pPr>
-      <w:r>
-        <w:t xml:space="preserve">The selection is held in a dedicated compareUnitDrop state variable, defaulting to mils to match the single-load table’s own default, and switching it is a pure re-render rather than a recomputation: every unit variant — dropIn, dropCm, moa, and mils for Drop; driftIn, driftCm, driftMoa, and driftMils for Wind Drift — is already present on each result row from the original calculation, exactly as the single-load table’s own five-way unit toggle already relies on. runCompare() caches its last-computed list and reference distance; setCompareDropUnit() simply re-renders from that cache. The row labels update to state the active unit explicitly (e.g. “Drop (mil) at 500yd”), removing an earlier ambiguity where the same two rows were fixed to whichever of inches or cm matched the Imperial/Metric toggle, with no unit named in the label at all.</w:t>
-      </w:r>
-    </w:p>
-    <w:p>
-      <w:pPr>
-        <w:pStyle w:val="BodyText"/>
-      </w:pPr>
-      <w:r>
-        <w:t xml:space="preserve">A “clicks” option was added to this dropdown to match the single-load table, once that table gained its own Wind Drift, Spin Drift, and Coriolis clicks support. The two click-size selectors are intentionally not independent: both single-load and Compare read from and write to the one shared clickSizeMoa global, so changing the click size in either view updates the other, and there is only ever one “current” click size for the whole app rather than two that could silently disagree. Selecting clicks reveals the same click-size selector already used elsewhere, reusing the identical dropdown markup rather than a separate implementation.</w:t>
-      </w:r>
-    </w:p>
-    <w:p>
-      <w:pPr>
-        <w:pStyle w:val="Heading2"/>
-      </w:pPr>
-      <w:bookmarkStart w:id="30" w:name="live-vs-saved-state-resolution"/>
+      <w:bookmarkStart w:id="35" w:name="live-vs-saved-state-resolution"/>
       <w:r>
         <w:t>4. Live vs. Saved State Resolution</w:t>
       </w:r>
-      <w:bookmarkEnd w:id="30"/>
+      <w:bookmarkEnd w:id="35"/>
     </w:p>
     <w:p>
       <w:pPr>
@@ -3192,87 +3241,92 @@
       <w:pPr>
         <w:pStyle w:val="Heading2"/>
       </w:pPr>
-      <w:bookmarkStart w:id="130" w:name="wind-speed-and-direction-override"/>
-      <w:r>
+      <w:bookmarkStart w:id="36" w:name="wind-speed-and-direction-override"/>
+      <w:r>
+        <w:lastRenderedPageBreak/>
         <w:t>5. Wind Speed and Direction Override</w:t>
       </w:r>
-      <w:bookmarkEnd w:id="130"/>
-    </w:p>
-    <w:p>
-      <w:pPr>
-        <w:pStyle w:val="BodyText"/>
-      </w:pPr>
-      <w:r>
-        <w:t xml:space="preserve">Wind is the one environmental condition Compare lets a shooter override independently of the single-load Inputs tab, added after user feedback asking whether wind drift could be adjusted the same way the comparison distance already can be. The feature reuses that exact same auto-suggest/customize/reset pattern (compareDistanceCustomized / fCompareRange) rather than inventing a new one: a speed field and a direction dial both default to whatever is currently set on the live Wind Speed and Wind Clock fields and keep re-mirroring them on every selection change, right up until the shooter touches either control, at which point both latch to the override and stop re-syncing. A single shared latch (compareWindCustomized) covers both fields rather than one each, since speed and direction are really one concept for this purpose — “the wind used for this comparison” — and a shooter who has already overridden the speed almost certainly wants their own direction too, not to have it silently snap back to today’s live value the next time a load is added or removed from the selection.</w:t>
-      </w:r>
-    </w:p>
-    <w:p>
-      <w:pPr>
-        <w:pStyle w:val="BodyText"/>
-      </w:pPr>
-      <w:r>
-        <w:t xml:space="preserve">Direction is set with a 72px drag-anywhere clock face rather than twelve discrete numbered buttons. At any size that fits inline with the rest of the comparison controls, twelve separate tap targets around a small ring would each cover only a few pixels of circumference — well under a reliable touch target on a phone — so accuracy would depend on hitting a specific small spot rather than a general area. Instead the whole ring is one continuous drag/tap surface: clockHourFromAngle() takes a pointer offset from the dial’s center and returns the nearest hour via atan2, using the same 12-up/3-right/6-down/9-left mapping already established by the Wind Clock field, so the same “clock = direction the wind is FROM” convention holds everywhere in the app. Pointer Events (rather than separate mouse and touch listeners) drive the interaction, with setPointerCapture keeping a drag tracked even once a finger slides off the small circle, which a fast or wide drag on a touchscreen would otherwise lose the moment the finger crossed the dial’s edge.</w:t>
-      </w:r>
-    </w:p>
-    <w:p>
-      <w:pPr>
-        <w:pStyle w:val="BodyText"/>
-      </w:pPr>
-      <w:r>
-        <w:t xml:space="preserve">Wiring the override in required one correction beyond the obvious change to buildParamsFromPreset(): the live-matched slot described in Section 4 above does not call buildParamsFromPreset() at all — it clones lastResults.params directly, which carries whatever wind was in effect the last time Calculate ran on the Inputs tab. Left alone, that would mean the override worked for every compared load except the one most likely to already be on screen: the load currently loaded on the Inputs tab. The isLive branch in runCompare() therefore re-injects windMph and windClock into that clone explicitly, alongside the maxYd override it already applied for the comparison distance, so both paths agree on which wind is actually being used.</w:t>
+      <w:bookmarkEnd w:id="36"/>
+    </w:p>
+    <w:p>
+      <w:pPr>
+        <w:pStyle w:val="BodyText"/>
+      </w:pPr>
+      <w:r>
+        <w:t>Wind is the one environmental condition Compare lets a shooter override independently of the single-load Inputs tab, added after user feedback asking whether wind drift could be adjusted the same way the comparison distance already can be. The feature reuses that exact same auto-suggest/customize/reset pattern (compareDistanceCustomized / fCompareRange) rather than inventing a new one: a speed field and a direction dial both default to whatever is currently set on the live Wind Speed and Wind Clock fields and keep re-mirroring them on every selection change, right up until the shooter touches either control, at which point both latch to the override and stop re-syncing. A single shared latch (compareWindCustomized) covers both fields rather than one each, since speed and direction are really one concept for this purpose — “the wind used for this comparison” — and a shooter who has already overridden the speed almost certainly wants their own direction too, not to have it silently snap back to today’s live value the next time a load is added or removed from the selection.</w:t>
+      </w:r>
+    </w:p>
+    <w:p>
+      <w:pPr>
+        <w:pStyle w:val="BodyText"/>
+      </w:pPr>
+      <w:r>
+        <w:t>Direction is set with a 72px drag-anywhere clock face rather than twelve discrete numbered buttons. At any size that fits inline with the rest of the comparison controls, twelve separate tap targets around a small ring would each cover only a few pixels of circumference — well under a reliable touch target on a phone — so accuracy would depend on hitting a specific small spot rather than a general area. Instead the whole ring is one continuous drag/tap surface: clockHourFromAngle() takes a pointer offset from the dial’s center and returns the nearest hour via atan2, using the same 12-up/3-right/6-down/9-left mapping already established by the Wind Clock field, so the same “clock = direction the wind is FROM” convention holds everywhere in the app. Pointer Events (rather than separate mouse and touch listeners) drive the interaction, with setPointerCapture keeping a drag tracked even once a finger slides off the small circle, which a fast or wide drag on a touchscreen would otherwise lose the moment the finger crossed the dial’s edge.</w:t>
+      </w:r>
+    </w:p>
+    <w:p>
+      <w:pPr>
+        <w:pStyle w:val="BodyText"/>
+      </w:pPr>
+      <w:r>
+        <w:t>Wiring the override in required one correction beyond the obvious change to buildParamsFromPreset(): the live-matched slot described in Section 4 above does not call buildParamsFromPreset() at all — it clones lastResults.params directly, which carries whatever wind was in effect the last time Calculate ran on the Inputs tab. Left alone, that would mean the override worked for every compared load except the one most likely to already be on screen: the load currently loaded on the Inputs tab. The isLive branch in runCompare() therefore re-injects windMph and windClock into that clone explicitly, alongside the maxYd override it already applied for the comparison distance, so both paths agree on which wind is actually being used.</w:t>
       </w:r>
     </w:p>
     <w:p>
       <w:pPr>
         <w:pStyle w:val="Heading2"/>
       </w:pPr>
-      <w:bookmarkStart w:id="131" w:name="per-slot-velocity-override"/>
+      <w:bookmarkStart w:id="37" w:name="per-slot-velocity-override"/>
       <w:r>
         <w:t>6. Per-Slot Velocity Override</w:t>
       </w:r>
-      <w:bookmarkEnd w:id="131"/>
-    </w:p>
-    <w:p>
-      <w:pPr>
-        <w:pStyle w:val="BodyText"/>
-      </w:pPr>
-      <w:r>
-        <w:t xml:space="preserve">An earlier feature added a per-slot velocity override to Reticle View, letting a shooter recompute a single reticle’s hold under a hypothetical muzzle velocity. A follow-on request asked for the same capability on Compare Loads, but with a deliberate difference in scope: rather than one shared override applied to every compared load at once (the pattern already used for wind and the comparison distance), velocity is overridable independently per column, so a shooter comparing three loads can nudge just one — for example, testing a chronograph reading against a single load’s book value — without disturbing the other two. This was a deliberate design choice, not an oversight: wind and distance are properties of the comparison as a whole (“what conditions are we comparing under”), while a load’s velocity is a property of that specific load.</w:t>
-      </w:r>
-    </w:p>
-    <w:p>
-      <w:pPr>
-        <w:pStyle w:val="BodyText"/>
-      </w:pPr>
-      <w:r>
-        <w:t xml:space="preserve">State for this feature is a single object, compareVelocityOverrides, keyed by compareRefKey(ref) (a “mode:type:idx” string) rather than by the load’s position in the results table. This distinction matters because column order follows compareSelection, which can reshuffle as slots are toggled off and on — keying by ref identity rather than column position means an override stays attached to the load it was set on, and can never silently reattach itself to a different load that happens to land in the same column afterward. The control itself lives inside each column’s own header cell in the results table, rather than alongside the shared Wind/Compare-to controls above the picker, since it is genuinely per-column state and reads more clearly attached to the load it affects.</w:t>
-      </w:r>
-    </w:p>
-    <w:p>
-      <w:pPr>
-        <w:pStyle w:val="BodyText"/>
-      </w:pPr>
-      <w:r>
-        <w:t xml:space="preserve">buildParamsFromPreset() gained a fourth parameter, forcedMvFps, changing mvFps:p.mv to mvFps:forcedMvFps||p.mv — the same optional-override pattern already used for forcedMaxYd. The live-matched slot in runCompare() needed the same re-injection fix already applied for the wind override in Section 5 above: because it clones lastResults.params directly rather than calling buildParamsFromPreset(), it would otherwise silently ignore its own velocity override while every other slot correctly picked theirs up. The clone now includes mvFps:compareVelocityOverrides[compareRefKey(x.ref)]||lastResults.params.mvFps, falling back to the velocity in effect when Calculate last ran rather than a nonsensical unset value.</w:t>
-      </w:r>
-    </w:p>
-    <w:p>
-      <w:pPr>
-        <w:pStyle w:val="BodyText"/>
-      </w:pPr>
-      <w:r>
-        <w:t xml:space="preserve">The per-column input is button-gated, consistent with how the Range and Wind fields already behave: typing a value stores it in compareVelocityOverrides without recomputing anything, and it only takes effect the next time the Compare button is pressed. The per-slot Reset link that appears once a column has an override is the one exception — it takes effect immediately, deleting that slot’s entry and re-running the comparison right away, rather than leaving the shooter to wonder why “Reset” appeared to do nothing until they pressed Compare again. A deselected slot’s override is discarded in toggleCompareSelect()’s removal branch, since it is tied to that specific load rather than to whichever load might occupy that slot next; clearing the selection back to zero clears every override at once, alongside the existing Range and Wind latch resets.</w:t>
+      <w:bookmarkEnd w:id="37"/>
+    </w:p>
+    <w:p>
+      <w:pPr>
+        <w:pStyle w:val="BodyText"/>
+      </w:pPr>
+      <w:r>
+        <w:t xml:space="preserve">An earlier feature added a per-slot velocity override to Reticle View, letting a shooter recompute a single reticle’s hold under a hypothetical muzzle velocity. A follow-on request asked for the same capability on Compare Loads, but with a deliberate difference in scope: rather than one shared override applied to every compared load at once (the pattern already used for wind and the comparison distance), velocity is overridable independently per column, so a shooter comparing three loads can nudge just one — for example, testing a chronograph reading against a single load’s book value </w:t>
+      </w:r>
+      <w:r>
+        <w:lastRenderedPageBreak/>
+        <w:t>— without disturbing the other two. This was a deliberate design choice, not an oversight: wind and distance are properties of the comparison as a whole (“what conditions are we comparing under”), while a load’s velocity is a property of that specific load.</w:t>
+      </w:r>
+    </w:p>
+    <w:p>
+      <w:pPr>
+        <w:pStyle w:val="BodyText"/>
+      </w:pPr>
+      <w:r>
+        <w:t>State for this feature is a single object, compareVelocityOverrides, keyed by compareRefKey(ref) (a “mode:type:idx” string) rather than by the load’s position in the results table. This distinction matters because column order follows compareSelection, which can reshuffle as slots are toggled off and on — keying by ref identity rather than column position means an override stays attached to the load it was set on, and can never silently reattach itself to a different load that happens to land in the same column afterward. The control itself lives inside each column’s own header cell in the results table, rather than alongside the shared Wind/Compare-to controls above the picker, since it is genuinely per-column state and reads more clearly attached to the load it affects.</w:t>
+      </w:r>
+    </w:p>
+    <w:p>
+      <w:pPr>
+        <w:pStyle w:val="BodyText"/>
+      </w:pPr>
+      <w:r>
+        <w:t>buildParamsFromPreset() gained a fourth parameter, forcedMvFps, changing mvFps:p.mv to mvFps:forcedMvFps||p.mv — the same optional-override pattern already used for forcedMaxYd. The live-matched slot in runCompare() needed the same re-injection fix already applied for the wind override in Section 5 above: because it clones lastResults.params directly rather than calling buildParamsFromPreset(), it would otherwise silently ignore its own velocity override while every other slot correctly picked theirs up. The clone now includes mvFps:compareVelocityOverrides[compareRefKey(x.ref)]||lastResults.params.mvFps, falling back to the velocity in effect when Calculate last ran rather than a nonsensical unset value.</w:t>
+      </w:r>
+    </w:p>
+    <w:p>
+      <w:pPr>
+        <w:pStyle w:val="BodyText"/>
+      </w:pPr>
+      <w:r>
+        <w:t>The per-column input is button-gated, consistent with how the Range and Wind fields already behave: typing a value stores it in compareVelocityOverrides without recomputing anything, and it only takes effect the next time the Compare button is pressed. The per-slot Reset link that appears once a column has an override is the one exception — it takes effect immediately, deleting that slot’s entry and re-running the comparison right away, rather than leaving the shooter to wonder why “Reset” appeared to do nothing until they pressed Compare again. A deselected slot’s override is discarded in toggleCompareSelect()’s removal branch, since it is tied to that specific load rather than to whichever load might occupy that slot next; clearing the selection back to zero clears every override at once, alongside the existing Range and Wind latch resets.</w:t>
       </w:r>
     </w:p>
     <w:p>
       <w:pPr>
         <w:pStyle w:val="Heading2"/>
       </w:pPr>
-      <w:bookmarkStart w:id="31" w:name="centrefire-scoped-subsonic-crossing-warn"/>
+      <w:bookmarkStart w:id="38" w:name="centrefire-scoped-subsonic-crossing-warn"/>
       <w:r>
         <w:t>7. Centrefire-Scoped Subsonic-Crossing Warning</w:t>
       </w:r>
-      <w:bookmarkEnd w:id="31"/>
+      <w:bookmarkEnd w:id="38"/>
     </w:p>
     <w:p>
       <w:pPr>
@@ -3287,19 +3341,22 @@
         <w:pStyle w:val="BodyText"/>
       </w:pPr>
       <w:r>
+        <w:t xml:space="preserve">The warning is now gated to centrefire selections only. Subsonic flight in a centrefire load is usually a deliberate choice rather than the default — a purpose-built subsonic </w:t>
+      </w:r>
+      <w:r>
         <w:lastRenderedPageBreak/>
-        <w:t>The warning is now gated to centrefire selections only. Subsonic flight in a centrefire load is usually a deliberate choice rather than the default — a purpose-built subsonic .300 BLK load for a suppressed rifle is the clearest example — so a warning there is more likely to be catching something genuinely worth a second look. The gate is a single mode check against the selected preset’s own recorded discipline, evaluated per selected load rather than globally, so a mixed comparison of a centrefire and an air-rifle load correctly warns for one and stays silent for the other in the same comparison. This mirrors the project’s wider preference, discussed in Part 2, Sections 6 and 7, for validation that reflects what is actually unusual for the discipline in question rather than a single blanket rule applied everywhere.</w:t>
+        <w:t>.300 BLK load for a suppressed rifle is the clearest example — so a warning there is more likely to be catching something genuinely worth a second look. The gate is a single mode check against the selected preset’s own recorded discipline, evaluated per selected load rather than globally, so a mixed comparison of a centrefire and an air-rifle load correctly warns for one and stays silent for the other in the same comparison. This mirrors the project’s wider preference, discussed in Part 2, Sections 6 and 7, for validation that reflects what is actually unusual for the discipline in question rather than a single blanket rule applied everywhere.</w:t>
       </w:r>
     </w:p>
     <w:p>
       <w:pPr>
         <w:pStyle w:val="Heading2"/>
       </w:pPr>
-      <w:bookmarkStart w:id="32" w:name="compare-testing-methodology"/>
+      <w:bookmarkStart w:id="39" w:name="compare-testing-methodology"/>
       <w:r>
         <w:t>8. Testing Methodology</w:t>
       </w:r>
-      <w:bookmarkEnd w:id="32"/>
+      <w:bookmarkEnd w:id="39"/>
     </w:p>
     <w:p>
       <w:pPr>
@@ -3374,7 +3431,7 @@
               </wp:inline>
             </w:drawing>
           </mc:Choice>
-          <mc:Fallback>
+          <mc:Fallback xmlns:w16cei="http://schemas.microsoft.com/office/word/2026/wordml/cei">
             <w:pict>
               <v:rect w14:anchorId="36912244" id="Horizontal Line Auto2" o:spid="_x0000_s1026" style="width:468pt;height:1.1pt;visibility:visible;mso-wrap-style:square;mso-left-percent:-10001;mso-top-percent:-10001;mso-position-horizontal:absolute;mso-position-horizontal-relative:char;mso-position-vertical:absolute;mso-position-vertical-relative:line;mso-left-percent:-10001;mso-top-percent:-10001;v-text-anchor:top" o:gfxdata="UEsDBBQABgAIAAAAIQC2gziS/gAAAOEBAAATAAAAW0NvbnRlbnRfVHlwZXNdLnhtbJSRQU7DMBBF 90jcwfIWJU67QAgl6YK0S0CoHGBkTxKLZGx5TGhvj5O2G0SRWNoz/78nu9wcxkFMGNg6quQqL6RA 0s5Y6ir5vt9lD1JwBDIwOMJKHpHlpr69KfdHjyxSmriSfYz+USnWPY7AufNIadK6MEJMx9ApD/oD OlTrorhX2lFEilmcO2RdNtjC5xDF9pCuTyYBB5bi6bQ4syoJ3g9WQ0ymaiLzg5KdCXlKLjvcW893 SUOqXwnz5DrgnHtJTxOsQfEKIT7DmDSUCaxw7Rqn8787ZsmRM9e2VmPeBN4uqYvTtW7jvijg9N/y JsXecLq0q+WD6m8AAAD//wMAUEsDBBQABgAIAAAAIQA4/SH/1gAAAJQBAAALAAAAX3JlbHMvLnJl bHOkkMFqwzAMhu+DvYPRfXGawxijTi+j0GvpHsDYimMaW0Yy2fr2M4PBMnrbUb/Q94l/f/hMi1qR JVI2sOt6UJgd+ZiDgffL8ekFlFSbvV0oo4EbChzGx4f9GRdb25HMsYhqlCwG5lrLq9biZkxWOiqY 22YiTra2kYMu1l1tQD30/bPm3wwYN0x18gb45AdQl1tp5j/sFB2T0FQ7R0nTNEV3j6o9feQzro1i OWA14Fm+Q8a1a8+Bvu/d/dMb2JY5uiPbhG/ktn4cqGU/er3pcvwCAAD//wMAUEsDBBQABgAIAAAA IQB2Bga0KQIAAD8EAAAOAAAAZHJzL2Uyb0RvYy54bWysU8Fu2zAMvQ/YPwi6L07SpG2MOEWRtsOA bivW7AMUWbaFSaJGKXGyry+lpGm23Yb5YJAi9fT4SM5vdtawrcKgwVV8NBhyppyEWru24t9XDx+u OQtRuFoYcKriexX4zeL9u3nvSzWGDkytkBGIC2XvK97F6MuiCLJTVoQBeOUo2ABaEcnFtqhR9IRu TTEeDi+LHrD2CFKFQKd3hyBfZPymUTJ+bZqgIjMVJ24x/zH/1+lfLOaibFH4TssjDfEPLKzQjh49 Qd2JKNgG9V9QVkuEAE0cSLAFNI2WKtdA1YyGf1Tz3Amvci0kTvAnmcL/g5Vfts/+CRP14B9B/gjM wTcgnUacrGUnXKtugychj0f3tY5PoF0kFuc5iNB3StS/H+cSVntPrc/JK7WLCSG5pH3R+1CeOCQn EBu27j9DTVfEJkKWddegTRxJMLbL3dufukeITNLhdDa5uBxSkyXFRhezq9zdQpSvlz2G+FGBZcmo OFJNGVxsH0NMZET5mpLecvCgjckDYhzrKz6bjqf5QgCj6xTMsmG7XhpkW5FGLH+5MhL0PM3qSINu tK349SlJlEmxe1fnV6LQ5mATE+OO6iRB0jiHcg31nsTB1B0qk7aOjA7wF2c9TXDFw8+NQMWZ+eSo C7PRZJJGPjuT6dWYHDyPrM8jwkmCqnjk7GAu42FNNh512+WGHVS5paY0Ogv2xupIlqY063jcqLQG 537Oetv7xQsAAAD//wMAUEsDBBQABgAIAAAAIQAvqYUv3AAAAAgBAAAPAAAAZHJzL2Rvd25yZXYu eG1sTI/NTsMwEITvSLyDtUjcqEMQFU3jVOGn10oUJMrNjRc7aryOYrcJb8/CpVxGGo12dr5yNflO nHCIbSAFt7MMBFITTEtWwfvb+uYBREyajO4CoYJvjLCqLi9KXZgw0iuetskKLqFYaAUupb6QMjYO vY6z0CNx9hUGrxPbwUoz6JHLfSfzLJtLr1viD073+OSwOWyPXsFL/7mp722U9Udyu0N4HNduY5W6 vpqelyz1EkTCKZ0v4JeB90PFw/bhSCaKTgHTpD/lbHE3Z7tXkOcgq1L+B6h+AAAA//8DAFBLAQIt ABQABgAIAAAAIQC2gziS/gAAAOEBAAATAAAAAAAAAAAAAAAAAAAAAABbQ29udGVudF9UeXBlc10u eG1sUEsBAi0AFAAGAAgAAAAhADj9If/WAAAAlAEAAAsAAAAAAAAAAAAAAAAALwEAAF9yZWxzLy5y ZWxzUEsBAi0AFAAGAAgAAAAhAHYGBrQpAgAAPwQAAA4AAAAAAAAAAAAAAAAALgIAAGRycy9lMm9E b2MueG1sUEsBAi0AFAAGAAgAAAAhAC+phS/cAAAACAEAAA8AAAAAAAAAAAAAAAAAgwQAAGRycy9k b3ducmV2LnhtbFBLBQYAAAAABAAEAPMAAACMBQAAAAA= " filled="f">
                 <o:lock v:ext="edit" rotation="t" aspectratio="t" verticies="t" text="t" shapetype="t"/>
@@ -3389,11 +3446,11 @@
       <w:pPr>
         <w:pStyle w:val="Heading1"/>
       </w:pPr>
-      <w:bookmarkStart w:id="33" w:name="appendix-key-constants-reference"/>
+      <w:bookmarkStart w:id="40" w:name="appendix-key-constants-reference"/>
       <w:r>
         <w:t>Appendix — Key Constants Reference</w:t>
       </w:r>
-      <w:bookmarkEnd w:id="33"/>
+      <w:bookmarkEnd w:id="40"/>
     </w:p>
     <w:tbl>
       <w:tblPr>
@@ -3838,22 +3895,19 @@
               <w:pStyle w:val="Compact"/>
             </w:pPr>
             <w:r>
-              <w:t xml:space="preserve">Greenhill constant (MV &lt; </w:t>
-              <w:lastRenderedPageBreak/>
-              <w:t>2700 fps)</w:t>
-            </w:r>
-          </w:p>
-        </w:tc>
-        <w:tc>
-          <w:tcPr>
-            <w:tcW w:w="0" w:type="auto"/>
-          </w:tcPr>
-          <w:p>
-            <w:pPr>
-              <w:pStyle w:val="Compact"/>
-            </w:pPr>
-            <w:r>
-              <w:lastRenderedPageBreak/>
+              <w:t>Greenhill constant (MV &lt; 2700 fps)</w:t>
+            </w:r>
+          </w:p>
+        </w:tc>
+        <w:tc>
+          <w:tcPr>
+            <w:tcW w:w="0" w:type="auto"/>
+          </w:tcPr>
+          <w:p>
+            <w:pPr>
+              <w:pStyle w:val="Compact"/>
+            </w:pPr>
+            <w:r>
               <w:t>150</w:t>
             </w:r>
           </w:p>
@@ -3882,6 +3936,7 @@
               <w:pStyle w:val="Compact"/>
             </w:pPr>
             <w:r>
+              <w:lastRenderedPageBreak/>
               <w:t>Greenhill constant (MV ≥ 2700 fps)</w:t>
             </w:r>
           </w:p>
@@ -4172,7 +4227,7 @@
 </file>
 
 <file path=word/endnotes.xml><?xml version="1.0" encoding="utf-8"?>
-<w:endnotes xmlns:wpc="http://schemas.microsoft.com/office/word/2010/wordprocessingCanvas" xmlns:cx="http://schemas.microsoft.com/office/drawing/2014/chartex" xmlns:cx1="http://schemas.microsoft.com/office/drawing/2015/9/8/chartex" xmlns:cx2="http://schemas.microsoft.com/office/drawing/2015/10/21/chartex" xmlns:cx3="http://schemas.microsoft.com/office/drawing/2016/5/9/chartex" xmlns:cx4="http://schemas.microsoft.com/office/drawing/2016/5/10/chartex" xmlns:cx5="http://schemas.microsoft.com/office/drawing/2016/5/11/chartex" xmlns:cx6="http://schemas.microsoft.com/office/drawing/2016/5/12/chartex" xmlns:cx7="http://schemas.microsoft.com/office/drawing/2016/5/13/chartex" xmlns:cx8="http://schemas.microsoft.com/office/drawing/2016/5/14/chartex" xmlns:mc="http://schemas.openxmlformats.org/markup-compatibility/2006" xmlns:m="http://schemas.openxmlformats.org/officeDocument/2006/math" xmlns:aink="http://schemas.microsoft.com/office/drawing/2016/ink" xmlns:am3d="http://schemas.microsoft.com/office/drawing/2017/model3d" xmlns:oel="http://schemas.microsoft.com/office/2019/extlst" xmlns:r="http://schemas.openxmlformats.org/officeDocument/2006/relationships" xmlns:wp14="http://schemas.microsoft.com/office/word/2010/wordprocessingDrawing" xmlns:wp="http://schemas.openxmlformats.org/drawingml/2006/wordprocessingDrawing" xmlns:wpg="http://schemas.microsoft.com/office/word/2010/wordprocessingGroup" xmlns:wpi="http://schemas.microsoft.com/office/word/2010/wordprocessingInk" xmlns:wps="http://schemas.microsoft.com/office/word/2010/wordprocessingShape" xmlns:o="urn:schemas-microsoft-com:office:office" xmlns:v="urn:schemas-microsoft-com:vml" xmlns:w10="urn:schemas-microsoft-com:office:word" xmlns:w="http://schemas.openxmlformats.org/wordprocessingml/2006/main" xmlns:w14="http://schemas.microsoft.com/office/word/2010/wordml" xmlns:w15="http://schemas.microsoft.com/office/word/2012/wordml" xmlns:w16cei="http://schemas.microsoft.com/office/word/2026/wordml/cei" xmlns:w16cex="http://schemas.microsoft.com/office/word/2018/wordml/cex" xmlns:w16cid="http://schemas.microsoft.com/office/word/2016/wordml/cid" xmlns:w16="http://schemas.microsoft.com/office/word/2018/wordml" xmlns:w16sdtdh="http://schemas.microsoft.com/office/word/2020/wordml/sdtdatahash" xmlns:w16sdtfl="http://schemas.microsoft.com/office/word/2024/wordml/sdtformatlock" xmlns:w16se="http://schemas.microsoft.com/office/word/2015/wordml/symex" xmlns:w16du="http://schemas.microsoft.com/office/word/2023/wordml/word16du" xmlns:wne="http://schemas.microsoft.com/office/word/2006/wordml" mc:Ignorable="w14 w15 w16se w16cid w16 w16cex w16sdtdh w16sdtfl w16du wp14">
+<w:endnotes xmlns:wpc="http://schemas.microsoft.com/office/word/2010/wordprocessingCanvas" xmlns:cx="http://schemas.microsoft.com/office/drawing/2014/chartex" xmlns:cx1="http://schemas.microsoft.com/office/drawing/2015/9/8/chartex" xmlns:cx2="http://schemas.microsoft.com/office/drawing/2015/10/21/chartex" xmlns:cx3="http://schemas.microsoft.com/office/drawing/2016/5/9/chartex" xmlns:cx4="http://schemas.microsoft.com/office/drawing/2016/5/10/chartex" xmlns:cx5="http://schemas.microsoft.com/office/drawing/2016/5/11/chartex" xmlns:cx6="http://schemas.microsoft.com/office/drawing/2016/5/12/chartex" xmlns:cx7="http://schemas.microsoft.com/office/drawing/2016/5/13/chartex" xmlns:cx8="http://schemas.microsoft.com/office/drawing/2016/5/14/chartex" xmlns:mc="http://schemas.openxmlformats.org/markup-compatibility/2006" xmlns:m="http://schemas.openxmlformats.org/officeDocument/2006/math" xmlns:aink="http://schemas.microsoft.com/office/drawing/2016/ink" xmlns:am3d="http://schemas.microsoft.com/office/drawing/2017/model3d" xmlns:oel="http://schemas.microsoft.com/office/2019/extlst" xmlns:r="http://schemas.openxmlformats.org/officeDocument/2006/relationships" xmlns:wp14="http://schemas.microsoft.com/office/word/2010/wordprocessingDrawing" xmlns:wp="http://schemas.openxmlformats.org/drawingml/2006/wordprocessingDrawing" xmlns:wpg="http://schemas.microsoft.com/office/word/2010/wordprocessingGroup" xmlns:wpi="http://schemas.microsoft.com/office/word/2010/wordprocessingInk" xmlns:wps="http://schemas.microsoft.com/office/word/2010/wordprocessingShape" xmlns:o="urn:schemas-microsoft-com:office:office" xmlns:v="urn:schemas-microsoft-com:vml" xmlns:w10="urn:schemas-microsoft-com:office:word" xmlns:w="http://schemas.openxmlformats.org/wordprocessingml/2006/main" xmlns:w14="http://schemas.microsoft.com/office/word/2010/wordml" xmlns:w15="http://schemas.microsoft.com/office/word/2012/wordml" xmlns:w16cex="http://schemas.microsoft.com/office/word/2018/wordml/cex" xmlns:w16cid="http://schemas.microsoft.com/office/word/2016/wordml/cid" xmlns:w16="http://schemas.microsoft.com/office/word/2018/wordml" xmlns:w16sdtdh="http://schemas.microsoft.com/office/word/2020/wordml/sdtdatahash" xmlns:w16sdtfl="http://schemas.microsoft.com/office/word/2024/wordml/sdtformatlock" xmlns:w16se="http://schemas.microsoft.com/office/word/2015/wordml/symex" xmlns:w16du="http://schemas.microsoft.com/office/word/2023/wordml/word16du" xmlns:wne="http://schemas.microsoft.com/office/word/2006/wordml" mc:Ignorable="w14 w15 w16se w16cid w16 w16cex w16sdtdh w16sdtfl w16du wp14">
   <w:endnote w:type="separator" w:id="-1">
     <w:p>
       <w:pPr>
@@ -4197,7 +4252,7 @@
 </file>
 
 <file path=word/footnotes.xml><?xml version="1.0" encoding="utf-8"?>
-<w:footnotes xmlns:wpc="http://schemas.microsoft.com/office/word/2010/wordprocessingCanvas" xmlns:cx="http://schemas.microsoft.com/office/drawing/2014/chartex" xmlns:cx1="http://schemas.microsoft.com/office/drawing/2015/9/8/chartex" xmlns:cx2="http://schemas.microsoft.com/office/drawing/2015/10/21/chartex" xmlns:cx3="http://schemas.microsoft.com/office/drawing/2016/5/9/chartex" xmlns:cx4="http://schemas.microsoft.com/office/drawing/2016/5/10/chartex" xmlns:cx5="http://schemas.microsoft.com/office/drawing/2016/5/11/chartex" xmlns:cx6="http://schemas.microsoft.com/office/drawing/2016/5/12/chartex" xmlns:cx7="http://schemas.microsoft.com/office/drawing/2016/5/13/chartex" xmlns:cx8="http://schemas.microsoft.com/office/drawing/2016/5/14/chartex" xmlns:mc="http://schemas.openxmlformats.org/markup-compatibility/2006" xmlns:m="http://schemas.openxmlformats.org/officeDocument/2006/math" xmlns:aink="http://schemas.microsoft.com/office/drawing/2016/ink" xmlns:am3d="http://schemas.microsoft.com/office/drawing/2017/model3d" xmlns:oel="http://schemas.microsoft.com/office/2019/extlst" xmlns:r="http://schemas.openxmlformats.org/officeDocument/2006/relationships" xmlns:wp14="http://schemas.microsoft.com/office/word/2010/wordprocessingDrawing" xmlns:wp="http://schemas.openxmlformats.org/drawingml/2006/wordprocessingDrawing" xmlns:wpg="http://schemas.microsoft.com/office/word/2010/wordprocessingGroup" xmlns:wpi="http://schemas.microsoft.com/office/word/2010/wordprocessingInk" xmlns:wps="http://schemas.microsoft.com/office/word/2010/wordprocessingShape" xmlns:o="urn:schemas-microsoft-com:office:office" xmlns:v="urn:schemas-microsoft-com:vml" xmlns:w10="urn:schemas-microsoft-com:office:word" xmlns:w="http://schemas.openxmlformats.org/wordprocessingml/2006/main" xmlns:w14="http://schemas.microsoft.com/office/word/2010/wordml" xmlns:w15="http://schemas.microsoft.com/office/word/2012/wordml" xmlns:w16cei="http://schemas.microsoft.com/office/word/2026/wordml/cei" xmlns:w16cex="http://schemas.microsoft.com/office/word/2018/wordml/cex" xmlns:w16cid="http://schemas.microsoft.com/office/word/2016/wordml/cid" xmlns:w16="http://schemas.microsoft.com/office/word/2018/wordml" xmlns:w16sdtdh="http://schemas.microsoft.com/office/word/2020/wordml/sdtdatahash" xmlns:w16sdtfl="http://schemas.microsoft.com/office/word/2024/wordml/sdtformatlock" xmlns:w16se="http://schemas.microsoft.com/office/word/2015/wordml/symex" xmlns:w16du="http://schemas.microsoft.com/office/word/2023/wordml/word16du" xmlns:wne="http://schemas.microsoft.com/office/word/2006/wordml" mc:Ignorable="w14 w15 w16se w16cid w16 w16cex w16sdtdh w16sdtfl w16du wp14">
+<w:footnotes xmlns:wpc="http://schemas.microsoft.com/office/word/2010/wordprocessingCanvas" xmlns:cx="http://schemas.microsoft.com/office/drawing/2014/chartex" xmlns:cx1="http://schemas.microsoft.com/office/drawing/2015/9/8/chartex" xmlns:cx2="http://schemas.microsoft.com/office/drawing/2015/10/21/chartex" xmlns:cx3="http://schemas.microsoft.com/office/drawing/2016/5/9/chartex" xmlns:cx4="http://schemas.microsoft.com/office/drawing/2016/5/10/chartex" xmlns:cx5="http://schemas.microsoft.com/office/drawing/2016/5/11/chartex" xmlns:cx6="http://schemas.microsoft.com/office/drawing/2016/5/12/chartex" xmlns:cx7="http://schemas.microsoft.com/office/drawing/2016/5/13/chartex" xmlns:cx8="http://schemas.microsoft.com/office/drawing/2016/5/14/chartex" xmlns:mc="http://schemas.openxmlformats.org/markup-compatibility/2006" xmlns:m="http://schemas.openxmlformats.org/officeDocument/2006/math" xmlns:aink="http://schemas.microsoft.com/office/drawing/2016/ink" xmlns:am3d="http://schemas.microsoft.com/office/drawing/2017/model3d" xmlns:oel="http://schemas.microsoft.com/office/2019/extlst" xmlns:r="http://schemas.openxmlformats.org/officeDocument/2006/relationships" xmlns:wp14="http://schemas.microsoft.com/office/word/2010/wordprocessingDrawing" xmlns:wp="http://schemas.openxmlformats.org/drawingml/2006/wordprocessingDrawing" xmlns:wpg="http://schemas.microsoft.com/office/word/2010/wordprocessingGroup" xmlns:wpi="http://schemas.microsoft.com/office/word/2010/wordprocessingInk" xmlns:wps="http://schemas.microsoft.com/office/word/2010/wordprocessingShape" xmlns:o="urn:schemas-microsoft-com:office:office" xmlns:v="urn:schemas-microsoft-com:vml" xmlns:w10="urn:schemas-microsoft-com:office:word" xmlns:w="http://schemas.openxmlformats.org/wordprocessingml/2006/main" xmlns:w14="http://schemas.microsoft.com/office/word/2010/wordml" xmlns:w15="http://schemas.microsoft.com/office/word/2012/wordml" xmlns:w16cex="http://schemas.microsoft.com/office/word/2018/wordml/cex" xmlns:w16cid="http://schemas.microsoft.com/office/word/2016/wordml/cid" xmlns:w16="http://schemas.microsoft.com/office/word/2018/wordml" xmlns:w16sdtdh="http://schemas.microsoft.com/office/word/2020/wordml/sdtdatahash" xmlns:w16sdtfl="http://schemas.microsoft.com/office/word/2024/wordml/sdtformatlock" xmlns:w16se="http://schemas.microsoft.com/office/word/2015/wordml/symex" xmlns:w16du="http://schemas.microsoft.com/office/word/2023/wordml/word16du" xmlns:wne="http://schemas.microsoft.com/office/word/2006/wordml" mc:Ignorable="w14 w15 w16se w16cid w16 w16cex w16sdtdh w16sdtfl w16du wp14">
   <w:footnote w:type="separator" w:id="-1">
     <w:p>
       <w:r>
@@ -4216,7 +4271,7 @@
 </file>
 
 <file path=word/numbering.xml><?xml version="1.0" encoding="utf-8"?>
-<w:numbering xmlns:wpc="http://schemas.microsoft.com/office/word/2010/wordprocessingCanvas" xmlns:cx="http://schemas.microsoft.com/office/drawing/2014/chartex" xmlns:cx1="http://schemas.microsoft.com/office/drawing/2015/9/8/chartex" xmlns:cx2="http://schemas.microsoft.com/office/drawing/2015/10/21/chartex" xmlns:cx3="http://schemas.microsoft.com/office/drawing/2016/5/9/chartex" xmlns:cx4="http://schemas.microsoft.com/office/drawing/2016/5/10/chartex" xmlns:cx5="http://schemas.microsoft.com/office/drawing/2016/5/11/chartex" xmlns:cx6="http://schemas.microsoft.com/office/drawing/2016/5/12/chartex" xmlns:cx7="http://schemas.microsoft.com/office/drawing/2016/5/13/chartex" xmlns:cx8="http://schemas.microsoft.com/office/drawing/2016/5/14/chartex" xmlns:mc="http://schemas.openxmlformats.org/markup-compatibility/2006" xmlns:m="http://schemas.openxmlformats.org/officeDocument/2006/math" xmlns:aink="http://schemas.microsoft.com/office/drawing/2016/ink" xmlns:am3d="http://schemas.microsoft.com/office/drawing/2017/model3d" xmlns:oel="http://schemas.microsoft.com/office/2019/extlst" xmlns:r="http://schemas.openxmlformats.org/officeDocument/2006/relationships" xmlns:wp14="http://schemas.microsoft.com/office/word/2010/wordprocessingDrawing" xmlns:wp="http://schemas.openxmlformats.org/drawingml/2006/wordprocessingDrawing" xmlns:wpg="http://schemas.microsoft.com/office/word/2010/wordprocessingGroup" xmlns:wpi="http://schemas.microsoft.com/office/word/2010/wordprocessingInk" xmlns:wps="http://schemas.microsoft.com/office/word/2010/wordprocessingShape" xmlns:o="urn:schemas-microsoft-com:office:office" xmlns:v="urn:schemas-microsoft-com:vml" xmlns:w10="urn:schemas-microsoft-com:office:word" xmlns:w="http://schemas.openxmlformats.org/wordprocessingml/2006/main" xmlns:w14="http://schemas.microsoft.com/office/word/2010/wordml" xmlns:w15="http://schemas.microsoft.com/office/word/2012/wordml" xmlns:w16cei="http://schemas.microsoft.com/office/word/2026/wordml/cei" xmlns:w16cex="http://schemas.microsoft.com/office/word/2018/wordml/cex" xmlns:w16cid="http://schemas.microsoft.com/office/word/2016/wordml/cid" xmlns:w16="http://schemas.microsoft.com/office/word/2018/wordml" xmlns:w16sdtdh="http://schemas.microsoft.com/office/word/2020/wordml/sdtdatahash" xmlns:w16sdtfl="http://schemas.microsoft.com/office/word/2024/wordml/sdtformatlock" xmlns:w16se="http://schemas.microsoft.com/office/word/2015/wordml/symex" xmlns:w16du="http://schemas.microsoft.com/office/word/2023/wordml/word16du" xmlns:wne="http://schemas.microsoft.com/office/word/2006/wordml" mc:Ignorable="w14 w15 w16se w16cid w16 w16cex w16sdtdh w16sdtfl w16du wp14">
+<w:numbering xmlns:wpc="http://schemas.microsoft.com/office/word/2010/wordprocessingCanvas" xmlns:cx="http://schemas.microsoft.com/office/drawing/2014/chartex" xmlns:cx1="http://schemas.microsoft.com/office/drawing/2015/9/8/chartex" xmlns:cx2="http://schemas.microsoft.com/office/drawing/2015/10/21/chartex" xmlns:cx3="http://schemas.microsoft.com/office/drawing/2016/5/9/chartex" xmlns:cx4="http://schemas.microsoft.com/office/drawing/2016/5/10/chartex" xmlns:cx5="http://schemas.microsoft.com/office/drawing/2016/5/11/chartex" xmlns:cx6="http://schemas.microsoft.com/office/drawing/2016/5/12/chartex" xmlns:cx7="http://schemas.microsoft.com/office/drawing/2016/5/13/chartex" xmlns:cx8="http://schemas.microsoft.com/office/drawing/2016/5/14/chartex" xmlns:mc="http://schemas.openxmlformats.org/markup-compatibility/2006" xmlns:m="http://schemas.openxmlformats.org/officeDocument/2006/math" xmlns:aink="http://schemas.microsoft.com/office/drawing/2016/ink" xmlns:am3d="http://schemas.microsoft.com/office/drawing/2017/model3d" xmlns:oel="http://schemas.microsoft.com/office/2019/extlst" xmlns:r="http://schemas.openxmlformats.org/officeDocument/2006/relationships" xmlns:wp14="http://schemas.microsoft.com/office/word/2010/wordprocessingDrawing" xmlns:wp="http://schemas.openxmlformats.org/drawingml/2006/wordprocessingDrawing" xmlns:wpg="http://schemas.microsoft.com/office/word/2010/wordprocessingGroup" xmlns:wpi="http://schemas.microsoft.com/office/word/2010/wordprocessingInk" xmlns:wps="http://schemas.microsoft.com/office/word/2010/wordprocessingShape" xmlns:o="urn:schemas-microsoft-com:office:office" xmlns:v="urn:schemas-microsoft-com:vml" xmlns:w10="urn:schemas-microsoft-com:office:word" xmlns:w="http://schemas.openxmlformats.org/wordprocessingml/2006/main" xmlns:w14="http://schemas.microsoft.com/office/word/2010/wordml" xmlns:w15="http://schemas.microsoft.com/office/word/2012/wordml" xmlns:w16cex="http://schemas.microsoft.com/office/word/2018/wordml/cex" xmlns:w16cid="http://schemas.microsoft.com/office/word/2016/wordml/cid" xmlns:w16="http://schemas.microsoft.com/office/word/2018/wordml" xmlns:w16sdtdh="http://schemas.microsoft.com/office/word/2020/wordml/sdtdatahash" xmlns:w16sdtfl="http://schemas.microsoft.com/office/word/2024/wordml/sdtformatlock" xmlns:w16se="http://schemas.microsoft.com/office/word/2015/wordml/symex" xmlns:w16du="http://schemas.microsoft.com/office/word/2023/wordml/word16du" xmlns:wne="http://schemas.microsoft.com/office/word/2006/wordml" mc:Ignorable="w14 w15 w16se w16cid w16 w16cex w16sdtdh w16sdtfl w16du wp14">
   <w:abstractNum w:abstractNumId="0" w15:restartNumberingAfterBreak="0">
     <w:nsid w:val="EA454B4C"/>
     <w:multiLevelType w:val="multilevel"/>

</xml_diff>